<commit_message>
documentation - stress test - added stress tests.
</commit_message>
<xml_diff>
--- a/ŠpaňúrM_KnihovnaProPraci_JM_2026.docx
+++ b/ŠpaňúrM_KnihovnaProPraci_JM_2026.docx
@@ -1658,6 +1658,7 @@
           <w:noProof/>
           <w:kern w:val="2"/>
           <w:szCs w:val="24"/>
+          <w:lang/>
           <w14:ligatures w14:val="standardContextual"/>
         </w:rPr>
       </w:pPr>
@@ -1670,7 +1671,7 @@
       <w:r>
         <w:fldChar w:fldCharType="separate"/>
       </w:r>
-      <w:hyperlink w:anchor="_Toc229952393" w:history="1">
+      <w:hyperlink w:anchor="_Toc230096671" w:history="1">
         <w:r>
           <w:rPr>
             <w:rStyle w:val="Hypertextovodkaz"/>
@@ -1698,7 +1699,7 @@
             <w:noProof/>
             <w:webHidden/>
           </w:rPr>
-          <w:instrText xml:space="preserve"> PAGEREF _Toc229952393 \h </w:instrText>
+          <w:instrText xml:space="preserve"> PAGEREF _Toc230096671 \h </w:instrText>
         </w:r>
         <w:r>
           <w:rPr>
@@ -1740,10 +1741,11 @@
           <w:noProof/>
           <w:kern w:val="2"/>
           <w:szCs w:val="24"/>
+          <w:lang/>
           <w14:ligatures w14:val="standardContextual"/>
         </w:rPr>
       </w:pPr>
-      <w:hyperlink w:anchor="_Toc229952394" w:history="1">
+      <w:hyperlink w:anchor="_Toc230096672" w:history="1">
         <w:r>
           <w:rPr>
             <w:rStyle w:val="Hypertextovodkaz"/>
@@ -1771,7 +1773,7 @@
             <w:noProof/>
             <w:webHidden/>
           </w:rPr>
-          <w:instrText xml:space="preserve"> PAGEREF _Toc229952394 \h </w:instrText>
+          <w:instrText xml:space="preserve"> PAGEREF _Toc230096672 \h </w:instrText>
         </w:r>
         <w:r>
           <w:rPr>
@@ -1813,10 +1815,11 @@
           <w:noProof/>
           <w:kern w:val="2"/>
           <w:szCs w:val="24"/>
+          <w:lang/>
           <w14:ligatures w14:val="standardContextual"/>
         </w:rPr>
       </w:pPr>
-      <w:hyperlink w:anchor="_Toc229952395" w:history="1">
+      <w:hyperlink w:anchor="_Toc230096673" w:history="1">
         <w:r>
           <w:rPr>
             <w:rStyle w:val="Hypertextovodkaz"/>
@@ -1844,7 +1847,7 @@
             <w:noProof/>
             <w:webHidden/>
           </w:rPr>
-          <w:instrText xml:space="preserve"> PAGEREF _Toc229952395 \h </w:instrText>
+          <w:instrText xml:space="preserve"> PAGEREF _Toc230096673 \h </w:instrText>
         </w:r>
         <w:r>
           <w:rPr>
@@ -1886,10 +1889,11 @@
           <w:noProof/>
           <w:kern w:val="2"/>
           <w:szCs w:val="24"/>
+          <w:lang/>
           <w14:ligatures w14:val="standardContextual"/>
         </w:rPr>
       </w:pPr>
-      <w:hyperlink w:anchor="_Toc229952396" w:history="1">
+      <w:hyperlink w:anchor="_Toc230096674" w:history="1">
         <w:r>
           <w:rPr>
             <w:rStyle w:val="Hypertextovodkaz"/>
@@ -1916,7 +1920,7 @@
             <w:noProof/>
             <w:webHidden/>
           </w:rPr>
-          <w:instrText xml:space="preserve"> PAGEREF _Toc229952396 \h </w:instrText>
+          <w:instrText xml:space="preserve"> PAGEREF _Toc230096674 \h </w:instrText>
         </w:r>
         <w:r>
           <w:rPr>
@@ -1958,10 +1962,11 @@
           <w:noProof/>
           <w:kern w:val="2"/>
           <w:szCs w:val="24"/>
+          <w:lang/>
           <w14:ligatures w14:val="standardContextual"/>
         </w:rPr>
       </w:pPr>
-      <w:hyperlink w:anchor="_Toc229952397" w:history="1">
+      <w:hyperlink w:anchor="_Toc230096675" w:history="1">
         <w:r>
           <w:rPr>
             <w:rStyle w:val="Hypertextovodkaz"/>
@@ -1988,7 +1993,7 @@
             <w:noProof/>
             <w:webHidden/>
           </w:rPr>
-          <w:instrText xml:space="preserve"> PAGEREF _Toc229952397 \h </w:instrText>
+          <w:instrText xml:space="preserve"> PAGEREF _Toc230096675 \h </w:instrText>
         </w:r>
         <w:r>
           <w:rPr>
@@ -2027,10 +2032,11 @@
           <w:noProof/>
           <w:kern w:val="2"/>
           <w:szCs w:val="24"/>
+          <w:lang/>
           <w14:ligatures w14:val="standardContextual"/>
         </w:rPr>
       </w:pPr>
-      <w:hyperlink w:anchor="_Toc229952398" w:history="1">
+      <w:hyperlink w:anchor="_Toc230096676" w:history="1">
         <w:r>
           <w:rPr>
             <w:rStyle w:val="Hypertextovodkaz"/>
@@ -2057,7 +2063,7 @@
             <w:noProof/>
             <w:webHidden/>
           </w:rPr>
-          <w:instrText xml:space="preserve"> PAGEREF _Toc229952398 \h </w:instrText>
+          <w:instrText xml:space="preserve"> PAGEREF _Toc230096676 \h </w:instrText>
         </w:r>
         <w:r>
           <w:rPr>
@@ -2096,10 +2102,11 @@
           <w:noProof/>
           <w:kern w:val="2"/>
           <w:szCs w:val="24"/>
+          <w:lang/>
           <w14:ligatures w14:val="standardContextual"/>
         </w:rPr>
       </w:pPr>
-      <w:hyperlink w:anchor="_Toc229952399" w:history="1">
+      <w:hyperlink w:anchor="_Toc230096677" w:history="1">
         <w:r>
           <w:rPr>
             <w:rStyle w:val="Hypertextovodkaz"/>
@@ -2126,7 +2133,7 @@
             <w:noProof/>
             <w:webHidden/>
           </w:rPr>
-          <w:instrText xml:space="preserve"> PAGEREF _Toc229952399 \h </w:instrText>
+          <w:instrText xml:space="preserve"> PAGEREF _Toc230096677 \h </w:instrText>
         </w:r>
         <w:r>
           <w:rPr>
@@ -2146,7 +2153,7 @@
             <w:noProof/>
             <w:webHidden/>
           </w:rPr>
-          <w:t>14</w:t>
+          <w:t>15</w:t>
         </w:r>
         <w:r>
           <w:rPr>
@@ -2165,10 +2172,11 @@
           <w:noProof/>
           <w:kern w:val="2"/>
           <w:szCs w:val="24"/>
+          <w:lang/>
           <w14:ligatures w14:val="standardContextual"/>
         </w:rPr>
       </w:pPr>
-      <w:hyperlink w:anchor="_Toc229952400" w:history="1">
+      <w:hyperlink w:anchor="_Toc230096678" w:history="1">
         <w:r>
           <w:rPr>
             <w:rStyle w:val="Hypertextovodkaz"/>
@@ -2195,7 +2203,7 @@
             <w:noProof/>
             <w:webHidden/>
           </w:rPr>
-          <w:instrText xml:space="preserve"> PAGEREF _Toc229952400 \h </w:instrText>
+          <w:instrText xml:space="preserve"> PAGEREF _Toc230096678 \h </w:instrText>
         </w:r>
         <w:r>
           <w:rPr>
@@ -2215,7 +2223,7 @@
             <w:noProof/>
             <w:webHidden/>
           </w:rPr>
-          <w:t>14</w:t>
+          <w:t>16</w:t>
         </w:r>
         <w:r>
           <w:rPr>
@@ -2237,10 +2245,11 @@
           <w:noProof/>
           <w:kern w:val="2"/>
           <w:szCs w:val="24"/>
+          <w:lang/>
           <w14:ligatures w14:val="standardContextual"/>
         </w:rPr>
       </w:pPr>
-      <w:hyperlink w:anchor="_Toc229952401" w:history="1">
+      <w:hyperlink w:anchor="_Toc230096679" w:history="1">
         <w:r>
           <w:rPr>
             <w:rStyle w:val="Hypertextovodkaz"/>
@@ -2267,7 +2276,7 @@
             <w:noProof/>
             <w:webHidden/>
           </w:rPr>
-          <w:instrText xml:space="preserve"> PAGEREF _Toc229952401 \h </w:instrText>
+          <w:instrText xml:space="preserve"> PAGEREF _Toc230096679 \h </w:instrText>
         </w:r>
         <w:r>
           <w:rPr>
@@ -2287,7 +2296,7 @@
             <w:noProof/>
             <w:webHidden/>
           </w:rPr>
-          <w:t>14</w:t>
+          <w:t>16</w:t>
         </w:r>
         <w:r>
           <w:rPr>
@@ -2309,10 +2318,11 @@
           <w:noProof/>
           <w:kern w:val="2"/>
           <w:szCs w:val="24"/>
+          <w:lang/>
           <w14:ligatures w14:val="standardContextual"/>
         </w:rPr>
       </w:pPr>
-      <w:hyperlink w:anchor="_Toc229952402" w:history="1">
+      <w:hyperlink w:anchor="_Toc230096680" w:history="1">
         <w:r>
           <w:rPr>
             <w:rStyle w:val="Hypertextovodkaz"/>
@@ -2339,7 +2349,7 @@
             <w:noProof/>
             <w:webHidden/>
           </w:rPr>
-          <w:instrText xml:space="preserve"> PAGEREF _Toc229952402 \h </w:instrText>
+          <w:instrText xml:space="preserve"> PAGEREF _Toc230096680 \h </w:instrText>
         </w:r>
         <w:r>
           <w:rPr>
@@ -2359,7 +2369,7 @@
             <w:noProof/>
             <w:webHidden/>
           </w:rPr>
-          <w:t>22</w:t>
+          <w:t>23</w:t>
         </w:r>
         <w:r>
           <w:rPr>
@@ -2381,10 +2391,11 @@
           <w:noProof/>
           <w:kern w:val="2"/>
           <w:szCs w:val="24"/>
+          <w:lang/>
           <w14:ligatures w14:val="standardContextual"/>
         </w:rPr>
       </w:pPr>
-      <w:hyperlink w:anchor="_Toc229952403" w:history="1">
+      <w:hyperlink w:anchor="_Toc230096681" w:history="1">
         <w:r>
           <w:rPr>
             <w:rStyle w:val="Hypertextovodkaz"/>
@@ -2411,7 +2422,7 @@
             <w:noProof/>
             <w:webHidden/>
           </w:rPr>
-          <w:instrText xml:space="preserve"> PAGEREF _Toc229952403 \h </w:instrText>
+          <w:instrText xml:space="preserve"> PAGEREF _Toc230096681 \h </w:instrText>
         </w:r>
         <w:r>
           <w:rPr>
@@ -2431,7 +2442,7 @@
             <w:noProof/>
             <w:webHidden/>
           </w:rPr>
-          <w:t>23</w:t>
+          <w:t>25</w:t>
         </w:r>
         <w:r>
           <w:rPr>
@@ -2453,10 +2464,11 @@
           <w:noProof/>
           <w:kern w:val="2"/>
           <w:szCs w:val="24"/>
+          <w:lang/>
           <w14:ligatures w14:val="standardContextual"/>
         </w:rPr>
       </w:pPr>
-      <w:hyperlink w:anchor="_Toc229952404" w:history="1">
+      <w:hyperlink w:anchor="_Toc230096682" w:history="1">
         <w:r>
           <w:rPr>
             <w:rStyle w:val="Hypertextovodkaz"/>
@@ -2483,7 +2495,7 @@
             <w:noProof/>
             <w:webHidden/>
           </w:rPr>
-          <w:instrText xml:space="preserve"> PAGEREF _Toc229952404 \h </w:instrText>
+          <w:instrText xml:space="preserve"> PAGEREF _Toc230096682 \h </w:instrText>
         </w:r>
         <w:r>
           <w:rPr>
@@ -2503,7 +2515,153 @@
             <w:noProof/>
             <w:webHidden/>
           </w:rPr>
-          <w:t>24</w:t>
+          <w:t>25</w:t>
+        </w:r>
+        <w:r>
+          <w:rPr>
+            <w:noProof/>
+            <w:webHidden/>
+          </w:rPr>
+          <w:fldChar w:fldCharType="end"/>
+        </w:r>
+      </w:hyperlink>
+    </w:p>
+    <w:p>
+      <w:pPr>
+        <w:pStyle w:val="Obsah3"/>
+        <w:tabs>
+          <w:tab w:val="right" w:leader="dot" w:pos="9060"/>
+        </w:tabs>
+        <w:rPr>
+          <w:rFonts w:asciiTheme="minorHAnsi" w:eastAsiaTheme="minorEastAsia" w:hAnsiTheme="minorHAnsi" w:cstheme="minorBidi"/>
+          <w:noProof/>
+          <w:kern w:val="2"/>
+          <w:szCs w:val="24"/>
+          <w:lang/>
+          <w14:ligatures w14:val="standardContextual"/>
+        </w:rPr>
+      </w:pPr>
+      <w:hyperlink w:anchor="_Toc230096683" w:history="1">
+        <w:r>
+          <w:rPr>
+            <w:rStyle w:val="Hypertextovodkaz"/>
+            <w:noProof/>
+          </w:rPr>
+          <w:t>1.3.6 Logika paměťového backendu</w:t>
+        </w:r>
+        <w:r>
+          <w:rPr>
+            <w:noProof/>
+            <w:webHidden/>
+          </w:rPr>
+          <w:tab/>
+        </w:r>
+        <w:r>
+          <w:rPr>
+            <w:noProof/>
+            <w:webHidden/>
+          </w:rPr>
+          <w:fldChar w:fldCharType="begin"/>
+        </w:r>
+        <w:r>
+          <w:rPr>
+            <w:noProof/>
+            <w:webHidden/>
+          </w:rPr>
+          <w:instrText xml:space="preserve"> PAGEREF _Toc230096683 \h </w:instrText>
+        </w:r>
+        <w:r>
+          <w:rPr>
+            <w:noProof/>
+            <w:webHidden/>
+          </w:rPr>
+        </w:r>
+        <w:r>
+          <w:rPr>
+            <w:noProof/>
+            <w:webHidden/>
+          </w:rPr>
+          <w:fldChar w:fldCharType="separate"/>
+        </w:r>
+        <w:r>
+          <w:rPr>
+            <w:noProof/>
+            <w:webHidden/>
+          </w:rPr>
+          <w:t>26</w:t>
+        </w:r>
+        <w:r>
+          <w:rPr>
+            <w:noProof/>
+            <w:webHidden/>
+          </w:rPr>
+          <w:fldChar w:fldCharType="end"/>
+        </w:r>
+      </w:hyperlink>
+    </w:p>
+    <w:p>
+      <w:pPr>
+        <w:pStyle w:val="Obsah3"/>
+        <w:tabs>
+          <w:tab w:val="right" w:leader="dot" w:pos="9060"/>
+        </w:tabs>
+        <w:rPr>
+          <w:rFonts w:asciiTheme="minorHAnsi" w:eastAsiaTheme="minorEastAsia" w:hAnsiTheme="minorHAnsi" w:cstheme="minorBidi"/>
+          <w:noProof/>
+          <w:kern w:val="2"/>
+          <w:szCs w:val="24"/>
+          <w:lang/>
+          <w14:ligatures w14:val="standardContextual"/>
+        </w:rPr>
+      </w:pPr>
+      <w:hyperlink w:anchor="_Toc230096684" w:history="1">
+        <w:r>
+          <w:rPr>
+            <w:rStyle w:val="Hypertextovodkaz"/>
+            <w:noProof/>
+          </w:rPr>
+          <w:t>1.3.7 Logika poolingu</w:t>
+        </w:r>
+        <w:r>
+          <w:rPr>
+            <w:noProof/>
+            <w:webHidden/>
+          </w:rPr>
+          <w:tab/>
+        </w:r>
+        <w:r>
+          <w:rPr>
+            <w:noProof/>
+            <w:webHidden/>
+          </w:rPr>
+          <w:fldChar w:fldCharType="begin"/>
+        </w:r>
+        <w:r>
+          <w:rPr>
+            <w:noProof/>
+            <w:webHidden/>
+          </w:rPr>
+          <w:instrText xml:space="preserve"> PAGEREF _Toc230096684 \h </w:instrText>
+        </w:r>
+        <w:r>
+          <w:rPr>
+            <w:noProof/>
+            <w:webHidden/>
+          </w:rPr>
+        </w:r>
+        <w:r>
+          <w:rPr>
+            <w:noProof/>
+            <w:webHidden/>
+          </w:rPr>
+          <w:fldChar w:fldCharType="separate"/>
+        </w:r>
+        <w:r>
+          <w:rPr>
+            <w:noProof/>
+            <w:webHidden/>
+          </w:rPr>
+          <w:t>26</w:t>
         </w:r>
         <w:r>
           <w:rPr>
@@ -2525,10 +2683,11 @@
           <w:noProof/>
           <w:kern w:val="2"/>
           <w:szCs w:val="24"/>
+          <w:lang/>
           <w14:ligatures w14:val="standardContextual"/>
         </w:rPr>
       </w:pPr>
-      <w:hyperlink w:anchor="_Toc229952405" w:history="1">
+      <w:hyperlink w:anchor="_Toc230096685" w:history="1">
         <w:r>
           <w:rPr>
             <w:rStyle w:val="Hypertextovodkaz"/>
@@ -2555,7 +2714,7 @@
             <w:noProof/>
             <w:webHidden/>
           </w:rPr>
-          <w:instrText xml:space="preserve"> PAGEREF _Toc229952405 \h </w:instrText>
+          <w:instrText xml:space="preserve"> PAGEREF _Toc230096685 \h </w:instrText>
         </w:r>
         <w:r>
           <w:rPr>
@@ -2575,7 +2734,7 @@
             <w:noProof/>
             <w:webHidden/>
           </w:rPr>
-          <w:t>25</w:t>
+          <w:t>27</w:t>
         </w:r>
         <w:r>
           <w:rPr>
@@ -2594,10 +2753,11 @@
           <w:noProof/>
           <w:kern w:val="2"/>
           <w:szCs w:val="24"/>
+          <w:lang/>
           <w14:ligatures w14:val="standardContextual"/>
         </w:rPr>
       </w:pPr>
-      <w:hyperlink w:anchor="_Toc229952406" w:history="1">
+      <w:hyperlink w:anchor="_Toc230096686" w:history="1">
         <w:r>
           <w:rPr>
             <w:rStyle w:val="Hypertextovodkaz"/>
@@ -2624,7 +2784,7 @@
             <w:noProof/>
             <w:webHidden/>
           </w:rPr>
-          <w:instrText xml:space="preserve"> PAGEREF _Toc229952406 \h </w:instrText>
+          <w:instrText xml:space="preserve"> PAGEREF _Toc230096686 \h </w:instrText>
         </w:r>
         <w:r>
           <w:rPr>
@@ -2644,7 +2804,7 @@
             <w:noProof/>
             <w:webHidden/>
           </w:rPr>
-          <w:t>25</w:t>
+          <w:t>27</w:t>
         </w:r>
         <w:r>
           <w:rPr>
@@ -2666,10 +2826,11 @@
           <w:noProof/>
           <w:kern w:val="2"/>
           <w:szCs w:val="24"/>
+          <w:lang/>
           <w14:ligatures w14:val="standardContextual"/>
         </w:rPr>
       </w:pPr>
-      <w:hyperlink w:anchor="_Toc229952407" w:history="1">
+      <w:hyperlink w:anchor="_Toc230096687" w:history="1">
         <w:r>
           <w:rPr>
             <w:rStyle w:val="Hypertextovodkaz"/>
@@ -2696,7 +2857,7 @@
             <w:noProof/>
             <w:webHidden/>
           </w:rPr>
-          <w:instrText xml:space="preserve"> PAGEREF _Toc229952407 \h </w:instrText>
+          <w:instrText xml:space="preserve"> PAGEREF _Toc230096687 \h </w:instrText>
         </w:r>
         <w:r>
           <w:rPr>
@@ -2716,7 +2877,7 @@
             <w:noProof/>
             <w:webHidden/>
           </w:rPr>
-          <w:t>25</w:t>
+          <w:t>27</w:t>
         </w:r>
         <w:r>
           <w:rPr>
@@ -2738,10 +2899,11 @@
           <w:noProof/>
           <w:kern w:val="2"/>
           <w:szCs w:val="24"/>
+          <w:lang/>
           <w14:ligatures w14:val="standardContextual"/>
         </w:rPr>
       </w:pPr>
-      <w:hyperlink w:anchor="_Toc229952408" w:history="1">
+      <w:hyperlink w:anchor="_Toc230096688" w:history="1">
         <w:r>
           <w:rPr>
             <w:rStyle w:val="Hypertextovodkaz"/>
@@ -2768,7 +2930,7 @@
             <w:noProof/>
             <w:webHidden/>
           </w:rPr>
-          <w:instrText xml:space="preserve"> PAGEREF _Toc229952408 \h </w:instrText>
+          <w:instrText xml:space="preserve"> PAGEREF _Toc230096688 \h </w:instrText>
         </w:r>
         <w:r>
           <w:rPr>
@@ -2788,7 +2950,7 @@
             <w:noProof/>
             <w:webHidden/>
           </w:rPr>
-          <w:t>26</w:t>
+          <w:t>28</w:t>
         </w:r>
         <w:r>
           <w:rPr>
@@ -2807,10 +2969,11 @@
           <w:noProof/>
           <w:kern w:val="2"/>
           <w:szCs w:val="24"/>
+          <w:lang/>
           <w14:ligatures w14:val="standardContextual"/>
         </w:rPr>
       </w:pPr>
-      <w:hyperlink w:anchor="_Toc229952409" w:history="1">
+      <w:hyperlink w:anchor="_Toc230096689" w:history="1">
         <w:r>
           <w:rPr>
             <w:rStyle w:val="Hypertextovodkaz"/>
@@ -2837,7 +3000,7 @@
             <w:noProof/>
             <w:webHidden/>
           </w:rPr>
-          <w:instrText xml:space="preserve"> PAGEREF _Toc229952409 \h </w:instrText>
+          <w:instrText xml:space="preserve"> PAGEREF _Toc230096689 \h </w:instrText>
         </w:r>
         <w:r>
           <w:rPr>
@@ -2857,7 +3020,7 @@
             <w:noProof/>
             <w:webHidden/>
           </w:rPr>
-          <w:t>26</w:t>
+          <w:t>28</w:t>
         </w:r>
         <w:r>
           <w:rPr>
@@ -2879,10 +3042,11 @@
           <w:noProof/>
           <w:kern w:val="2"/>
           <w:szCs w:val="24"/>
+          <w:lang/>
           <w14:ligatures w14:val="standardContextual"/>
         </w:rPr>
       </w:pPr>
-      <w:hyperlink w:anchor="_Toc229952410" w:history="1">
+      <w:hyperlink w:anchor="_Toc230096690" w:history="1">
         <w:r>
           <w:rPr>
             <w:rStyle w:val="Hypertextovodkaz"/>
@@ -2909,7 +3073,7 @@
             <w:noProof/>
             <w:webHidden/>
           </w:rPr>
-          <w:instrText xml:space="preserve"> PAGEREF _Toc229952410 \h </w:instrText>
+          <w:instrText xml:space="preserve"> PAGEREF _Toc230096690 \h </w:instrText>
         </w:r>
         <w:r>
           <w:rPr>
@@ -2929,7 +3093,7 @@
             <w:noProof/>
             <w:webHidden/>
           </w:rPr>
-          <w:t>26</w:t>
+          <w:t>28</w:t>
         </w:r>
         <w:r>
           <w:rPr>
@@ -2951,10 +3115,11 @@
           <w:noProof/>
           <w:kern w:val="2"/>
           <w:szCs w:val="24"/>
+          <w:lang/>
           <w14:ligatures w14:val="standardContextual"/>
         </w:rPr>
       </w:pPr>
-      <w:hyperlink w:anchor="_Toc229952411" w:history="1">
+      <w:hyperlink w:anchor="_Toc230096691" w:history="1">
         <w:r>
           <w:rPr>
             <w:rStyle w:val="Hypertextovodkaz"/>
@@ -2981,7 +3146,7 @@
             <w:noProof/>
             <w:webHidden/>
           </w:rPr>
-          <w:instrText xml:space="preserve"> PAGEREF _Toc229952411 \h </w:instrText>
+          <w:instrText xml:space="preserve"> PAGEREF _Toc230096691 \h </w:instrText>
         </w:r>
         <w:r>
           <w:rPr>
@@ -3001,7 +3166,7 @@
             <w:noProof/>
             <w:webHidden/>
           </w:rPr>
-          <w:t>27</w:t>
+          <w:t>29</w:t>
         </w:r>
         <w:r>
           <w:rPr>
@@ -3023,10 +3188,11 @@
           <w:noProof/>
           <w:kern w:val="2"/>
           <w:szCs w:val="24"/>
+          <w:lang/>
           <w14:ligatures w14:val="standardContextual"/>
         </w:rPr>
       </w:pPr>
-      <w:hyperlink w:anchor="_Toc229952412" w:history="1">
+      <w:hyperlink w:anchor="_Toc230096692" w:history="1">
         <w:r>
           <w:rPr>
             <w:rStyle w:val="Hypertextovodkaz"/>
@@ -3061,7 +3227,7 @@
             <w:noProof/>
             <w:webHidden/>
           </w:rPr>
-          <w:instrText xml:space="preserve"> PAGEREF _Toc229952412 \h </w:instrText>
+          <w:instrText xml:space="preserve"> PAGEREF _Toc230096692 \h </w:instrText>
         </w:r>
         <w:r>
           <w:rPr>
@@ -3081,7 +3247,7 @@
             <w:noProof/>
             <w:webHidden/>
           </w:rPr>
-          <w:t>28</w:t>
+          <w:t>30</w:t>
         </w:r>
         <w:r>
           <w:rPr>
@@ -3103,10 +3269,11 @@
           <w:noProof/>
           <w:kern w:val="2"/>
           <w:szCs w:val="24"/>
+          <w:lang/>
           <w14:ligatures w14:val="standardContextual"/>
         </w:rPr>
       </w:pPr>
-      <w:hyperlink w:anchor="_Toc229952413" w:history="1">
+      <w:hyperlink w:anchor="_Toc230096693" w:history="1">
         <w:r>
           <w:rPr>
             <w:rStyle w:val="Hypertextovodkaz"/>
@@ -3134,7 +3301,7 @@
             <w:noProof/>
             <w:webHidden/>
           </w:rPr>
-          <w:instrText xml:space="preserve"> PAGEREF _Toc229952413 \h </w:instrText>
+          <w:instrText xml:space="preserve"> PAGEREF _Toc230096693 \h </w:instrText>
         </w:r>
         <w:r>
           <w:rPr>
@@ -3154,7 +3321,7 @@
             <w:noProof/>
             <w:webHidden/>
           </w:rPr>
-          <w:t>28</w:t>
+          <w:t>30</w:t>
         </w:r>
         <w:r>
           <w:rPr>
@@ -3176,10 +3343,11 @@
           <w:noProof/>
           <w:kern w:val="2"/>
           <w:szCs w:val="24"/>
+          <w:lang/>
           <w14:ligatures w14:val="standardContextual"/>
         </w:rPr>
       </w:pPr>
-      <w:hyperlink w:anchor="_Toc229952414" w:history="1">
+      <w:hyperlink w:anchor="_Toc230096694" w:history="1">
         <w:r>
           <w:rPr>
             <w:rStyle w:val="Hypertextovodkaz"/>
@@ -3207,7 +3375,7 @@
             <w:noProof/>
             <w:webHidden/>
           </w:rPr>
-          <w:instrText xml:space="preserve"> PAGEREF _Toc229952414 \h </w:instrText>
+          <w:instrText xml:space="preserve"> PAGEREF _Toc230096694 \h </w:instrText>
         </w:r>
         <w:r>
           <w:rPr>
@@ -3227,7 +3395,7 @@
             <w:noProof/>
             <w:webHidden/>
           </w:rPr>
-          <w:t>29</w:t>
+          <w:t>31</w:t>
         </w:r>
         <w:r>
           <w:rPr>
@@ -3249,10 +3417,11 @@
           <w:noProof/>
           <w:kern w:val="2"/>
           <w:szCs w:val="24"/>
+          <w:lang/>
           <w14:ligatures w14:val="standardContextual"/>
         </w:rPr>
       </w:pPr>
-      <w:hyperlink w:anchor="_Toc229952415" w:history="1">
+      <w:hyperlink w:anchor="_Toc230096695" w:history="1">
         <w:r>
           <w:rPr>
             <w:rStyle w:val="Hypertextovodkaz"/>
@@ -3280,7 +3449,7 @@
             <w:noProof/>
             <w:webHidden/>
           </w:rPr>
-          <w:instrText xml:space="preserve"> PAGEREF _Toc229952415 \h </w:instrText>
+          <w:instrText xml:space="preserve"> PAGEREF _Toc230096695 \h </w:instrText>
         </w:r>
         <w:r>
           <w:rPr>
@@ -3300,7 +3469,7 @@
             <w:noProof/>
             <w:webHidden/>
           </w:rPr>
-          <w:t>30</w:t>
+          <w:t>32</w:t>
         </w:r>
         <w:r>
           <w:rPr>
@@ -3322,10 +3491,11 @@
           <w:noProof/>
           <w:kern w:val="2"/>
           <w:szCs w:val="24"/>
+          <w:lang/>
           <w14:ligatures w14:val="standardContextual"/>
         </w:rPr>
       </w:pPr>
-      <w:hyperlink w:anchor="_Toc229952416" w:history="1">
+      <w:hyperlink w:anchor="_Toc230096696" w:history="1">
         <w:r>
           <w:rPr>
             <w:rStyle w:val="Hypertextovodkaz"/>
@@ -3353,7 +3523,7 @@
             <w:noProof/>
             <w:webHidden/>
           </w:rPr>
-          <w:instrText xml:space="preserve"> PAGEREF _Toc229952416 \h </w:instrText>
+          <w:instrText xml:space="preserve"> PAGEREF _Toc230096696 \h </w:instrText>
         </w:r>
         <w:r>
           <w:rPr>
@@ -3373,7 +3543,7 @@
             <w:noProof/>
             <w:webHidden/>
           </w:rPr>
-          <w:t>30</w:t>
+          <w:t>33</w:t>
         </w:r>
         <w:r>
           <w:rPr>
@@ -3395,17 +3565,18 @@
           <w:noProof/>
           <w:kern w:val="2"/>
           <w:szCs w:val="24"/>
+          <w:lang/>
           <w14:ligatures w14:val="standardContextual"/>
         </w:rPr>
       </w:pPr>
-      <w:hyperlink w:anchor="_Toc229952417" w:history="1">
+      <w:hyperlink w:anchor="_Toc230096697" w:history="1">
         <w:r>
           <w:rPr>
             <w:rStyle w:val="Hypertextovodkaz"/>
             <w:noProof/>
             <w:lang w:eastAsia="cs-CZ"/>
           </w:rPr>
-          <w:t>2.2.8 Pomocné</w:t>
+          <w:t>2.2.8 Abstraktní operace</w:t>
         </w:r>
         <w:r>
           <w:rPr>
@@ -3426,7 +3597,7 @@
             <w:noProof/>
             <w:webHidden/>
           </w:rPr>
-          <w:instrText xml:space="preserve"> PAGEREF _Toc229952417 \h </w:instrText>
+          <w:instrText xml:space="preserve"> PAGEREF _Toc230096697 \h </w:instrText>
         </w:r>
         <w:r>
           <w:rPr>
@@ -3446,77 +3617,7 @@
             <w:noProof/>
             <w:webHidden/>
           </w:rPr>
-          <w:t>31</w:t>
-        </w:r>
-        <w:r>
-          <w:rPr>
-            <w:noProof/>
-            <w:webHidden/>
-          </w:rPr>
-          <w:fldChar w:fldCharType="end"/>
-        </w:r>
-      </w:hyperlink>
-    </w:p>
-    <w:p>
-      <w:pPr>
-        <w:pStyle w:val="Obsah2"/>
-        <w:rPr>
-          <w:rFonts w:asciiTheme="minorHAnsi" w:eastAsiaTheme="minorEastAsia" w:hAnsiTheme="minorHAnsi" w:cstheme="minorBidi"/>
-          <w:noProof/>
-          <w:kern w:val="2"/>
-          <w:szCs w:val="24"/>
-          <w14:ligatures w14:val="standardContextual"/>
-        </w:rPr>
-      </w:pPr>
-      <w:hyperlink w:anchor="_Toc229952418" w:history="1">
-        <w:r>
-          <w:rPr>
-            <w:rStyle w:val="Hypertextovodkaz"/>
-            <w:noProof/>
-            <w:lang w:eastAsia="cs-CZ"/>
-          </w:rPr>
-          <w:t>2.3 Testy</w:t>
-        </w:r>
-        <w:r>
-          <w:rPr>
-            <w:noProof/>
-            <w:webHidden/>
-          </w:rPr>
-          <w:tab/>
-        </w:r>
-        <w:r>
-          <w:rPr>
-            <w:noProof/>
-            <w:webHidden/>
-          </w:rPr>
-          <w:fldChar w:fldCharType="begin"/>
-        </w:r>
-        <w:r>
-          <w:rPr>
-            <w:noProof/>
-            <w:webHidden/>
-          </w:rPr>
-          <w:instrText xml:space="preserve"> PAGEREF _Toc229952418 \h </w:instrText>
-        </w:r>
-        <w:r>
-          <w:rPr>
-            <w:noProof/>
-            <w:webHidden/>
-          </w:rPr>
-        </w:r>
-        <w:r>
-          <w:rPr>
-            <w:noProof/>
-            <w:webHidden/>
-          </w:rPr>
-          <w:fldChar w:fldCharType="separate"/>
-        </w:r>
-        <w:r>
-          <w:rPr>
-            <w:noProof/>
-            <w:webHidden/>
-          </w:rPr>
-          <w:t>31</w:t>
+          <w:t>33</w:t>
         </w:r>
         <w:r>
           <w:rPr>
@@ -3538,17 +3639,18 @@
           <w:noProof/>
           <w:kern w:val="2"/>
           <w:szCs w:val="24"/>
+          <w:lang/>
           <w14:ligatures w14:val="standardContextual"/>
         </w:rPr>
       </w:pPr>
-      <w:hyperlink w:anchor="_Toc229952419" w:history="1">
+      <w:hyperlink w:anchor="_Toc230096698" w:history="1">
         <w:r>
           <w:rPr>
             <w:rStyle w:val="Hypertextovodkaz"/>
             <w:noProof/>
             <w:lang w:eastAsia="cs-CZ"/>
           </w:rPr>
-          <w:t>2.3.1 Unit testování</w:t>
+          <w:t>2.2.9 Pooling USM</w:t>
         </w:r>
         <w:r>
           <w:rPr>
@@ -3569,7 +3671,7 @@
             <w:noProof/>
             <w:webHidden/>
           </w:rPr>
-          <w:instrText xml:space="preserve"> PAGEREF _Toc229952419 \h </w:instrText>
+          <w:instrText xml:space="preserve"> PAGEREF _Toc230096698 \h </w:instrText>
         </w:r>
         <w:r>
           <w:rPr>
@@ -3589,7 +3691,7 @@
             <w:noProof/>
             <w:webHidden/>
           </w:rPr>
-          <w:t>31</w:t>
+          <w:t>33</w:t>
         </w:r>
         <w:r>
           <w:rPr>
@@ -3611,16 +3713,236 @@
           <w:noProof/>
           <w:kern w:val="2"/>
           <w:szCs w:val="24"/>
+          <w:lang/>
           <w14:ligatures w14:val="standardContextual"/>
         </w:rPr>
       </w:pPr>
-      <w:hyperlink w:anchor="_Toc229952420" w:history="1">
+      <w:hyperlink w:anchor="_Toc230096699" w:history="1">
         <w:r>
           <w:rPr>
             <w:rStyle w:val="Hypertextovodkaz"/>
             <w:noProof/>
             <w:lang w:eastAsia="cs-CZ"/>
           </w:rPr>
+          <w:t>2.2.10 Pomocné</w:t>
+        </w:r>
+        <w:r>
+          <w:rPr>
+            <w:noProof/>
+            <w:webHidden/>
+          </w:rPr>
+          <w:tab/>
+        </w:r>
+        <w:r>
+          <w:rPr>
+            <w:noProof/>
+            <w:webHidden/>
+          </w:rPr>
+          <w:fldChar w:fldCharType="begin"/>
+        </w:r>
+        <w:r>
+          <w:rPr>
+            <w:noProof/>
+            <w:webHidden/>
+          </w:rPr>
+          <w:instrText xml:space="preserve"> PAGEREF _Toc230096699 \h </w:instrText>
+        </w:r>
+        <w:r>
+          <w:rPr>
+            <w:noProof/>
+            <w:webHidden/>
+          </w:rPr>
+        </w:r>
+        <w:r>
+          <w:rPr>
+            <w:noProof/>
+            <w:webHidden/>
+          </w:rPr>
+          <w:fldChar w:fldCharType="separate"/>
+        </w:r>
+        <w:r>
+          <w:rPr>
+            <w:noProof/>
+            <w:webHidden/>
+          </w:rPr>
+          <w:t>33</w:t>
+        </w:r>
+        <w:r>
+          <w:rPr>
+            <w:noProof/>
+            <w:webHidden/>
+          </w:rPr>
+          <w:fldChar w:fldCharType="end"/>
+        </w:r>
+      </w:hyperlink>
+    </w:p>
+    <w:p>
+      <w:pPr>
+        <w:pStyle w:val="Obsah2"/>
+        <w:rPr>
+          <w:rFonts w:asciiTheme="minorHAnsi" w:eastAsiaTheme="minorEastAsia" w:hAnsiTheme="minorHAnsi" w:cstheme="minorBidi"/>
+          <w:noProof/>
+          <w:kern w:val="2"/>
+          <w:szCs w:val="24"/>
+          <w:lang/>
+          <w14:ligatures w14:val="standardContextual"/>
+        </w:rPr>
+      </w:pPr>
+      <w:hyperlink w:anchor="_Toc230096700" w:history="1">
+        <w:r>
+          <w:rPr>
+            <w:rStyle w:val="Hypertextovodkaz"/>
+            <w:noProof/>
+            <w:lang w:eastAsia="cs-CZ"/>
+          </w:rPr>
+          <w:t>2.3 Testy</w:t>
+        </w:r>
+        <w:r>
+          <w:rPr>
+            <w:noProof/>
+            <w:webHidden/>
+          </w:rPr>
+          <w:tab/>
+        </w:r>
+        <w:r>
+          <w:rPr>
+            <w:noProof/>
+            <w:webHidden/>
+          </w:rPr>
+          <w:fldChar w:fldCharType="begin"/>
+        </w:r>
+        <w:r>
+          <w:rPr>
+            <w:noProof/>
+            <w:webHidden/>
+          </w:rPr>
+          <w:instrText xml:space="preserve"> PAGEREF _Toc230096700 \h </w:instrText>
+        </w:r>
+        <w:r>
+          <w:rPr>
+            <w:noProof/>
+            <w:webHidden/>
+          </w:rPr>
+        </w:r>
+        <w:r>
+          <w:rPr>
+            <w:noProof/>
+            <w:webHidden/>
+          </w:rPr>
+          <w:fldChar w:fldCharType="separate"/>
+        </w:r>
+        <w:r>
+          <w:rPr>
+            <w:noProof/>
+            <w:webHidden/>
+          </w:rPr>
+          <w:t>34</w:t>
+        </w:r>
+        <w:r>
+          <w:rPr>
+            <w:noProof/>
+            <w:webHidden/>
+          </w:rPr>
+          <w:fldChar w:fldCharType="end"/>
+        </w:r>
+      </w:hyperlink>
+    </w:p>
+    <w:p>
+      <w:pPr>
+        <w:pStyle w:val="Obsah3"/>
+        <w:tabs>
+          <w:tab w:val="right" w:leader="dot" w:pos="9060"/>
+        </w:tabs>
+        <w:rPr>
+          <w:rFonts w:asciiTheme="minorHAnsi" w:eastAsiaTheme="minorEastAsia" w:hAnsiTheme="minorHAnsi" w:cstheme="minorBidi"/>
+          <w:noProof/>
+          <w:kern w:val="2"/>
+          <w:szCs w:val="24"/>
+          <w:lang/>
+          <w14:ligatures w14:val="standardContextual"/>
+        </w:rPr>
+      </w:pPr>
+      <w:hyperlink w:anchor="_Toc230096701" w:history="1">
+        <w:r>
+          <w:rPr>
+            <w:rStyle w:val="Hypertextovodkaz"/>
+            <w:noProof/>
+            <w:lang w:eastAsia="cs-CZ"/>
+          </w:rPr>
+          <w:t>2.3.1 Unit testování</w:t>
+        </w:r>
+        <w:r>
+          <w:rPr>
+            <w:noProof/>
+            <w:webHidden/>
+          </w:rPr>
+          <w:tab/>
+        </w:r>
+        <w:r>
+          <w:rPr>
+            <w:noProof/>
+            <w:webHidden/>
+          </w:rPr>
+          <w:fldChar w:fldCharType="begin"/>
+        </w:r>
+        <w:r>
+          <w:rPr>
+            <w:noProof/>
+            <w:webHidden/>
+          </w:rPr>
+          <w:instrText xml:space="preserve"> PAGEREF _Toc230096701 \h </w:instrText>
+        </w:r>
+        <w:r>
+          <w:rPr>
+            <w:noProof/>
+            <w:webHidden/>
+          </w:rPr>
+        </w:r>
+        <w:r>
+          <w:rPr>
+            <w:noProof/>
+            <w:webHidden/>
+          </w:rPr>
+          <w:fldChar w:fldCharType="separate"/>
+        </w:r>
+        <w:r>
+          <w:rPr>
+            <w:noProof/>
+            <w:webHidden/>
+          </w:rPr>
+          <w:t>34</w:t>
+        </w:r>
+        <w:r>
+          <w:rPr>
+            <w:noProof/>
+            <w:webHidden/>
+          </w:rPr>
+          <w:fldChar w:fldCharType="end"/>
+        </w:r>
+      </w:hyperlink>
+    </w:p>
+    <w:p>
+      <w:pPr>
+        <w:pStyle w:val="Obsah3"/>
+        <w:tabs>
+          <w:tab w:val="right" w:leader="dot" w:pos="9060"/>
+        </w:tabs>
+        <w:rPr>
+          <w:rFonts w:asciiTheme="minorHAnsi" w:eastAsiaTheme="minorEastAsia" w:hAnsiTheme="minorHAnsi" w:cstheme="minorBidi"/>
+          <w:noProof/>
+          <w:kern w:val="2"/>
+          <w:szCs w:val="24"/>
+          <w:lang/>
+          <w14:ligatures w14:val="standardContextual"/>
+        </w:rPr>
+      </w:pPr>
+      <w:hyperlink w:anchor="_Toc230096702" w:history="1">
+        <w:r>
+          <w:rPr>
+            <w:rStyle w:val="Hypertextovodkaz"/>
+            <w:noProof/>
+            <w:lang w:eastAsia="cs-CZ"/>
+          </w:rPr>
           <w:t>2.3.2 Zátěžové testování</w:t>
         </w:r>
         <w:r>
@@ -3642,7 +3964,7 @@
             <w:noProof/>
             <w:webHidden/>
           </w:rPr>
-          <w:instrText xml:space="preserve"> PAGEREF _Toc229952420 \h </w:instrText>
+          <w:instrText xml:space="preserve"> PAGEREF _Toc230096702 \h </w:instrText>
         </w:r>
         <w:r>
           <w:rPr>
@@ -3662,7 +3984,7 @@
             <w:noProof/>
             <w:webHidden/>
           </w:rPr>
-          <w:t>32</w:t>
+          <w:t>34</w:t>
         </w:r>
         <w:r>
           <w:rPr>
@@ -3684,10 +4006,11 @@
           <w:noProof/>
           <w:kern w:val="2"/>
           <w:szCs w:val="24"/>
+          <w:lang/>
           <w14:ligatures w14:val="standardContextual"/>
         </w:rPr>
       </w:pPr>
-      <w:hyperlink w:anchor="_Toc229952421" w:history="1">
+      <w:hyperlink w:anchor="_Toc230096703" w:history="1">
         <w:r>
           <w:rPr>
             <w:rStyle w:val="Hypertextovodkaz"/>
@@ -3714,7 +4037,7 @@
             <w:noProof/>
             <w:webHidden/>
           </w:rPr>
-          <w:instrText xml:space="preserve"> PAGEREF _Toc229952421 \h </w:instrText>
+          <w:instrText xml:space="preserve"> PAGEREF _Toc230096703 \h </w:instrText>
         </w:r>
         <w:r>
           <w:rPr>
@@ -3734,7 +4057,7 @@
             <w:noProof/>
             <w:webHidden/>
           </w:rPr>
-          <w:t>33</w:t>
+          <w:t>36</w:t>
         </w:r>
         <w:r>
           <w:rPr>
@@ -3756,10 +4079,11 @@
           <w:noProof/>
           <w:kern w:val="2"/>
           <w:szCs w:val="24"/>
+          <w:lang/>
           <w14:ligatures w14:val="standardContextual"/>
         </w:rPr>
       </w:pPr>
-      <w:hyperlink w:anchor="_Toc229952422" w:history="1">
+      <w:hyperlink w:anchor="_Toc230096704" w:history="1">
         <w:r>
           <w:rPr>
             <w:rStyle w:val="Hypertextovodkaz"/>
@@ -3786,7 +4110,7 @@
             <w:noProof/>
             <w:webHidden/>
           </w:rPr>
-          <w:instrText xml:space="preserve"> PAGEREF _Toc229952422 \h </w:instrText>
+          <w:instrText xml:space="preserve"> PAGEREF _Toc230096704 \h </w:instrText>
         </w:r>
         <w:r>
           <w:rPr>
@@ -3806,7 +4130,7 @@
             <w:noProof/>
             <w:webHidden/>
           </w:rPr>
-          <w:t>35</w:t>
+          <w:t>38</w:t>
         </w:r>
         <w:r>
           <w:rPr>
@@ -3828,10 +4152,11 @@
           <w:noProof/>
           <w:kern w:val="2"/>
           <w:szCs w:val="24"/>
+          <w:lang/>
           <w14:ligatures w14:val="standardContextual"/>
         </w:rPr>
       </w:pPr>
-      <w:hyperlink w:anchor="_Toc229952423" w:history="1">
+      <w:hyperlink w:anchor="_Toc230096705" w:history="1">
         <w:r>
           <w:rPr>
             <w:rStyle w:val="Hypertextovodkaz"/>
@@ -3858,7 +4183,7 @@
             <w:noProof/>
             <w:webHidden/>
           </w:rPr>
-          <w:instrText xml:space="preserve"> PAGEREF _Toc229952423 \h </w:instrText>
+          <w:instrText xml:space="preserve"> PAGEREF _Toc230096705 \h </w:instrText>
         </w:r>
         <w:r>
           <w:rPr>
@@ -3878,7 +4203,7 @@
             <w:noProof/>
             <w:webHidden/>
           </w:rPr>
-          <w:t>36</w:t>
+          <w:t>39</w:t>
         </w:r>
         <w:r>
           <w:rPr>
@@ -3900,10 +4225,11 @@
           <w:noProof/>
           <w:kern w:val="2"/>
           <w:szCs w:val="24"/>
+          <w:lang/>
           <w14:ligatures w14:val="standardContextual"/>
         </w:rPr>
       </w:pPr>
-      <w:hyperlink w:anchor="_Toc229952424" w:history="1">
+      <w:hyperlink w:anchor="_Toc230096706" w:history="1">
         <w:r>
           <w:rPr>
             <w:rStyle w:val="Hypertextovodkaz"/>
@@ -3930,7 +4256,7 @@
             <w:noProof/>
             <w:webHidden/>
           </w:rPr>
-          <w:instrText xml:space="preserve"> PAGEREF _Toc229952424 \h </w:instrText>
+          <w:instrText xml:space="preserve"> PAGEREF _Toc230096706 \h </w:instrText>
         </w:r>
         <w:r>
           <w:rPr>
@@ -3950,7 +4276,7 @@
             <w:noProof/>
             <w:webHidden/>
           </w:rPr>
-          <w:t>37</w:t>
+          <w:t>40</w:t>
         </w:r>
         <w:r>
           <w:rPr>
@@ -3982,7 +4308,7 @@
       <w:pPr>
         <w:pStyle w:val="Nadpis1"/>
       </w:pPr>
-      <w:bookmarkStart w:id="0" w:name="_Toc229952393"/>
+      <w:bookmarkStart w:id="0" w:name="_Toc230096671"/>
       <w:r>
         <w:rPr>
           <w:shd w:val="clear" w:color="auto" w:fill="FFFFFF"/>
@@ -4227,7 +4553,7 @@
             <w:noProof/>
             <w:webHidden/>
           </w:rPr>
-          <w:t>34</w:t>
+          <w:t>35</w:t>
         </w:r>
         <w:r>
           <w:rPr>
@@ -4283,7 +4609,7 @@
           <w:shd w:val="clear" w:color="auto" w:fill="FFFFFF"/>
         </w:rPr>
       </w:pPr>
-      <w:bookmarkStart w:id="1" w:name="_Toc229952394"/>
+      <w:bookmarkStart w:id="1" w:name="_Toc230096672"/>
       <w:r>
         <w:rPr>
           <w:shd w:val="clear" w:color="auto" w:fill="FFFFFF"/>
@@ -4531,6 +4857,9 @@
     <w:p>
       <w:pPr>
         <w:spacing w:line="360" w:lineRule="auto"/>
+        <w:rPr>
+          <w:lang w:eastAsia="cs-CZ"/>
+        </w:rPr>
       </w:pPr>
       <w:r>
         <w:rPr>
@@ -4563,7 +4892,7 @@
           <w:shd w:val="clear" w:color="auto" w:fill="FFFFFF"/>
         </w:rPr>
       </w:pPr>
-      <w:bookmarkStart w:id="2" w:name="_Toc229952395"/>
+      <w:bookmarkStart w:id="2" w:name="_Toc230096673"/>
       <w:r>
         <w:rPr>
           <w:shd w:val="clear" w:color="auto" w:fill="FFFFFF"/>
@@ -4655,6 +4984,57 @@
           <w:shd w:val="clear" w:color="auto" w:fill="FFFFFF"/>
         </w:rPr>
         <w:t>kolekci.</w:t>
+      </w:r>
+    </w:p>
+    <w:p>
+      <w:pPr>
+        <w:rPr>
+          <w:color w:val="000000"/>
+          <w:szCs w:val="24"/>
+          <w:shd w:val="clear" w:color="auto" w:fill="FFFFFF"/>
+        </w:rPr>
+      </w:pPr>
+      <w:r>
+        <w:rPr>
+          <w:b/>
+          <w:bCs/>
+          <w:color w:val="000000"/>
+          <w:szCs w:val="24"/>
+          <w:shd w:val="clear" w:color="auto" w:fill="FFFFFF"/>
+        </w:rPr>
+        <w:t>Overhead</w:t>
+      </w:r>
+      <w:r>
+        <w:rPr>
+          <w:color w:val="000000"/>
+          <w:szCs w:val="24"/>
+          <w:shd w:val="clear" w:color="auto" w:fill="FFFFFF"/>
+        </w:rPr>
+        <w:t xml:space="preserve"> – </w:t>
+      </w:r>
+      <w:r>
+        <w:rPr>
+          <w:color w:val="000000"/>
+          <w:szCs w:val="24"/>
+          <w:shd w:val="clear" w:color="auto" w:fill="FFFFFF"/>
+        </w:rPr>
+        <w:t>více práce programu oproti jinému v</w:t>
+      </w:r>
+      <w:r>
+        <w:rPr>
+          <w:color w:val="000000"/>
+          <w:szCs w:val="24"/>
+          <w:shd w:val="clear" w:color="auto" w:fill="FFFFFF"/>
+        </w:rPr>
+        <w:t xml:space="preserve"> </w:t>
+      </w:r>
+      <w:r>
+        <w:rPr>
+          <w:color w:val="000000"/>
+          <w:szCs w:val="24"/>
+          <w:shd w:val="clear" w:color="auto" w:fill="FFFFFF"/>
+        </w:rPr>
+        <w:t>oblasti režie.</w:t>
       </w:r>
     </w:p>
     <w:p>
@@ -4679,7 +5059,7 @@
           <w:szCs w:val="24"/>
           <w:shd w:val="clear" w:color="auto" w:fill="FFFFFF"/>
         </w:rPr>
-        <w:t>Overhead</w:t>
+        <w:t>Pooling</w:t>
       </w:r>
       <w:r>
         <w:rPr>
@@ -4687,38 +5067,14 @@
           <w:szCs w:val="24"/>
           <w:shd w:val="clear" w:color="auto" w:fill="FFFFFF"/>
         </w:rPr>
-        <w:t xml:space="preserve"> – </w:t>
-      </w:r>
-      <w:r>
-        <w:rPr>
-          <w:color w:val="000000"/>
-          <w:szCs w:val="24"/>
-          <w:shd w:val="clear" w:color="auto" w:fill="FFFFFF"/>
-        </w:rPr>
-        <w:t>více práce programu oproti jinému v</w:t>
-      </w:r>
-      <w:r>
-        <w:rPr>
-          <w:color w:val="000000"/>
-          <w:szCs w:val="24"/>
-          <w:shd w:val="clear" w:color="auto" w:fill="FFFFFF"/>
-        </w:rPr>
-        <w:t xml:space="preserve"> </w:t>
-      </w:r>
-      <w:r>
-        <w:rPr>
-          <w:color w:val="000000"/>
-          <w:szCs w:val="24"/>
-          <w:shd w:val="clear" w:color="auto" w:fill="FFFFFF"/>
-        </w:rPr>
-        <w:t>oblasti režie.</w:t>
+        <w:t xml:space="preserve"> – v kontextu projektu se jedná o recyklaci paměti místo její neustálé alokace</w:t>
       </w:r>
     </w:p>
     <w:p>
       <w:pPr>
         <w:pStyle w:val="Nadpis1"/>
       </w:pPr>
-      <w:bookmarkStart w:id="3" w:name="_Toc229952396"/>
+      <w:bookmarkStart w:id="3" w:name="_Toc230096674"/>
       <w:r>
         <w:lastRenderedPageBreak/>
         <w:t>ÚVOD</w:t>
@@ -5017,7 +5373,7 @@
       <w:r>
         <w:br w:type="page"/>
       </w:r>
-      <w:bookmarkStart w:id="4" w:name="_Toc229952397"/>
+      <w:bookmarkStart w:id="4" w:name="_Toc230096675"/>
       <w:r>
         <w:lastRenderedPageBreak/>
         <w:t>1</w:t>
@@ -5173,7 +5529,7 @@
         <w:pStyle w:val="Nadpis2"/>
         <w:jc w:val="both"/>
       </w:pPr>
-      <w:bookmarkStart w:id="5" w:name="_Toc229952398"/>
+      <w:bookmarkStart w:id="5" w:name="_Toc230096676"/>
       <w:r>
         <w:t xml:space="preserve">1.1 </w:t>
       </w:r>
@@ -5335,21 +5691,7 @@
         <w:rPr>
           <w:szCs w:val="24"/>
         </w:rPr>
-        <w:t xml:space="preserve"> a tím </w:t>
-      </w:r>
-      <w:proofErr w:type="gramStart"/>
-      <w:r>
-        <w:rPr>
-          <w:szCs w:val="24"/>
-        </w:rPr>
-        <w:t>pádem</w:t>
-      </w:r>
-      <w:proofErr w:type="gramEnd"/>
-      <w:r>
-        <w:rPr>
-          <w:szCs w:val="24"/>
-        </w:rPr>
-        <w:t xml:space="preserve"> </w:t>
+        <w:t xml:space="preserve"> a tím pádem </w:t>
       </w:r>
       <w:r>
         <w:rPr>
@@ -5425,7 +5767,7 @@
         <w:pStyle w:val="Nadpis2"/>
         <w:jc w:val="both"/>
       </w:pPr>
-      <w:bookmarkStart w:id="6" w:name="_Toc229952399"/>
+      <w:bookmarkStart w:id="6" w:name="_Toc230096677"/>
       <w:r>
         <w:lastRenderedPageBreak/>
         <w:t>1.2 UML</w:t>
@@ -5441,16 +5783,13 @@
         </w:rPr>
       </w:pPr>
       <w:r>
-        <w:t>Zde je UML diag</w:t>
-      </w:r>
-      <w:r>
-        <w:t>r</w:t>
-      </w:r>
-      <w:r>
-        <w:t>am kostry projektu.</w:t>
-      </w:r>
-      <w:r>
-        <w:t xml:space="preserve"> Některé malé entity a vztahy mohly být zanedbány z důvodu přehlednosti grafu.</w:t>
+        <w:t>UML projektu.</w:t>
+      </w:r>
+      <w:r>
+        <w:t xml:space="preserve"> Menší </w:t>
+      </w:r>
+      <w:r>
+        <w:t>entity a vztahy mohly být zanedbány z důvodu přehlednosti grafu.</w:t>
       </w:r>
       <w:r>
         <w:t xml:space="preserve"> Šipky: diamant</w:t>
@@ -5459,28 +5798,58 @@
         <w:t>ová</w:t>
       </w:r>
       <w:r>
-        <w:t xml:space="preserve"> je </w:t>
+        <w:t xml:space="preserve"> plná:</w:t>
+      </w:r>
+      <w:r>
+        <w:t xml:space="preserve"> </w:t>
       </w:r>
       <w:r>
         <w:t>„je zakomponovaná“</w:t>
       </w:r>
       <w:r>
-        <w:t xml:space="preserve">, plná </w:t>
+        <w:t xml:space="preserve">, </w:t>
+      </w:r>
+      <w:r>
+        <w:t xml:space="preserve">diamantová prázdná: „je agregovaná“, </w:t>
+      </w:r>
+      <w:r>
+        <w:t xml:space="preserve">plná </w:t>
       </w:r>
       <w:r>
         <w:t>šipka</w:t>
       </w:r>
       <w:r>
-        <w:t xml:space="preserve"> je </w:t>
+        <w:t>:</w:t>
+      </w:r>
+      <w:r>
+        <w:t xml:space="preserve"> </w:t>
       </w:r>
       <w:r>
         <w:t>„rozšiřuje“</w:t>
       </w:r>
       <w:r>
-        <w:t xml:space="preserve"> a přerušovaná je </w:t>
+        <w:t>,</w:t>
+      </w:r>
+      <w:r>
+        <w:t xml:space="preserve"> </w:t>
+      </w:r>
+      <w:r>
+        <w:t>hustě přerušovaná:</w:t>
+      </w:r>
+      <w:r>
+        <w:t xml:space="preserve"> </w:t>
       </w:r>
       <w:r>
         <w:t>„potřebuje vložit závislost“</w:t>
+      </w:r>
+      <w:r>
+        <w:t xml:space="preserve"> a řídce přerušovaná: „</w:t>
+      </w:r>
+      <w:r>
+        <w:t>vytváří alias</w:t>
+      </w:r>
+      <w:r>
+        <w:t>“</w:t>
       </w:r>
       <w:r>
         <w:t>.</w:t>
@@ -5496,7 +5865,7 @@
           <w:noProof/>
         </w:rPr>
         <w:drawing>
-          <wp:inline distT="0" distB="0" distL="0" distR="0" wp14:anchorId="585E016F" wp14:editId="15E25A05">
+          <wp:inline distT="0" distB="0" distL="0" distR="0" wp14:anchorId="585E016F" wp14:editId="3EC350C8">
             <wp:extent cx="5762625" cy="7267575"/>
             <wp:effectExtent l="0" t="0" r="9525" b="9525"/>
             <wp:docPr id="929894711" name="Obrázek 2"/>
@@ -5507,12 +5876,12 @@
               <a:graphicData uri="http://schemas.openxmlformats.org/drawingml/2006/picture">
                 <pic:pic xmlns:pic="http://schemas.openxmlformats.org/drawingml/2006/picture">
                   <pic:nvPicPr>
-                    <pic:cNvPr id="0" name="Picture 2"/>
+                    <pic:cNvPr id="929894711" name="Obrázek 2"/>
                     <pic:cNvPicPr>
                       <a:picLocks noChangeAspect="1" noChangeArrowheads="1"/>
                     </pic:cNvPicPr>
                   </pic:nvPicPr>
-                  <pic:blipFill rotWithShape="1">
+                  <pic:blipFill>
                     <a:blip r:embed="rId12" cstate="print">
                       <a:extLst>
                         <a:ext uri="{28A0092B-C50C-407E-A947-70E740481C1C}">
@@ -5520,7 +5889,7 @@
                         </a:ext>
                       </a:extLst>
                     </a:blip>
-                    <a:srcRect t="3130" b="5054"/>
+                    <a:srcRect t="4140" b="4140"/>
                     <a:stretch>
                       <a:fillRect/>
                     </a:stretch>
@@ -5609,7 +5978,7 @@
         <w:pStyle w:val="Nadpis2"/>
         <w:jc w:val="both"/>
       </w:pPr>
-      <w:bookmarkStart w:id="8" w:name="_Toc229952400"/>
+      <w:bookmarkStart w:id="8" w:name="_Toc230096678"/>
       <w:r>
         <w:lastRenderedPageBreak/>
         <w:t>1.3 Logika</w:t>
@@ -5620,7 +5989,7 @@
       <w:pPr>
         <w:pStyle w:val="Nadpis3"/>
       </w:pPr>
-      <w:bookmarkStart w:id="9" w:name="_Toc229952401"/>
+      <w:bookmarkStart w:id="9" w:name="_Toc230096679"/>
       <w:r>
         <w:t>1.3.1 Logika tenzoru</w:t>
       </w:r>
@@ -5869,14 +6238,12 @@
         </w:rPr>
         <w:t xml:space="preserve"> </w:t>
       </w:r>
-      <w:proofErr w:type="gramStart"/>
       <w:r>
         <w:rPr>
           <w:lang w:eastAsia="cs-CZ"/>
         </w:rPr>
         <w:t>menší</w:t>
       </w:r>
-      <w:proofErr w:type="gramEnd"/>
       <w:r>
         <w:rPr>
           <w:lang w:eastAsia="cs-CZ"/>
@@ -6043,21 +6410,7 @@
         <w:rPr>
           <w:lang w:eastAsia="cs-CZ"/>
         </w:rPr>
-        <w:t xml:space="preserve"> je počet dimenzí) stačí pouze přečíst náležící prvek z tohoto vypočítaného pole pro složitost </w:t>
-      </w:r>
-      <w:proofErr w:type="gramStart"/>
-      <w:r>
-        <w:rPr>
-          <w:lang w:eastAsia="cs-CZ"/>
-        </w:rPr>
-        <w:t>O(</w:t>
-      </w:r>
-      <w:proofErr w:type="gramEnd"/>
-      <w:r>
-        <w:rPr>
-          <w:lang w:eastAsia="cs-CZ"/>
-        </w:rPr>
-        <w:t>1).</w:t>
+        <w:t xml:space="preserve"> je počet dimenzí) stačí pouze přečíst náležící prvek z tohoto vypočítaného pole pro složitost O(1).</w:t>
       </w:r>
       <w:r>
         <w:rPr>
@@ -6654,14 +7007,7 @@
         <w:rPr>
           <w:lang w:eastAsia="cs-CZ"/>
         </w:rPr>
-        <w:t>2⁶</w:t>
-      </w:r>
-      <w:proofErr w:type="gramStart"/>
-      <w:r>
-        <w:rPr>
-          <w:lang w:eastAsia="cs-CZ"/>
-        </w:rPr>
-        <w:t>⁴</w:t>
+        <w:t>2⁶⁴</w:t>
       </w:r>
       <w:r>
         <w:rPr>
@@ -6687,7 +7033,6 @@
         </w:rPr>
         <w:t>1</w:t>
       </w:r>
-      <w:proofErr w:type="gramEnd"/>
       <w:r>
         <w:rPr>
           <w:lang w:eastAsia="cs-CZ"/>
@@ -6716,14 +7061,7 @@
         <w:rPr>
           <w:lang w:eastAsia="cs-CZ"/>
         </w:rPr>
-        <w:t xml:space="preserve"> Délka přístupu na jeden prvek tak realisticky (vůči limitům jazyka C++ a </w:t>
-      </w:r>
-      <w:proofErr w:type="gramStart"/>
-      <w:r>
-        <w:rPr>
-          <w:lang w:eastAsia="cs-CZ"/>
-        </w:rPr>
-        <w:t>64</w:t>
+        <w:t xml:space="preserve"> Délka přístupu na jeden prvek tak realisticky (vůči limitům jazyka C++ a 64</w:t>
       </w:r>
       <w:r>
         <w:rPr>
@@ -6735,14 +7073,7 @@
         <w:rPr>
           <w:lang w:eastAsia="cs-CZ"/>
         </w:rPr>
-        <w:t>bitové</w:t>
-      </w:r>
-      <w:proofErr w:type="gramEnd"/>
-      <w:r>
-        <w:rPr>
-          <w:lang w:eastAsia="cs-CZ"/>
-        </w:rPr>
-        <w:t xml:space="preserve"> architektury) nepřekročí 64 výpočtů a tím pádem se dá z tohoto pohledu považovat za konstantní.</w:t>
+        <w:t>bitové architektury) nepřekročí 64 výpočtů a tím pádem se dá z tohoto pohledu považovat za konstantní.</w:t>
       </w:r>
       <w:r>
         <w:rPr>
@@ -7359,15 +7690,7 @@
         <w:t xml:space="preserve"> Z algoritmické efektivity je tato metoda oproti běžnému výpočtu souřadnice výhodná.</w:t>
       </w:r>
       <w:r>
-        <w:t xml:space="preserve"> V nejhorším případě přetočení z posledního prvku na první je její komplexita O(len(D)) a v nejlepším případě inkrementace nejméně signifikantní souřadnice bez přetečení </w:t>
-      </w:r>
-      <w:proofErr w:type="gramStart"/>
-      <w:r>
-        <w:t>O(</w:t>
-      </w:r>
-      <w:proofErr w:type="gramEnd"/>
-      <w:r>
-        <w:t xml:space="preserve">1). </w:t>
+        <w:t xml:space="preserve"> V nejhorším případě přetočení z posledního prvku na první je její komplexita O(len(D)) a v nejlepším případě inkrementace nejméně signifikantní souřadnice bez přetečení O(1). </w:t>
       </w:r>
       <w:r>
         <w:t>Ovšem je třeba si uvědomit, že při rovnoměrných velikostech dimenzí bude ten lepší případ daleko více převládat nad tím nejhorším</w:t>
@@ -7385,13 +7708,8 @@
         <w:t>,</w:t>
       </w:r>
       <w:r>
-        <w:t xml:space="preserve"> že pravděpodobnost změny první souřadnice (nejméně signifikantní) je vždy 1. U té další to už ale je jenom 1</w:t>
-      </w:r>
-      <w:proofErr w:type="gramStart"/>
-      <w:r>
-        <w:t>/(</w:t>
-      </w:r>
-      <w:proofErr w:type="gramEnd"/>
+        <w:t xml:space="preserve"> že pravděpodobnost změny první souřadnice (nejméně signifikantní) je vždy 1. U té další to už ale je jenom 1/(</w:t>
+      </w:r>
       <w:r>
         <w:t>Kumulativní součin předešlých velikostí dimenzí</w:t>
       </w:r>
@@ -7420,15 +7738,7 @@
         <w:t>složitost</w:t>
       </w:r>
       <w:r>
-        <w:t xml:space="preserve"> této metody </w:t>
-      </w:r>
-      <w:proofErr w:type="gramStart"/>
-      <w:r>
-        <w:t>O(</w:t>
-      </w:r>
-      <w:proofErr w:type="gramEnd"/>
-      <w:r>
-        <w:t>1).</w:t>
+        <w:t xml:space="preserve"> této metody O(1).</w:t>
       </w:r>
     </w:p>
     <w:p>
@@ -8732,7 +9042,6 @@
       <w:r>
         <w:t xml:space="preserve"> </w:t>
       </w:r>
-      <w:proofErr w:type="gramStart"/>
       <w:r>
         <w:rPr>
           <w:i/>
@@ -8750,7 +9059,6 @@
         </w:rPr>
         <w:t>i</w:t>
       </w:r>
-      <w:proofErr w:type="gramEnd"/>
       <w:r>
         <w:rPr>
           <w:lang w:eastAsia="cs-CZ"/>
@@ -9166,7 +9474,7 @@
       <w:pPr>
         <w:pStyle w:val="Nadpis3"/>
       </w:pPr>
-      <w:bookmarkStart w:id="10" w:name="_Toc229952402"/>
+      <w:bookmarkStart w:id="10" w:name="_Toc230096680"/>
       <w:r>
         <w:t>1.</w:t>
       </w:r>
@@ -9196,15 +9504,7 @@
         <w:t xml:space="preserve"> Tenzor ho využívá pro ukládání dat i metadat.</w:t>
       </w:r>
       <w:r>
-        <w:t xml:space="preserve"> Veřejným rozhraním napodobuje rozhraní </w:t>
-      </w:r>
-      <w:proofErr w:type="gramStart"/>
-      <w:r>
-        <w:t>std::</w:t>
-      </w:r>
-      <w:proofErr w:type="gramEnd"/>
-      <w:r>
-        <w:t>vector.</w:t>
+        <w:t xml:space="preserve"> Veřejným rozhraním napodobuje rozhraní std::vector.</w:t>
       </w:r>
       <w:r>
         <w:t xml:space="preserve"> Uvnitř si udržuje ukazatel na začátek pole, ukazatel na konec pole a ukazatel na konec kapacity pole.</w:t>
@@ -9231,15 +9531,7 @@
         <w:t>Vznikl z několika důvodů.</w:t>
       </w:r>
       <w:r>
-        <w:t xml:space="preserve"> Prvním z nich byla nevhodná implementace </w:t>
-      </w:r>
-      <w:proofErr w:type="gramStart"/>
-      <w:r>
-        <w:t>std::</w:t>
-      </w:r>
-      <w:proofErr w:type="gramEnd"/>
-      <w:r>
-        <w:t xml:space="preserve">vector pro typ </w:t>
+        <w:t xml:space="preserve"> Prvním z nich byla nevhodná implementace std::vector pro typ </w:t>
       </w:r>
       <w:r>
         <w:rPr>
@@ -9270,21 +9562,11 @@
         <w:t xml:space="preserve"> a ještě vážnějším problémem byla nemožnost vložení alokátoru do vektoru jako objektu.</w:t>
       </w:r>
       <w:r>
-        <w:t xml:space="preserve"> Alokátor pro </w:t>
-      </w:r>
-      <w:proofErr w:type="gramStart"/>
-      <w:r>
-        <w:t>std::</w:t>
-      </w:r>
-      <w:proofErr w:type="gramEnd"/>
-      <w:r>
-        <w:t xml:space="preserve">vector se předává jako typový </w:t>
-      </w:r>
-      <w:proofErr w:type="gramStart"/>
+        <w:t xml:space="preserve"> Alokátor pro std::vector se předává jako typový </w:t>
+      </w:r>
       <w:r>
         <w:t>parametr</w:t>
       </w:r>
-      <w:proofErr w:type="gramEnd"/>
       <w:r>
         <w:t xml:space="preserve"> a tudíž nemůže uchovávat vnitřní stav, který by se z venku nastavoval.</w:t>
       </w:r>
@@ -9440,15 +9722,7 @@
         <w:jc w:val="both"/>
       </w:pPr>
       <w:r>
-        <w:t xml:space="preserve">Podobně jako u </w:t>
-      </w:r>
-      <w:proofErr w:type="gramStart"/>
-      <w:r>
-        <w:t>std::</w:t>
-      </w:r>
-      <w:proofErr w:type="gramEnd"/>
-      <w:r>
-        <w:t>vector je možné místo okamžité změny velikosti paměť pouze rezervovat – tedy alokovat předem. Změna velikosti samotná je samozřejmostí.</w:t>
+        <w:t>Podobně jako u std::vector je možné místo okamžité změny velikosti paměť pouze rezervovat – tedy alokovat předem. Změna velikosti samotná je samozřejmostí.</w:t>
       </w:r>
       <w:r>
         <w:t xml:space="preserve"> Existují také metody na vložení a odebrání prvků na konci.</w:t>
@@ -9520,13 +9794,8 @@
       <w:r>
         <w:t xml:space="preserve"> </w:t>
       </w:r>
-      <w:proofErr w:type="gramStart"/>
-      <w:r>
-        <w:t>O(</w:t>
-      </w:r>
-      <w:proofErr w:type="gramEnd"/>
-      <w:r>
-        <w:t>1)</w:t>
+      <w:r>
+        <w:t>O(1)</w:t>
       </w:r>
       <w:r>
         <w:t>.</w:t>
@@ -9541,15 +9810,7 @@
         <w:jc w:val="both"/>
       </w:pPr>
       <w:r>
-        <w:t xml:space="preserve">Lineární kontejner nabízí také metody na vložení a odebrání prvků z libovolné pozice. Ovšem stejně jako u </w:t>
-      </w:r>
-      <w:proofErr w:type="gramStart"/>
-      <w:r>
-        <w:t>std::</w:t>
-      </w:r>
-      <w:proofErr w:type="gramEnd"/>
-      <w:r>
-        <w:t>vector je tato operace často drahá, jelikož často vede k nutnosti posunou všechny následující prvky.</w:t>
+        <w:t>Lineární kontejner nabízí také metody na vložení a odebrání prvků z libovolné pozice. Ovšem stejně jako u std::vector je tato operace často drahá, jelikož často vede k nutnosti posunou všechny následující prvky.</w:t>
       </w:r>
       <w:r>
         <w:t xml:space="preserve"> Tedy je složitosti O(len(L)), kde len(L) je délka lineárního kontejneru.</w:t>
@@ -9637,7 +9898,7 @@
       <w:pPr>
         <w:pStyle w:val="Nadpis3"/>
       </w:pPr>
-      <w:bookmarkStart w:id="11" w:name="_Toc229952403"/>
+      <w:bookmarkStart w:id="11" w:name="_Toc230096681"/>
       <w:r>
         <w:lastRenderedPageBreak/>
         <w:t>1.3.</w:t>
@@ -9734,15 +9995,7 @@
         <w:t>indexu</w:t>
       </w:r>
       <w:r>
-        <w:t xml:space="preserve">, což je vlastně méně efektivní, jelikož se z amortizované složitosti </w:t>
-      </w:r>
-      <w:proofErr w:type="gramStart"/>
-      <w:r>
-        <w:t>O(</w:t>
-      </w:r>
-      <w:proofErr w:type="gramEnd"/>
-      <w:r>
-        <w:t>1) přesouváme na O(len(D)), zajistí to ale izolaci jedné položky a tím pádem umožní paralelizaci.</w:t>
+        <w:t>, což je vlastně méně efektivní, jelikož se z amortizované složitosti O(1) přesouváme na O(len(D)), zajistí to ale izolaci jedné položky a tím pádem umožní paralelizaci.</w:t>
       </w:r>
       <w:r>
         <w:t xml:space="preserve"> Jelikož se nepředpokládá, že by len(D) bylo nějaké veliké číslo, tak to příliš nevadí, jelikož tuto ztrátu se zvyšujícím počtem prvků rychle dohání zrychlení díky paralelizaci.</w:t>
@@ -9752,7 +10005,7 @@
       <w:pPr>
         <w:pStyle w:val="Nadpis3"/>
       </w:pPr>
-      <w:bookmarkStart w:id="12" w:name="_Toc229952404"/>
+      <w:bookmarkStart w:id="12" w:name="_Toc230096682"/>
       <w:r>
         <w:t>1.3.</w:t>
       </w:r>
@@ -9923,13 +10176,150 @@
     </w:p>
     <w:p>
       <w:pPr>
+        <w:pStyle w:val="Nadpis3"/>
+      </w:pPr>
+      <w:bookmarkStart w:id="13" w:name="_Toc230096683"/>
+      <w:r>
+        <w:t>1.3.6 Logika paměťového backendu</w:t>
+      </w:r>
+      <w:bookmarkEnd w:id="13"/>
+    </w:p>
+    <w:p>
+      <w:pPr>
+        <w:spacing w:line="360" w:lineRule="auto"/>
+        <w:jc w:val="both"/>
+      </w:pPr>
+      <w:r>
+        <w:t xml:space="preserve">Paměťový backend je </w:t>
+      </w:r>
+      <w:r>
+        <w:t>třída,</w:t>
+      </w:r>
+      <w:r>
+        <w:t xml:space="preserve"> </w:t>
+      </w:r>
+      <w:r>
+        <w:t>která</w:t>
+      </w:r>
+      <w:r>
+        <w:t xml:space="preserve"> řeší alokaci pamě</w:t>
+      </w:r>
+      <w:r>
+        <w:t>ti</w:t>
+      </w:r>
+      <w:r>
+        <w:t xml:space="preserve"> a její správu v oblasti konstrukce a destrukce</w:t>
+      </w:r>
+      <w:r>
+        <w:t>.</w:t>
+      </w:r>
+      <w:r>
+        <w:t xml:space="preserve"> Motivací k jejímu vytvoření byla potřeba zachovat nezávislost základních komponent</w:t>
+      </w:r>
+      <w:r>
+        <w:t xml:space="preserve"> na knihovnách.</w:t>
+      </w:r>
+      <w:r>
+        <w:t xml:space="preserve"> </w:t>
+      </w:r>
+      <w:r>
+        <w:t xml:space="preserve">Funguje na principu vložení závislosti. </w:t>
+      </w:r>
+      <w:r>
+        <w:t xml:space="preserve">Užívá ji například lineární kontejner. </w:t>
+      </w:r>
+      <w:r>
+        <w:t>Do</w:t>
+      </w:r>
+      <w:r>
+        <w:t xml:space="preserve"> lineárního kontejneru lze vložit verze</w:t>
+      </w:r>
+      <w:r>
+        <w:t xml:space="preserve"> backendu</w:t>
+      </w:r>
+      <w:r>
+        <w:t xml:space="preserve"> pro alokaci </w:t>
+      </w:r>
+      <w:r>
+        <w:t>hostitelské</w:t>
+      </w:r>
+      <w:r>
+        <w:t xml:space="preserve"> paměti nebo verze pro alokaci USM paměti. </w:t>
+      </w:r>
+      <w:r>
+        <w:t>Díky tomu může uživatel používat komponenty jako tenzor a lineární kontejner i bez instalace knihoven na práci s grafickou kartou.</w:t>
+      </w:r>
+      <w:r>
+        <w:t xml:space="preserve"> </w:t>
+      </w:r>
+    </w:p>
+    <w:p>
+      <w:pPr>
+        <w:pStyle w:val="Nadpis3"/>
+      </w:pPr>
+      <w:bookmarkStart w:id="14" w:name="_Toc230096684"/>
+      <w:r>
+        <w:t>1.3.7 Logika poolingu</w:t>
+      </w:r>
+      <w:bookmarkEnd w:id="14"/>
+    </w:p>
+    <w:p>
+      <w:pPr>
+        <w:spacing w:line="360" w:lineRule="auto"/>
+        <w:jc w:val="both"/>
+      </w:pPr>
+      <w:r>
+        <w:t xml:space="preserve">Pooling se využívá při práci s USM </w:t>
+      </w:r>
+      <w:r>
+        <w:t>pamětí.</w:t>
+      </w:r>
+      <w:r>
+        <w:t xml:space="preserve"> Každá alokace na zařízení je velmi drahá.</w:t>
+      </w:r>
+      <w:r>
+        <w:t xml:space="preserve"> Proto při dealokaci paměti uživatelem tento pooling, místo okamžitého uvolnění, tuto paměť zanechá a uloží si její informace.</w:t>
+      </w:r>
+      <w:r>
+        <w:t xml:space="preserve"> Pokud uživatel požaduje novou paměť, tak se pooling nejdřív podívá, jestli nemá již uloženou paměť splňující požadavky.</w:t>
+      </w:r>
+      <w:r>
+        <w:t xml:space="preserve"> Pokud takovou paměť má, tak ji dá uživateli místo přímo alokované paměti.</w:t>
+      </w:r>
+      <w:r>
+        <w:t xml:space="preserve"> Pokud ovšem takovou paměť nenajde, tak se alokuje nová USM paměť.</w:t>
+      </w:r>
+      <w:r>
+        <w:t xml:space="preserve"> Toto je velice výhodné také proto, že spousta operací provádí kopie paměti či zápisy do paměti stejných velikostí.</w:t>
+      </w:r>
+      <w:r>
+        <w:t xml:space="preserve"> To vede k velikému poměru mezi takzvanými zásahy poolingu (kdy se vyhovující paměť najde) a</w:t>
+      </w:r>
+      <w:r>
+        <w:t xml:space="preserve"> méně častými</w:t>
+      </w:r>
+      <w:r>
+        <w:t xml:space="preserve"> </w:t>
+      </w:r>
+      <w:r>
+        <w:t>průšvihy</w:t>
+      </w:r>
+      <w:r>
+        <w:t xml:space="preserve"> (kdy je třeba nová alokace).</w:t>
+      </w:r>
+      <w:r>
+        <w:t xml:space="preserve"> Jelikož jsou vlastnosti pamětí zahashovány, tak je při použití správného algoritmu vyhledání v kolekci komplexity O(1).</w:t>
+      </w:r>
+    </w:p>
+    <w:p>
+      <w:pPr>
         <w:pStyle w:val="Nadpis1"/>
         <w:jc w:val="both"/>
       </w:pPr>
       <w:r>
         <w:br w:type="page"/>
       </w:r>
-      <w:bookmarkStart w:id="13" w:name="_Toc229952405"/>
+      <w:bookmarkStart w:id="15" w:name="_Toc230096685"/>
       <w:r>
         <w:lastRenderedPageBreak/>
         <w:t>2</w:t>
@@ -9940,7 +10330,7 @@
       <w:r>
         <w:t>IMPLEMENTACE</w:t>
       </w:r>
-      <w:bookmarkEnd w:id="13"/>
+      <w:bookmarkEnd w:id="15"/>
       <w:r>
         <w:t xml:space="preserve"> </w:t>
       </w:r>
@@ -9998,11 +10388,11 @@
         <w:pStyle w:val="Nadpis2"/>
         <w:jc w:val="both"/>
       </w:pPr>
-      <w:bookmarkStart w:id="14" w:name="_Toc229952406"/>
+      <w:bookmarkStart w:id="16" w:name="_Toc230096686"/>
       <w:r>
         <w:t>2.1 Použité nástroje</w:t>
       </w:r>
-      <w:bookmarkEnd w:id="14"/>
+      <w:bookmarkEnd w:id="16"/>
     </w:p>
     <w:p>
       <w:pPr>
@@ -10060,11 +10450,11 @@
         <w:pStyle w:val="Nadpis3"/>
         <w:jc w:val="both"/>
       </w:pPr>
-      <w:bookmarkStart w:id="15" w:name="_Toc229952407"/>
+      <w:bookmarkStart w:id="17" w:name="_Toc230096687"/>
       <w:r>
         <w:t>2.1.1 AdaptiveCpp</w:t>
       </w:r>
-      <w:bookmarkEnd w:id="15"/>
+      <w:bookmarkEnd w:id="17"/>
     </w:p>
     <w:p>
       <w:pPr>
@@ -10244,15 +10634,7 @@
         <w:t>,</w:t>
       </w:r>
       <w:r>
-        <w:t xml:space="preserve"> a proto je často lepší mít paměť na zařízení a jenom v případě potřeby ji metodou </w:t>
-      </w:r>
-      <w:proofErr w:type="gramStart"/>
-      <w:r>
-        <w:t>sycl::queue::</w:t>
-      </w:r>
-      <w:proofErr w:type="gramEnd"/>
-      <w:r>
-        <w:t>memcpy zkopírovat na ho</w:t>
+        <w:t xml:space="preserve"> a proto je často lepší mít paměť na zařízení a jenom v případě potřeby ji metodou sycl::queue::memcpy zkopírovat na ho</w:t>
       </w:r>
       <w:r>
         <w:t>stitele.</w:t>
@@ -10332,11 +10714,11 @@
         <w:pStyle w:val="Nadpis3"/>
         <w:jc w:val="both"/>
       </w:pPr>
-      <w:bookmarkStart w:id="16" w:name="_Toc229952408"/>
+      <w:bookmarkStart w:id="18" w:name="_Toc230096688"/>
       <w:r>
         <w:t>2.1.2 Google test</w:t>
       </w:r>
-      <w:bookmarkEnd w:id="16"/>
+      <w:bookmarkEnd w:id="18"/>
     </w:p>
     <w:p>
       <w:pPr>
@@ -10379,7 +10761,7 @@
         <w:pStyle w:val="Nadpis2"/>
         <w:jc w:val="both"/>
       </w:pPr>
-      <w:bookmarkStart w:id="17" w:name="_Toc229952409"/>
+      <w:bookmarkStart w:id="19" w:name="_Toc230096689"/>
       <w:r>
         <w:t>2.</w:t>
       </w:r>
@@ -10389,7 +10771,7 @@
       <w:r>
         <w:t xml:space="preserve"> Komponenty</w:t>
       </w:r>
-      <w:bookmarkEnd w:id="17"/>
+      <w:bookmarkEnd w:id="19"/>
     </w:p>
     <w:p>
       <w:pPr>
@@ -10405,11 +10787,11 @@
         <w:pStyle w:val="Nadpis3"/>
         <w:jc w:val="both"/>
       </w:pPr>
-      <w:bookmarkStart w:id="18" w:name="_Toc229952410"/>
+      <w:bookmarkStart w:id="20" w:name="_Toc230096690"/>
       <w:r>
         <w:t>2.2.1 Koncepty</w:t>
       </w:r>
-      <w:bookmarkEnd w:id="18"/>
+      <w:bookmarkEnd w:id="20"/>
     </w:p>
     <w:p>
       <w:pPr>
@@ -10522,7 +10904,7 @@
         <w:pStyle w:val="Nadpis3"/>
         <w:jc w:val="both"/>
       </w:pPr>
-      <w:bookmarkStart w:id="19" w:name="_Toc229952411"/>
+      <w:bookmarkStart w:id="21" w:name="_Toc230096691"/>
       <w:r>
         <w:t>2.2.</w:t>
       </w:r>
@@ -10532,7 +10914,7 @@
       <w:r>
         <w:t xml:space="preserve"> Paměťový backend</w:t>
       </w:r>
-      <w:bookmarkEnd w:id="19"/>
+      <w:bookmarkEnd w:id="21"/>
     </w:p>
     <w:p>
       <w:pPr>
@@ -10604,87 +10986,77 @@
         <w:t>uje</w:t>
       </w:r>
       <w:r>
-        <w:t xml:space="preserve"> ke své operaci ukazatel na </w:t>
-      </w:r>
-      <w:proofErr w:type="gramStart"/>
+        <w:t xml:space="preserve"> ke své operaci ukazatel na sycl::queue.</w:t>
+      </w:r>
+      <w:r>
+        <w:t xml:space="preserve"> </w:t>
+      </w:r>
+      <w:r>
+        <w:t>Tento backend je hlavní podporou ve správě paměti USM.</w:t>
+      </w:r>
+      <w:r>
+        <w:t xml:space="preserve"> Umí alokovat paměť i na GPU a často na GPU spouští i kód.</w:t>
+      </w:r>
+      <w:r>
+        <w:t xml:space="preserve"> Výhodou je možnost některé úkony, jako například hromadnou konstrukci a destrukci prvků</w:t>
+      </w:r>
+      <w:r>
+        <w:t>,</w:t>
+      </w:r>
+      <w:r>
+        <w:t xml:space="preserve"> paralelizovat.</w:t>
+      </w:r>
+      <w:r>
+        <w:t xml:space="preserve"> </w:t>
+      </w:r>
+      <w:r>
+        <w:t xml:space="preserve">Bylo možno paralelizovat třeba i porovnání rovnosti </w:t>
+      </w:r>
+      <w:r>
+        <w:t>prvků,</w:t>
+      </w:r>
+      <w:r>
+        <w:t xml:space="preserve"> a to díky nabízeným atomickým operacím</w:t>
+      </w:r>
+      <w:r>
+        <w:t>,</w:t>
+      </w:r>
+      <w:r>
+        <w:t xml:space="preserve"> </w:t>
+      </w:r>
+      <w:r>
+        <w:t>které</w:t>
+      </w:r>
+      <w:r>
+        <w:t xml:space="preserve"> SYCL nabízí</w:t>
+      </w:r>
+      <w:r>
+        <w:t>.</w:t>
+      </w:r>
+      <w:r>
+        <w:t xml:space="preserve"> Tak bylo možné mezi sebou prvky porovnat a zjištěné nerovnosti bezpečně a synchronizovaně zapsat</w:t>
+      </w:r>
+      <w:r>
+        <w:t xml:space="preserve"> tak, že se dalo poté zjistit, zda existuje alespoň jedna nerovná dvojice prvků</w:t>
+      </w:r>
+      <w:r>
+        <w:t>.</w:t>
+      </w:r>
+      <w:r>
+        <w:t xml:space="preserve"> </w:t>
+      </w:r>
+      <w:r>
+        <w:t>Tento backend se může zdát méně zabezpečený, například proti kopiím netriviálně kopírovatelných objekt</w:t>
+      </w:r>
+      <w:r>
+        <w:t>ů</w:t>
+      </w:r>
+      <w:r>
+        <w:t xml:space="preserve"> pomocí metod jako </w:t>
+      </w:r>
       <w:r>
         <w:t>sycl::</w:t>
       </w:r>
-      <w:proofErr w:type="gramEnd"/>
-      <w:r>
-        <w:t>queue.</w:t>
-      </w:r>
-      <w:r>
-        <w:t xml:space="preserve"> </w:t>
-      </w:r>
-      <w:r>
-        <w:t>Tento backend je hlavní podporou ve správě paměti USM.</w:t>
-      </w:r>
-      <w:r>
-        <w:t xml:space="preserve"> Umí alokovat paměť i na GPU a často na GPU spouští i kód.</w:t>
-      </w:r>
-      <w:r>
-        <w:t xml:space="preserve"> Výhodou je možnost některé úkony, jako například hromadnou konstrukci a destrukci prvků</w:t>
-      </w:r>
-      <w:r>
-        <w:t>,</w:t>
-      </w:r>
-      <w:r>
-        <w:t xml:space="preserve"> paralelizovat.</w:t>
-      </w:r>
-      <w:r>
-        <w:t xml:space="preserve"> </w:t>
-      </w:r>
-      <w:r>
-        <w:t xml:space="preserve">Bylo možno paralelizovat třeba i porovnání rovnosti </w:t>
-      </w:r>
-      <w:r>
-        <w:t>prvků,</w:t>
-      </w:r>
-      <w:r>
-        <w:t xml:space="preserve"> a to díky nabízeným atomickým operacím</w:t>
-      </w:r>
-      <w:r>
-        <w:t>,</w:t>
-      </w:r>
-      <w:r>
-        <w:t xml:space="preserve"> </w:t>
-      </w:r>
-      <w:r>
-        <w:t>které</w:t>
-      </w:r>
-      <w:r>
-        <w:t xml:space="preserve"> SYCL nabízí</w:t>
-      </w:r>
-      <w:r>
-        <w:t>.</w:t>
-      </w:r>
-      <w:r>
-        <w:t xml:space="preserve"> Tak bylo možné mezi sebou prvky porovnat a zjištěné nerovnosti bezpečně a synchronizovaně zapsat</w:t>
-      </w:r>
-      <w:r>
-        <w:t xml:space="preserve"> tak, že se dalo poté zjistit, zda existuje alespoň jedna nerovná dvojice prvků</w:t>
-      </w:r>
-      <w:r>
-        <w:t>.</w:t>
-      </w:r>
-      <w:r>
-        <w:t xml:space="preserve"> </w:t>
-      </w:r>
-      <w:r>
-        <w:t>Tento backend se může zdát méně zabezpečený, například proti kopiím netriviálně kopírovatelných objekt</w:t>
-      </w:r>
-      <w:r>
-        <w:t>ů</w:t>
-      </w:r>
-      <w:r>
-        <w:t xml:space="preserve"> pomocí metod jako </w:t>
-      </w:r>
-      <w:proofErr w:type="gramStart"/>
-      <w:r>
-        <w:t>sycl::</w:t>
-      </w:r>
-      <w:proofErr w:type="gramEnd"/>
       <w:r>
         <w:t xml:space="preserve">memcpy, ale to není hrozba, jelikož standard SYCL stejně takovéto objekty alokovat </w:t>
       </w:r>
@@ -10818,7 +11190,7 @@
           <w:lang w:eastAsia="cs-CZ"/>
         </w:rPr>
       </w:pPr>
-      <w:bookmarkStart w:id="20" w:name="_Toc229952412"/>
+      <w:bookmarkStart w:id="22" w:name="_Toc230096692"/>
       <w:r>
         <w:lastRenderedPageBreak/>
         <w:t>2.</w:t>
@@ -10846,7 +11218,7 @@
         </w:rPr>
         <w:t>Lineární kontejner</w:t>
       </w:r>
-      <w:bookmarkEnd w:id="20"/>
+      <w:bookmarkEnd w:id="22"/>
     </w:p>
     <w:p>
       <w:pPr>
@@ -10890,21 +11262,7 @@
         <w:rPr>
           <w:lang w:eastAsia="cs-CZ"/>
         </w:rPr>
-        <w:t xml:space="preserve">Motivace k jeho implementaci je potřeba kontejneru s rozhraním napodobujícím </w:t>
-      </w:r>
-      <w:proofErr w:type="gramStart"/>
-      <w:r>
-        <w:rPr>
-          <w:lang w:eastAsia="cs-CZ"/>
-        </w:rPr>
-        <w:t>std::</w:t>
-      </w:r>
-      <w:proofErr w:type="gramEnd"/>
-      <w:r>
-        <w:rPr>
-          <w:lang w:eastAsia="cs-CZ"/>
-        </w:rPr>
-        <w:t xml:space="preserve">vector, ale </w:t>
+        <w:t xml:space="preserve">Motivace k jeho implementaci je potřeba kontejneru s rozhraním napodobujícím std::vector, ale </w:t>
       </w:r>
       <w:r>
         <w:rPr>
@@ -10916,21 +11274,7 @@
         <w:rPr>
           <w:lang w:eastAsia="cs-CZ"/>
         </w:rPr>
-        <w:t>, jelikož existuje potřeba pro speciální alokaci paměti na různých zařízeních (například GPU), kterou ani vlastní alokátor použitý s </w:t>
-      </w:r>
-      <w:proofErr w:type="gramStart"/>
-      <w:r>
-        <w:rPr>
-          <w:lang w:eastAsia="cs-CZ"/>
-        </w:rPr>
-        <w:t>std::</w:t>
-      </w:r>
-      <w:proofErr w:type="gramEnd"/>
-      <w:r>
-        <w:rPr>
-          <w:lang w:eastAsia="cs-CZ"/>
-        </w:rPr>
-        <w:t>vector nemůže pokrýt.</w:t>
+        <w:t>, jelikož existuje potřeba pro speciální alokaci paměti na různých zařízeních (například GPU), kterou ani vlastní alokátor použitý s std::vector nemůže pokrýt.</w:t>
       </w:r>
     </w:p>
     <w:p>
@@ -11046,19 +11390,11 @@
         </w:rPr>
         <w:t xml:space="preserve">Pro kopírování, porovnávání či konstrukci a destrukci jsou v případě triviálně manipulovatelných typů (kontrolováno například pomocí </w:t>
       </w:r>
-      <w:proofErr w:type="gramStart"/>
-      <w:r>
-        <w:rPr>
-          <w:lang w:eastAsia="cs-CZ"/>
-        </w:rPr>
-        <w:t>std::</w:t>
-      </w:r>
-      <w:proofErr w:type="gramEnd"/>
-      <w:r>
-        <w:rPr>
-          <w:lang w:eastAsia="cs-CZ"/>
-        </w:rPr>
-        <w:t>is_trivially_copyable_v&lt;T&gt;</w:t>
+      <w:r>
+        <w:rPr>
+          <w:lang w:eastAsia="cs-CZ"/>
+        </w:rPr>
+        <w:t>std::is_trivially_copyable_v&lt;T&gt;</w:t>
       </w:r>
       <w:r>
         <w:rPr>
@@ -11076,35 +11412,7 @@
         <w:rPr>
           <w:lang w:eastAsia="cs-CZ"/>
         </w:rPr>
-        <w:t xml:space="preserve"> funkce standartní knihovny jako například </w:t>
-      </w:r>
-      <w:proofErr w:type="gramStart"/>
-      <w:r>
-        <w:rPr>
-          <w:lang w:eastAsia="cs-CZ"/>
-        </w:rPr>
-        <w:t>std::</w:t>
-      </w:r>
-      <w:proofErr w:type="gramEnd"/>
-      <w:r>
-        <w:rPr>
-          <w:lang w:eastAsia="cs-CZ"/>
-        </w:rPr>
-        <w:t xml:space="preserve">memcpy či </w:t>
-      </w:r>
-      <w:proofErr w:type="gramStart"/>
-      <w:r>
-        <w:rPr>
-          <w:lang w:eastAsia="cs-CZ"/>
-        </w:rPr>
-        <w:t>std::</w:t>
-      </w:r>
-      <w:proofErr w:type="gramEnd"/>
-      <w:r>
-        <w:rPr>
-          <w:lang w:eastAsia="cs-CZ"/>
-        </w:rPr>
-        <w:t>memcmp a podobně.</w:t>
+        <w:t xml:space="preserve"> funkce standartní knihovny jako například std::memcpy či std::memcmp a podobně.</w:t>
       </w:r>
     </w:p>
     <w:p>
@@ -11119,21 +11427,7 @@
         <w:rPr>
           <w:lang w:eastAsia="cs-CZ"/>
         </w:rPr>
-        <w:t xml:space="preserve">Z venkovního hlediska se rozhraní této třídy velmi podobá </w:t>
-      </w:r>
-      <w:proofErr w:type="gramStart"/>
-      <w:r>
-        <w:rPr>
-          <w:lang w:eastAsia="cs-CZ"/>
-        </w:rPr>
-        <w:t>std::</w:t>
-      </w:r>
-      <w:proofErr w:type="gramEnd"/>
-      <w:r>
-        <w:rPr>
-          <w:lang w:eastAsia="cs-CZ"/>
-        </w:rPr>
-        <w:t>vector ze standartní knihovny.</w:t>
+        <w:t>Z venkovního hlediska se rozhraní této třídy velmi podobá std::vector ze standartní knihovny.</w:t>
       </w:r>
       <w:r>
         <w:rPr>
@@ -11187,21 +11481,7 @@
         <w:rPr>
           <w:lang w:eastAsia="cs-CZ"/>
         </w:rPr>
-        <w:t xml:space="preserve"> metody </w:t>
-      </w:r>
-      <w:proofErr w:type="gramStart"/>
-      <w:r>
-        <w:rPr>
-          <w:lang w:eastAsia="cs-CZ"/>
-        </w:rPr>
-        <w:t>data(</w:t>
-      </w:r>
-      <w:proofErr w:type="gramEnd"/>
-      <w:r>
-        <w:rPr>
-          <w:lang w:eastAsia="cs-CZ"/>
-        </w:rPr>
-        <w:t xml:space="preserve">)) </w:t>
+        <w:t xml:space="preserve"> metody data()) </w:t>
       </w:r>
       <w:r>
         <w:rPr>
@@ -11215,19 +11495,11 @@
         </w:rPr>
         <w:t>použít přetížení indexovacího operátoru ([]) pro přístup na jednotlivé prvky (v </w:t>
       </w:r>
-      <w:proofErr w:type="gramStart"/>
-      <w:r>
-        <w:rPr>
-          <w:lang w:eastAsia="cs-CZ"/>
-        </w:rPr>
-        <w:t>O(</w:t>
-      </w:r>
-      <w:proofErr w:type="gramEnd"/>
-      <w:r>
-        <w:rPr>
-          <w:lang w:eastAsia="cs-CZ"/>
-        </w:rPr>
-        <w:t>1)</w:t>
+      <w:r>
+        <w:rPr>
+          <w:lang w:eastAsia="cs-CZ"/>
+        </w:rPr>
+        <w:t>O(1)</w:t>
       </w:r>
       <w:r>
         <w:rPr>
@@ -11257,21 +11529,7 @@
         <w:rPr>
           <w:lang w:eastAsia="cs-CZ"/>
         </w:rPr>
-        <w:t xml:space="preserve">, ze stejného rozhraní u </w:t>
-      </w:r>
-      <w:proofErr w:type="gramStart"/>
-      <w:r>
-        <w:rPr>
-          <w:lang w:eastAsia="cs-CZ"/>
-        </w:rPr>
-        <w:t>std::</w:t>
-      </w:r>
-      <w:proofErr w:type="gramEnd"/>
-      <w:r>
-        <w:rPr>
-          <w:lang w:eastAsia="cs-CZ"/>
-        </w:rPr>
-        <w:t>vector dostat iterátory jak dopředu</w:t>
+        <w:t>, ze stejného rozhraní u std::vector dostat iterátory jak dopředu</w:t>
       </w:r>
       <w:r>
         <w:rPr>
@@ -11360,7 +11618,7 @@
           <w:lang w:eastAsia="cs-CZ"/>
         </w:rPr>
       </w:pPr>
-      <w:bookmarkStart w:id="21" w:name="_Toc229952413"/>
+      <w:bookmarkStart w:id="23" w:name="_Toc230096693"/>
       <w:r>
         <w:rPr>
           <w:lang w:eastAsia="cs-CZ"/>
@@ -11391,7 +11649,7 @@
         </w:rPr>
         <w:t xml:space="preserve"> Tenzor</w:t>
       </w:r>
-      <w:bookmarkEnd w:id="21"/>
+      <w:bookmarkEnd w:id="23"/>
     </w:p>
     <w:p>
       <w:pPr>
@@ -11662,19 +11920,11 @@
         </w:rPr>
         <w:t xml:space="preserve">Ten obsahuje velikosti dimenzí. V konstruktoru se nakopíruje do vektoru pro udržování velikostí dimenzí a poté se spustí metoda </w:t>
       </w:r>
-      <w:proofErr w:type="gramStart"/>
-      <w:r>
-        <w:rPr>
-          <w:lang w:eastAsia="cs-CZ"/>
-        </w:rPr>
-        <w:t>update(</w:t>
-      </w:r>
-      <w:proofErr w:type="gramEnd"/>
-      <w:r>
-        <w:rPr>
-          <w:lang w:eastAsia="cs-CZ"/>
-        </w:rPr>
-        <w:t>),</w:t>
+      <w:r>
+        <w:rPr>
+          <w:lang w:eastAsia="cs-CZ"/>
+        </w:rPr>
+        <w:t>update(),</w:t>
       </w:r>
       <w:r>
         <w:rPr>
@@ -11751,7 +12001,7 @@
           <w:lang w:eastAsia="cs-CZ"/>
         </w:rPr>
       </w:pPr>
-      <w:bookmarkStart w:id="22" w:name="_Toc229952414"/>
+      <w:bookmarkStart w:id="24" w:name="_Toc230096694"/>
       <w:r>
         <w:rPr>
           <w:lang w:eastAsia="cs-CZ"/>
@@ -11782,7 +12032,7 @@
         </w:rPr>
         <w:t xml:space="preserve"> Paralelní tenzor</w:t>
       </w:r>
-      <w:bookmarkEnd w:id="22"/>
+      <w:bookmarkEnd w:id="24"/>
     </w:p>
     <w:p>
       <w:pPr>
@@ -11846,41 +12096,13 @@
         <w:rPr>
           <w:lang w:eastAsia="cs-CZ"/>
         </w:rPr>
-        <w:t xml:space="preserve">také </w:t>
-      </w:r>
-      <w:proofErr w:type="gramStart"/>
-      <w:r>
-        <w:rPr>
-          <w:lang w:eastAsia="cs-CZ"/>
-        </w:rPr>
-        <w:t>sycl::</w:t>
-      </w:r>
-      <w:proofErr w:type="gramEnd"/>
-      <w:r>
-        <w:rPr>
-          <w:lang w:eastAsia="cs-CZ"/>
-        </w:rPr>
-        <w:t>queue, které umožňuje paralelizaci.</w:t>
-      </w:r>
-      <w:r>
-        <w:rPr>
-          <w:lang w:eastAsia="cs-CZ"/>
-        </w:rPr>
-        <w:t xml:space="preserve"> Z důvodů efektivity je pro jeden program vytvořeno jenom jedno </w:t>
-      </w:r>
-      <w:proofErr w:type="gramStart"/>
-      <w:r>
-        <w:rPr>
-          <w:lang w:eastAsia="cs-CZ"/>
-        </w:rPr>
-        <w:t>sycl::</w:t>
-      </w:r>
-      <w:proofErr w:type="gramEnd"/>
-      <w:r>
-        <w:rPr>
-          <w:lang w:eastAsia="cs-CZ"/>
-        </w:rPr>
-        <w:t>queue, jelikož je jeho inicializace náročná a nepotřebná, pokud by jeho uživatel nechtěl změnit zařízení</w:t>
+        <w:t>také sycl::queue, které umožňuje paralelizaci.</w:t>
+      </w:r>
+      <w:r>
+        <w:rPr>
+          <w:lang w:eastAsia="cs-CZ"/>
+        </w:rPr>
+        <w:t xml:space="preserve"> Z důvodů efektivity je pro jeden program vytvořeno jenom jedno sycl::queue, jelikož je jeho inicializace náročná a nepotřebná, pokud by jeho uživatel nechtěl změnit zařízení</w:t>
       </w:r>
       <w:r>
         <w:rPr>
@@ -12222,7 +12444,7 @@
           <w:lang w:eastAsia="cs-CZ"/>
         </w:rPr>
       </w:pPr>
-      <w:bookmarkStart w:id="23" w:name="_Toc229952415"/>
+      <w:bookmarkStart w:id="25" w:name="_Toc230096695"/>
       <w:r>
         <w:rPr>
           <w:lang w:eastAsia="cs-CZ"/>
@@ -12253,7 +12475,7 @@
         </w:rPr>
         <w:t xml:space="preserve"> Matice</w:t>
       </w:r>
-      <w:bookmarkEnd w:id="23"/>
+      <w:bookmarkEnd w:id="25"/>
     </w:p>
     <w:p>
       <w:pPr>
@@ -12352,7 +12574,7 @@
           <w:lang w:eastAsia="cs-CZ"/>
         </w:rPr>
       </w:pPr>
-      <w:bookmarkStart w:id="24" w:name="_Toc229952416"/>
+      <w:bookmarkStart w:id="26" w:name="_Toc230096696"/>
       <w:r>
         <w:rPr>
           <w:lang w:eastAsia="cs-CZ"/>
@@ -12384,7 +12606,7 @@
         </w:rPr>
         <w:t xml:space="preserve"> N-nární strom</w:t>
       </w:r>
-      <w:bookmarkEnd w:id="24"/>
+      <w:bookmarkEnd w:id="26"/>
     </w:p>
     <w:p>
       <w:pPr>
@@ -12513,12 +12735,14 @@
           <w:lang w:eastAsia="cs-CZ"/>
         </w:rPr>
       </w:pPr>
+      <w:bookmarkStart w:id="27" w:name="_Toc230096697"/>
       <w:r>
         <w:rPr>
           <w:lang w:eastAsia="cs-CZ"/>
         </w:rPr>
         <w:t>2.2.8 Abstraktní operace</w:t>
       </w:r>
+      <w:bookmarkEnd w:id="27"/>
     </w:p>
     <w:p>
       <w:pPr>
@@ -12553,26 +12777,14 @@
           <w:lang w:eastAsia="cs-CZ"/>
         </w:rPr>
       </w:pPr>
-      <w:bookmarkStart w:id="25" w:name="_Toc229952417"/>
-      <w:r>
-        <w:rPr>
-          <w:lang w:eastAsia="cs-CZ"/>
-        </w:rPr>
-        <w:t>2.2.</w:t>
-      </w:r>
-      <w:r>
-        <w:rPr>
-          <w:lang w:eastAsia="cs-CZ"/>
-        </w:rPr>
-        <w:t>9</w:t>
-      </w:r>
-      <w:r>
-        <w:rPr>
-          <w:lang w:eastAsia="cs-CZ"/>
-        </w:rPr>
-        <w:t xml:space="preserve"> Pomocné</w:t>
-      </w:r>
-      <w:bookmarkEnd w:id="25"/>
+      <w:bookmarkStart w:id="28" w:name="_Toc230096698"/>
+      <w:r>
+        <w:rPr>
+          <w:lang w:eastAsia="cs-CZ"/>
+        </w:rPr>
+        <w:t>2.2.9 Pooling USM</w:t>
+      </w:r>
+      <w:bookmarkEnd w:id="28"/>
     </w:p>
     <w:p>
       <w:pPr>
@@ -12586,286 +12798,60 @@
         <w:rPr>
           <w:lang w:eastAsia="cs-CZ"/>
         </w:rPr>
-        <w:t>Jednou z velice šikovných „pomůcek“ je třída span_view.</w:t>
-      </w:r>
-      <w:r>
-        <w:rPr>
-          <w:lang w:eastAsia="cs-CZ"/>
-        </w:rPr>
-        <w:t xml:space="preserve"> Tato třída dědí od třídy </w:t>
-      </w:r>
-      <w:proofErr w:type="gramStart"/>
-      <w:r>
-        <w:rPr>
-          <w:lang w:eastAsia="cs-CZ"/>
-        </w:rPr>
-        <w:t>std::span&lt;</w:t>
-      </w:r>
-      <w:proofErr w:type="gramEnd"/>
-      <w:r>
-        <w:rPr>
-          <w:lang w:eastAsia="cs-CZ"/>
-        </w:rPr>
-        <w:t xml:space="preserve">const T, </w:t>
-      </w:r>
-      <w:r>
-        <w:rPr>
-          <w:lang w:eastAsia="cs-CZ"/>
-        </w:rPr>
-        <w:t xml:space="preserve">Extent = </w:t>
-      </w:r>
-      <w:proofErr w:type="gramStart"/>
-      <w:r>
-        <w:rPr>
-          <w:lang w:eastAsia="cs-CZ"/>
-        </w:rPr>
-        <w:t>std::</w:t>
-      </w:r>
-      <w:proofErr w:type="gramEnd"/>
-      <w:r>
-        <w:rPr>
-          <w:lang w:eastAsia="cs-CZ"/>
-        </w:rPr>
-        <w:t>dynamic_extent</w:t>
-      </w:r>
-      <w:r>
-        <w:rPr>
-          <w:lang w:eastAsia="cs-CZ"/>
-        </w:rPr>
-        <w:t xml:space="preserve">&gt; a jenom ji rozšiřuje o jediný konstruktor. </w:t>
-      </w:r>
-      <w:r>
-        <w:rPr>
-          <w:lang w:eastAsia="cs-CZ"/>
-        </w:rPr>
-        <w:t>Jedná se o</w:t>
-      </w:r>
-      <w:r>
-        <w:rPr>
-          <w:lang w:eastAsia="cs-CZ"/>
-        </w:rPr>
-        <w:t xml:space="preserve"> konstruktor přijímající </w:t>
-      </w:r>
-      <w:proofErr w:type="gramStart"/>
-      <w:r>
-        <w:rPr>
-          <w:lang w:eastAsia="cs-CZ"/>
-        </w:rPr>
-        <w:t>std::</w:t>
-      </w:r>
-      <w:proofErr w:type="gramEnd"/>
-      <w:r>
-        <w:rPr>
-          <w:lang w:eastAsia="cs-CZ"/>
-        </w:rPr>
-        <w:t>initializer_list.</w:t>
-      </w:r>
-      <w:r>
-        <w:rPr>
-          <w:lang w:eastAsia="cs-CZ"/>
-        </w:rPr>
-        <w:t xml:space="preserve"> Pro běžné použití jako proměnná je to nebezpečné, ovšem zde je to užito jenom jako parametr.</w:t>
-      </w:r>
-      <w:r>
-        <w:rPr>
-          <w:lang w:eastAsia="cs-CZ"/>
-        </w:rPr>
-        <w:t xml:space="preserve"> Tím zanikají problémy s životností </w:t>
-      </w:r>
-      <w:proofErr w:type="gramStart"/>
-      <w:r>
-        <w:rPr>
-          <w:lang w:eastAsia="cs-CZ"/>
-        </w:rPr>
-        <w:t>std::</w:t>
-      </w:r>
-      <w:proofErr w:type="gramEnd"/>
-      <w:r>
-        <w:rPr>
-          <w:lang w:eastAsia="cs-CZ"/>
-        </w:rPr>
-        <w:t>initializer_list.</w:t>
-      </w:r>
-      <w:r>
-        <w:rPr>
-          <w:lang w:eastAsia="cs-CZ"/>
-        </w:rPr>
-        <w:t xml:space="preserve"> To je velice přínosné, jelikož tak bud</w:t>
-      </w:r>
-      <w:r>
-        <w:rPr>
-          <w:lang w:eastAsia="cs-CZ"/>
-        </w:rPr>
-        <w:t>e</w:t>
-      </w:r>
-      <w:r>
-        <w:rPr>
-          <w:lang w:eastAsia="cs-CZ"/>
-        </w:rPr>
-        <w:t xml:space="preserve"> uživatel moci do jediné metody zadat jak cokoliv konvertibilní na </w:t>
-      </w:r>
-      <w:proofErr w:type="gramStart"/>
-      <w:r>
-        <w:rPr>
-          <w:lang w:eastAsia="cs-CZ"/>
-        </w:rPr>
-        <w:t>std::</w:t>
-      </w:r>
-      <w:proofErr w:type="gramEnd"/>
-      <w:r>
-        <w:rPr>
-          <w:lang w:eastAsia="cs-CZ"/>
-        </w:rPr>
-        <w:t>span, tak také inicializační list.</w:t>
-      </w:r>
-      <w:r>
-        <w:rPr>
-          <w:lang w:eastAsia="cs-CZ"/>
-        </w:rPr>
-        <w:t xml:space="preserve"> V komunitě standardu C++ o tomto tématu byla diskuse. Přišel návrh na přidání konstrukce </w:t>
-      </w:r>
-      <w:proofErr w:type="gramStart"/>
-      <w:r>
-        <w:rPr>
-          <w:lang w:eastAsia="cs-CZ"/>
-        </w:rPr>
-        <w:t>std::</w:t>
-      </w:r>
-      <w:proofErr w:type="gramEnd"/>
-      <w:r>
-        <w:rPr>
-          <w:lang w:eastAsia="cs-CZ"/>
-        </w:rPr>
-        <w:t xml:space="preserve">span z </w:t>
-      </w:r>
-      <w:proofErr w:type="gramStart"/>
-      <w:r>
-        <w:rPr>
-          <w:lang w:eastAsia="cs-CZ"/>
-        </w:rPr>
-        <w:t>std::</w:t>
-      </w:r>
-      <w:proofErr w:type="gramEnd"/>
-      <w:r>
-        <w:rPr>
-          <w:lang w:eastAsia="cs-CZ"/>
-        </w:rPr>
-        <w:t>initializer_list a tento návr</w:t>
-      </w:r>
-      <w:r>
-        <w:rPr>
-          <w:lang w:eastAsia="cs-CZ"/>
-        </w:rPr>
-        <w:t>h [</w:t>
-      </w:r>
-      <w:r>
-        <w:rPr>
-          <w:lang w:eastAsia="cs-CZ"/>
-        </w:rPr>
-        <w:t>7</w:t>
-      </w:r>
-      <w:r>
-        <w:rPr>
-          <w:lang w:eastAsia="cs-CZ"/>
-        </w:rPr>
-        <w:t>]</w:t>
-      </w:r>
-      <w:r>
-        <w:rPr>
-          <w:lang w:eastAsia="cs-CZ"/>
-        </w:rPr>
-        <w:t xml:space="preserve"> byl dokonce schválen komisí pro standard C++26.</w:t>
-      </w:r>
-      <w:r>
-        <w:rPr>
-          <w:lang w:eastAsia="cs-CZ"/>
-        </w:rPr>
-        <w:t xml:space="preserve"> Poté se ale zjistily problémy s tímto návrhem, kdy se díky této změně volaly jiné metody a konstruktory a přišel protinávrh</w:t>
-      </w:r>
-      <w:r>
-        <w:rPr>
-          <w:lang w:eastAsia="cs-CZ"/>
-        </w:rPr>
-        <w:t xml:space="preserve"> [8]</w:t>
-      </w:r>
-      <w:r>
-        <w:rPr>
-          <w:lang w:eastAsia="cs-CZ"/>
-        </w:rPr>
-        <w:t xml:space="preserve"> odstraňující tento návrh.</w:t>
-      </w:r>
-      <w:r>
-        <w:rPr>
-          <w:lang w:eastAsia="cs-CZ"/>
-        </w:rPr>
-        <w:t xml:space="preserve"> Komise pro vývoj knihovny C++ nakonec odhlasovala tento </w:t>
-      </w:r>
-      <w:r>
-        <w:rPr>
-          <w:lang w:eastAsia="cs-CZ"/>
-        </w:rPr>
-        <w:t>protinávrh,</w:t>
-      </w:r>
-      <w:r>
-        <w:rPr>
-          <w:lang w:eastAsia="cs-CZ"/>
-        </w:rPr>
-        <w:t xml:space="preserve"> a tudíž byl původní návrh z C++26</w:t>
-      </w:r>
-      <w:r>
-        <w:rPr>
-          <w:lang w:eastAsia="cs-CZ"/>
-        </w:rPr>
-        <w:t xml:space="preserve"> </w:t>
-      </w:r>
-      <w:r>
-        <w:rPr>
-          <w:lang w:eastAsia="cs-CZ"/>
-        </w:rPr>
-        <w:t>vyřazen.</w:t>
-      </w:r>
-      <w:r>
-        <w:rPr>
-          <w:lang w:eastAsia="cs-CZ"/>
-        </w:rPr>
-        <w:t xml:space="preserve"> Není ovšem zcela vyloučeno, že </w:t>
-      </w:r>
-      <w:r>
-        <w:rPr>
-          <w:lang w:eastAsia="cs-CZ"/>
-        </w:rPr>
-        <w:t>existuje</w:t>
-      </w:r>
-      <w:r>
-        <w:rPr>
-          <w:lang w:eastAsia="cs-CZ"/>
-        </w:rPr>
-        <w:t xml:space="preserve"> verz</w:t>
-      </w:r>
-      <w:r>
-        <w:rPr>
-          <w:lang w:eastAsia="cs-CZ"/>
-        </w:rPr>
-        <w:t>e v některém ze</w:t>
-      </w:r>
-      <w:r>
-        <w:rPr>
-          <w:lang w:eastAsia="cs-CZ"/>
-        </w:rPr>
-        <w:t xml:space="preserve"> známých kompilátorů</w:t>
-      </w:r>
-      <w:r>
-        <w:rPr>
-          <w:lang w:eastAsia="cs-CZ"/>
-        </w:rPr>
-        <w:t>, kde je tato věc implementována</w:t>
-      </w:r>
-      <w:r>
-        <w:rPr>
-          <w:lang w:eastAsia="cs-CZ"/>
-        </w:rPr>
-        <w:t>.</w:t>
-      </w:r>
+        <w:t xml:space="preserve">Projekt disponuje třídou jménem „PoolUSM“, která zařizuje </w:t>
+      </w:r>
+      <w:r>
+        <w:rPr>
+          <w:lang w:eastAsia="cs-CZ"/>
+        </w:rPr>
+        <w:t>pooling USM paměti.</w:t>
+      </w:r>
+      <w:r>
+        <w:rPr>
+          <w:lang w:eastAsia="cs-CZ"/>
+        </w:rPr>
+        <w:t xml:space="preserve"> Této třídy využívá paměťový backend pro USM. Je to nesmírně výhodné, jelikož alokace paměti na zařízení je velice drahá a její recyklace je prakticky nutností k dosažení přijatelných rychlostních výsledků.</w:t>
+      </w:r>
+      <w:r>
+        <w:rPr>
+          <w:lang w:eastAsia="cs-CZ"/>
+        </w:rPr>
+        <w:t xml:space="preserve"> Na udržování si informací o volných alokovaných paměťových dílů byl použit std::unordered_map.</w:t>
+      </w:r>
+      <w:r>
+        <w:rPr>
+          <w:lang w:eastAsia="cs-CZ"/>
+        </w:rPr>
+        <w:t xml:space="preserve"> Hlavní výhodou std::unordered_map je konstantní složitost vyhledání prvku a také jeho vložení či odebrání.</w:t>
+      </w:r>
+    </w:p>
+    <w:p>
+      <w:pPr>
+        <w:pStyle w:val="Nadpis3"/>
+        <w:rPr>
+          <w:lang w:eastAsia="cs-CZ"/>
+        </w:rPr>
+      </w:pPr>
+      <w:bookmarkStart w:id="29" w:name="_Toc230096699"/>
+      <w:r>
+        <w:rPr>
+          <w:lang w:eastAsia="cs-CZ"/>
+        </w:rPr>
+        <w:t>2.2.</w:t>
+      </w:r>
+      <w:r>
+        <w:rPr>
+          <w:lang w:eastAsia="cs-CZ"/>
+        </w:rPr>
+        <w:t>10</w:t>
+      </w:r>
+      <w:r>
+        <w:rPr>
+          <w:lang w:eastAsia="cs-CZ"/>
+        </w:rPr>
+        <w:t xml:space="preserve"> Pomocné</w:t>
+      </w:r>
+      <w:bookmarkEnd w:id="29"/>
     </w:p>
     <w:p>
       <w:pPr>
@@ -12879,6 +12865,208 @@
         <w:rPr>
           <w:lang w:eastAsia="cs-CZ"/>
         </w:rPr>
+        <w:t>Jednou z velice šikovných „pomůcek“ je třída span_view.</w:t>
+      </w:r>
+      <w:r>
+        <w:rPr>
+          <w:lang w:eastAsia="cs-CZ"/>
+        </w:rPr>
+        <w:t xml:space="preserve"> Tato třída dědí od třídy std::span&lt;const T, </w:t>
+      </w:r>
+      <w:r>
+        <w:rPr>
+          <w:lang w:eastAsia="cs-CZ"/>
+        </w:rPr>
+        <w:t>Extent = std::dynamic_extent</w:t>
+      </w:r>
+      <w:r>
+        <w:rPr>
+          <w:lang w:eastAsia="cs-CZ"/>
+        </w:rPr>
+        <w:t xml:space="preserve">&gt; a jenom ji rozšiřuje o jediný konstruktor. </w:t>
+      </w:r>
+      <w:r>
+        <w:rPr>
+          <w:lang w:eastAsia="cs-CZ"/>
+        </w:rPr>
+        <w:t>Jedná se o</w:t>
+      </w:r>
+      <w:r>
+        <w:rPr>
+          <w:lang w:eastAsia="cs-CZ"/>
+        </w:rPr>
+        <w:t xml:space="preserve"> konstruktor přijímající std::initializer_list.</w:t>
+      </w:r>
+      <w:r>
+        <w:rPr>
+          <w:lang w:eastAsia="cs-CZ"/>
+        </w:rPr>
+        <w:t xml:space="preserve"> Pro běžné použití jako proměnná je to nebezpečné, ovšem zde je to užito jenom jako parametr.</w:t>
+      </w:r>
+      <w:r>
+        <w:rPr>
+          <w:lang w:eastAsia="cs-CZ"/>
+        </w:rPr>
+        <w:t xml:space="preserve"> Tím zanikají problémy s životností std::initializer_list.</w:t>
+      </w:r>
+      <w:r>
+        <w:rPr>
+          <w:lang w:eastAsia="cs-CZ"/>
+        </w:rPr>
+        <w:t xml:space="preserve"> To je velice přínosné, jelikož tak bud</w:t>
+      </w:r>
+      <w:r>
+        <w:rPr>
+          <w:lang w:eastAsia="cs-CZ"/>
+        </w:rPr>
+        <w:t>e</w:t>
+      </w:r>
+      <w:r>
+        <w:rPr>
+          <w:lang w:eastAsia="cs-CZ"/>
+        </w:rPr>
+        <w:t xml:space="preserve"> uživatel moci do jediné metody zadat jak cokoliv konvertibilní na std::span, tak také inicializační list.</w:t>
+      </w:r>
+      <w:r>
+        <w:rPr>
+          <w:lang w:eastAsia="cs-CZ"/>
+        </w:rPr>
+        <w:t xml:space="preserve"> V komunitě standardu C++ o tomto tématu byla diskuse. Přišel návrh na přidání konstrukce std::span z std::initializer_list a </w:t>
+      </w:r>
+      <w:r>
+        <w:rPr>
+          <w:lang w:eastAsia="cs-CZ"/>
+        </w:rPr>
+        <w:lastRenderedPageBreak/>
+        <w:t>tento návr</w:t>
+      </w:r>
+      <w:r>
+        <w:rPr>
+          <w:lang w:eastAsia="cs-CZ"/>
+        </w:rPr>
+        <w:t>h [</w:t>
+      </w:r>
+      <w:r>
+        <w:rPr>
+          <w:lang w:eastAsia="cs-CZ"/>
+        </w:rPr>
+        <w:t>7</w:t>
+      </w:r>
+      <w:r>
+        <w:rPr>
+          <w:lang w:eastAsia="cs-CZ"/>
+        </w:rPr>
+        <w:t>]</w:t>
+      </w:r>
+      <w:r>
+        <w:rPr>
+          <w:lang w:eastAsia="cs-CZ"/>
+        </w:rPr>
+        <w:t xml:space="preserve"> byl dokonce schválen komisí pro standard C++26.</w:t>
+      </w:r>
+      <w:r>
+        <w:rPr>
+          <w:lang w:eastAsia="cs-CZ"/>
+        </w:rPr>
+        <w:t xml:space="preserve"> Poté se ale zjistily problémy s tímto návrhem, kdy se díky této změně volaly jiné metody a konstruktory a přišel protinávrh</w:t>
+      </w:r>
+      <w:r>
+        <w:rPr>
+          <w:lang w:eastAsia="cs-CZ"/>
+        </w:rPr>
+        <w:t xml:space="preserve"> [8]</w:t>
+      </w:r>
+      <w:r>
+        <w:rPr>
+          <w:lang w:eastAsia="cs-CZ"/>
+        </w:rPr>
+        <w:t xml:space="preserve"> odstraňující tento návrh.</w:t>
+      </w:r>
+      <w:r>
+        <w:rPr>
+          <w:lang w:eastAsia="cs-CZ"/>
+        </w:rPr>
+        <w:t xml:space="preserve"> Komise pro vývoj knihovny C++ nakonec odhlasovala tento </w:t>
+      </w:r>
+      <w:r>
+        <w:rPr>
+          <w:lang w:eastAsia="cs-CZ"/>
+        </w:rPr>
+        <w:t>protinávrh,</w:t>
+      </w:r>
+      <w:r>
+        <w:rPr>
+          <w:lang w:eastAsia="cs-CZ"/>
+        </w:rPr>
+        <w:t xml:space="preserve"> a tudíž byl původní návrh z C++26</w:t>
+      </w:r>
+      <w:r>
+        <w:rPr>
+          <w:lang w:eastAsia="cs-CZ"/>
+        </w:rPr>
+        <w:t xml:space="preserve"> </w:t>
+      </w:r>
+      <w:r>
+        <w:rPr>
+          <w:lang w:eastAsia="cs-CZ"/>
+        </w:rPr>
+        <w:t>vyřazen.</w:t>
+      </w:r>
+      <w:r>
+        <w:rPr>
+          <w:lang w:eastAsia="cs-CZ"/>
+        </w:rPr>
+        <w:t xml:space="preserve"> Není ovšem zcela vyloučeno, že </w:t>
+      </w:r>
+      <w:r>
+        <w:rPr>
+          <w:lang w:eastAsia="cs-CZ"/>
+        </w:rPr>
+        <w:t>existuje</w:t>
+      </w:r>
+      <w:r>
+        <w:rPr>
+          <w:lang w:eastAsia="cs-CZ"/>
+        </w:rPr>
+        <w:t xml:space="preserve"> verz</w:t>
+      </w:r>
+      <w:r>
+        <w:rPr>
+          <w:lang w:eastAsia="cs-CZ"/>
+        </w:rPr>
+        <w:t>e v některém ze</w:t>
+      </w:r>
+      <w:r>
+        <w:rPr>
+          <w:lang w:eastAsia="cs-CZ"/>
+        </w:rPr>
+        <w:t xml:space="preserve"> známých kompilátorů</w:t>
+      </w:r>
+      <w:r>
+        <w:rPr>
+          <w:lang w:eastAsia="cs-CZ"/>
+        </w:rPr>
+        <w:t>, kde je tato věc implementována</w:t>
+      </w:r>
+      <w:r>
+        <w:rPr>
+          <w:lang w:eastAsia="cs-CZ"/>
+        </w:rPr>
+        <w:t>.</w:t>
+      </w:r>
+    </w:p>
+    <w:p>
+      <w:pPr>
+        <w:spacing w:line="360" w:lineRule="auto"/>
+        <w:jc w:val="both"/>
+        <w:rPr>
+          <w:lang w:eastAsia="cs-CZ"/>
+        </w:rPr>
+      </w:pPr>
+      <w:r>
+        <w:rPr>
+          <w:lang w:eastAsia="cs-CZ"/>
+        </w:rPr>
         <w:t>Déle byly implementovány třídy podle návrhového vzoru funktor se jmény „DefaultEquals“ a „DefaultOrder“, které definují obecn</w:t>
       </w:r>
       <w:r>
@@ -12897,29 +13085,14 @@
         <w:rPr>
           <w:lang w:eastAsia="cs-CZ"/>
         </w:rPr>
-        <w:t xml:space="preserve"> U typů s plovoucí </w:t>
-      </w:r>
-      <w:r>
-        <w:rPr>
-          <w:lang w:eastAsia="cs-CZ"/>
-        </w:rPr>
-        <w:lastRenderedPageBreak/>
-        <w:t>desetinnou čárkou používají porovnávání pomocí epsilon a absolutní hodnoty a u ostatních typů jen volají příslušné operátory.</w:t>
-      </w:r>
-      <w:r>
-        <w:rPr>
-          <w:lang w:eastAsia="cs-CZ"/>
-        </w:rPr>
-        <w:t xml:space="preserve"> Pro vyjádření pořadí je zde i ve zbytku projektu využito </w:t>
-      </w:r>
-      <w:proofErr w:type="gramStart"/>
-      <w:r>
-        <w:rPr>
-          <w:lang w:eastAsia="cs-CZ"/>
-        </w:rPr>
-        <w:t>std::</w:t>
-      </w:r>
-      <w:proofErr w:type="gramEnd"/>
+        <w:t xml:space="preserve"> U typů s plovoucí desetinnou čárkou používají porovnávání pomocí epsilon a absolutní hodnoty a u ostatních typů jen volají příslušné operátory.</w:t>
+      </w:r>
+      <w:r>
+        <w:rPr>
+          <w:lang w:eastAsia="cs-CZ"/>
+        </w:rPr>
+        <w:t xml:space="preserve"> Pro vyjádření pořadí je zde i ve zbytku projektu využito std::</w:t>
+      </w:r>
       <w:r>
         <w:rPr>
           <w:rFonts w:ascii="Consolas" w:eastAsia="Times New Roman" w:hAnsi="Consolas"/>
@@ -12950,7 +13123,7 @@
           <w:lang w:eastAsia="cs-CZ"/>
         </w:rPr>
       </w:pPr>
-      <w:bookmarkStart w:id="26" w:name="_Toc229952418"/>
+      <w:bookmarkStart w:id="30" w:name="_Toc230096700"/>
       <w:r>
         <w:rPr>
           <w:lang w:eastAsia="cs-CZ"/>
@@ -12969,7 +13142,7 @@
         </w:rPr>
         <w:t xml:space="preserve"> Testy</w:t>
       </w:r>
-      <w:bookmarkEnd w:id="26"/>
+      <w:bookmarkEnd w:id="30"/>
     </w:p>
     <w:p>
       <w:pPr>
@@ -13135,7 +13308,7 @@
           <w:lang w:eastAsia="cs-CZ"/>
         </w:rPr>
       </w:pPr>
-      <w:bookmarkStart w:id="27" w:name="_Toc229952419"/>
+      <w:bookmarkStart w:id="31" w:name="_Toc230096701"/>
       <w:r>
         <w:rPr>
           <w:lang w:eastAsia="cs-CZ"/>
@@ -13154,7 +13327,7 @@
         </w:rPr>
         <w:t>.1 Unit testování</w:t>
       </w:r>
-      <w:bookmarkEnd w:id="27"/>
+      <w:bookmarkEnd w:id="31"/>
     </w:p>
     <w:p>
       <w:pPr>
@@ -13216,21 +13389,7 @@
         <w:rPr>
           <w:lang w:eastAsia="cs-CZ"/>
         </w:rPr>
-        <w:t xml:space="preserve"> Například </w:t>
-      </w:r>
-      <w:proofErr w:type="gramStart"/>
-      <w:r>
-        <w:rPr>
-          <w:lang w:eastAsia="cs-CZ"/>
-        </w:rPr>
-        <w:t>std::</w:t>
-      </w:r>
-      <w:proofErr w:type="gramEnd"/>
-      <w:r>
-        <w:rPr>
-          <w:lang w:eastAsia="cs-CZ"/>
-        </w:rPr>
-        <w:t>string nebo i tenzor v tenzoru.</w:t>
+        <w:t xml:space="preserve"> Například std::string nebo i tenzor v tenzoru.</w:t>
       </w:r>
       <w:r>
         <w:rPr>
@@ -13247,7 +13406,7 @@
           <w:lang w:eastAsia="cs-CZ"/>
         </w:rPr>
       </w:pPr>
-      <w:bookmarkStart w:id="28" w:name="_Toc229952420"/>
+      <w:bookmarkStart w:id="32" w:name="_Toc230096702"/>
       <w:r>
         <w:rPr>
           <w:lang w:eastAsia="cs-CZ"/>
@@ -13266,7 +13425,7 @@
         </w:rPr>
         <w:t>.2 Zátěžové testování</w:t>
       </w:r>
-      <w:bookmarkEnd w:id="28"/>
+      <w:bookmarkEnd w:id="32"/>
     </w:p>
     <w:p>
       <w:pPr>
@@ -13322,7 +13481,14 @@
         <w:rPr>
           <w:lang w:eastAsia="cs-CZ"/>
         </w:rPr>
-        <w:t xml:space="preserve"> V zásadě byla pro každý typ akce (konstrukce, sčítání atd.) nastavena jiná míra zátěže, tak aby</w:t>
+        <w:t xml:space="preserve"> V zásadě byla pro každý typ akce (konstrukce, </w:t>
+      </w:r>
+      <w:r>
+        <w:rPr>
+          <w:lang w:eastAsia="cs-CZ"/>
+        </w:rPr>
+        <w:lastRenderedPageBreak/>
+        <w:t>sčítání atd.) nastavena jiná míra zátěže, tak aby</w:t>
       </w:r>
       <w:r>
         <w:rPr>
@@ -13365,6 +13531,21 @@
           <w:lang w:eastAsia="cs-CZ"/>
         </w:rPr>
         <w:t xml:space="preserve"> Jinak by mohly ostatní vedlejší aktivity testu ovlivnit přesnost měření testované aktivity.</w:t>
+      </w:r>
+    </w:p>
+    <w:p>
+      <w:pPr>
+        <w:spacing w:line="360" w:lineRule="auto"/>
+        <w:jc w:val="both"/>
+        <w:rPr>
+          <w:lang w:eastAsia="cs-CZ"/>
+        </w:rPr>
+      </w:pPr>
+      <w:r>
+        <w:rPr>
+          <w:lang w:eastAsia="cs-CZ"/>
+        </w:rPr>
+        <w:t>Z následující tabulky lze vidět, že paralelní tenzor je hlavně výhodný pro velké tenzory a při použití u malých velikostí způsobí naopak ztráty na výkonu.</w:t>
       </w:r>
     </w:p>
     <w:p>
@@ -13375,12 +13556,11 @@
           <w:color w:val="000000" w:themeColor="text1"/>
         </w:rPr>
       </w:pPr>
-      <w:bookmarkStart w:id="29" w:name="_Toc230006448"/>
+      <w:bookmarkStart w:id="33" w:name="_Toc230006448"/>
       <w:r>
         <w:rPr>
           <w:color w:val="000000" w:themeColor="text1"/>
         </w:rPr>
-        <w:lastRenderedPageBreak/>
         <w:t xml:space="preserve">Tabulka </w:t>
       </w:r>
       <w:r>
@@ -13420,7 +13600,7 @@
         </w:rPr>
         <w:t>: Porovnání zátěžových testů</w:t>
       </w:r>
-      <w:bookmarkEnd w:id="29"/>
+      <w:bookmarkEnd w:id="33"/>
     </w:p>
     <w:tbl>
       <w:tblPr>
@@ -13568,7 +13748,6 @@
                 <w:szCs w:val="24"/>
               </w:rPr>
             </w:pPr>
-            <w:proofErr w:type="gramStart"/>
             <w:r>
               <w:rPr>
                 <w:szCs w:val="24"/>
@@ -13581,7 +13760,6 @@
               </w:rPr>
               <w:t>1</w:t>
             </w:r>
-            <w:proofErr w:type="gramEnd"/>
           </w:p>
         </w:tc>
       </w:tr>
@@ -13668,12 +13846,12 @@
       <w:pPr>
         <w:pStyle w:val="Nadpis1"/>
       </w:pPr>
-      <w:bookmarkStart w:id="30" w:name="_Toc229952421"/>
+      <w:bookmarkStart w:id="34" w:name="_Toc230096703"/>
       <w:r>
         <w:lastRenderedPageBreak/>
         <w:t>3 TEORETICKÉ VYUŽITÍ</w:t>
       </w:r>
-      <w:bookmarkEnd w:id="30"/>
+      <w:bookmarkEnd w:id="34"/>
     </w:p>
     <w:p>
       <w:pPr>
@@ -15230,12 +15408,12 @@
         </w:rPr>
         <w:br w:type="page"/>
       </w:r>
-      <w:bookmarkStart w:id="31" w:name="_Toc229952422"/>
+      <w:bookmarkStart w:id="35" w:name="_Toc230096704"/>
       <w:r>
         <w:lastRenderedPageBreak/>
         <w:t>ZÁVĚR</w:t>
       </w:r>
-      <w:bookmarkEnd w:id="31"/>
+      <w:bookmarkEnd w:id="35"/>
     </w:p>
     <w:p>
       <w:pPr>
@@ -15352,12 +15530,12 @@
       <w:r>
         <w:br w:type="page"/>
       </w:r>
-      <w:bookmarkStart w:id="32" w:name="_Toc229952423"/>
+      <w:bookmarkStart w:id="36" w:name="_Toc230096705"/>
       <w:r>
         <w:lastRenderedPageBreak/>
         <w:t>POUŽITÁ LITERATURA</w:t>
       </w:r>
-      <w:bookmarkEnd w:id="32"/>
+      <w:bookmarkEnd w:id="36"/>
     </w:p>
     <w:p>
       <w:pPr>
@@ -15646,27 +15824,7 @@
           <w:sz w:val="24"/>
           <w:szCs w:val="24"/>
         </w:rPr>
-        <w:t xml:space="preserve">P2447R6 </w:t>
-      </w:r>
-      <w:proofErr w:type="gramStart"/>
-      <w:r>
-        <w:rPr>
-          <w:i/>
-          <w:iCs/>
-          <w:sz w:val="24"/>
-          <w:szCs w:val="24"/>
-        </w:rPr>
-        <w:t>std::</w:t>
-      </w:r>
-      <w:proofErr w:type="gramEnd"/>
-      <w:r>
-        <w:rPr>
-          <w:i/>
-          <w:iCs/>
-          <w:sz w:val="24"/>
-          <w:szCs w:val="24"/>
-        </w:rPr>
-        <w:t>span over an initializer list</w:t>
+        <w:t>P2447R6 std::span over an initializer list</w:t>
       </w:r>
       <w:r>
         <w:rPr>
@@ -15757,12 +15915,12 @@
       <w:r>
         <w:br w:type="page"/>
       </w:r>
-      <w:bookmarkStart w:id="33" w:name="_Toc229952424"/>
+      <w:bookmarkStart w:id="37" w:name="_Toc230096706"/>
       <w:r>
         <w:lastRenderedPageBreak/>
         <w:t>SEZNAM PŘÍLOH</w:t>
       </w:r>
-      <w:bookmarkEnd w:id="33"/>
+      <w:bookmarkEnd w:id="37"/>
     </w:p>
     <w:p>
       <w:pPr>

</xml_diff>

<commit_message>
documentation - finished stress tests.
</commit_message>
<xml_diff>
--- a/ŠpaňúrM_KnihovnaProPraci_JM_2026.docx
+++ b/ŠpaňúrM_KnihovnaProPraci_JM_2026.docx
@@ -1658,7 +1658,6 @@
           <w:noProof/>
           <w:kern w:val="2"/>
           <w:szCs w:val="24"/>
-          <w:lang/>
           <w14:ligatures w14:val="standardContextual"/>
         </w:rPr>
       </w:pPr>
@@ -1741,7 +1740,6 @@
           <w:noProof/>
           <w:kern w:val="2"/>
           <w:szCs w:val="24"/>
-          <w:lang/>
           <w14:ligatures w14:val="standardContextual"/>
         </w:rPr>
       </w:pPr>
@@ -1815,7 +1813,6 @@
           <w:noProof/>
           <w:kern w:val="2"/>
           <w:szCs w:val="24"/>
-          <w:lang/>
           <w14:ligatures w14:val="standardContextual"/>
         </w:rPr>
       </w:pPr>
@@ -1889,7 +1886,6 @@
           <w:noProof/>
           <w:kern w:val="2"/>
           <w:szCs w:val="24"/>
-          <w:lang/>
           <w14:ligatures w14:val="standardContextual"/>
         </w:rPr>
       </w:pPr>
@@ -1962,7 +1958,6 @@
           <w:noProof/>
           <w:kern w:val="2"/>
           <w:szCs w:val="24"/>
-          <w:lang/>
           <w14:ligatures w14:val="standardContextual"/>
         </w:rPr>
       </w:pPr>
@@ -2032,7 +2027,6 @@
           <w:noProof/>
           <w:kern w:val="2"/>
           <w:szCs w:val="24"/>
-          <w:lang/>
           <w14:ligatures w14:val="standardContextual"/>
         </w:rPr>
       </w:pPr>
@@ -2102,7 +2096,6 @@
           <w:noProof/>
           <w:kern w:val="2"/>
           <w:szCs w:val="24"/>
-          <w:lang/>
           <w14:ligatures w14:val="standardContextual"/>
         </w:rPr>
       </w:pPr>
@@ -2172,7 +2165,6 @@
           <w:noProof/>
           <w:kern w:val="2"/>
           <w:szCs w:val="24"/>
-          <w:lang/>
           <w14:ligatures w14:val="standardContextual"/>
         </w:rPr>
       </w:pPr>
@@ -2245,7 +2237,6 @@
           <w:noProof/>
           <w:kern w:val="2"/>
           <w:szCs w:val="24"/>
-          <w:lang/>
           <w14:ligatures w14:val="standardContextual"/>
         </w:rPr>
       </w:pPr>
@@ -2318,7 +2309,6 @@
           <w:noProof/>
           <w:kern w:val="2"/>
           <w:szCs w:val="24"/>
-          <w:lang/>
           <w14:ligatures w14:val="standardContextual"/>
         </w:rPr>
       </w:pPr>
@@ -2391,7 +2381,6 @@
           <w:noProof/>
           <w:kern w:val="2"/>
           <w:szCs w:val="24"/>
-          <w:lang/>
           <w14:ligatures w14:val="standardContextual"/>
         </w:rPr>
       </w:pPr>
@@ -2464,7 +2453,6 @@
           <w:noProof/>
           <w:kern w:val="2"/>
           <w:szCs w:val="24"/>
-          <w:lang/>
           <w14:ligatures w14:val="standardContextual"/>
         </w:rPr>
       </w:pPr>
@@ -2537,7 +2525,6 @@
           <w:noProof/>
           <w:kern w:val="2"/>
           <w:szCs w:val="24"/>
-          <w:lang/>
           <w14:ligatures w14:val="standardContextual"/>
         </w:rPr>
       </w:pPr>
@@ -2610,7 +2597,6 @@
           <w:noProof/>
           <w:kern w:val="2"/>
           <w:szCs w:val="24"/>
-          <w:lang/>
           <w14:ligatures w14:val="standardContextual"/>
         </w:rPr>
       </w:pPr>
@@ -2683,7 +2669,6 @@
           <w:noProof/>
           <w:kern w:val="2"/>
           <w:szCs w:val="24"/>
-          <w:lang/>
           <w14:ligatures w14:val="standardContextual"/>
         </w:rPr>
       </w:pPr>
@@ -2753,7 +2738,6 @@
           <w:noProof/>
           <w:kern w:val="2"/>
           <w:szCs w:val="24"/>
-          <w:lang/>
           <w14:ligatures w14:val="standardContextual"/>
         </w:rPr>
       </w:pPr>
@@ -2826,7 +2810,6 @@
           <w:noProof/>
           <w:kern w:val="2"/>
           <w:szCs w:val="24"/>
-          <w:lang/>
           <w14:ligatures w14:val="standardContextual"/>
         </w:rPr>
       </w:pPr>
@@ -2899,7 +2882,6 @@
           <w:noProof/>
           <w:kern w:val="2"/>
           <w:szCs w:val="24"/>
-          <w:lang/>
           <w14:ligatures w14:val="standardContextual"/>
         </w:rPr>
       </w:pPr>
@@ -2969,7 +2951,6 @@
           <w:noProof/>
           <w:kern w:val="2"/>
           <w:szCs w:val="24"/>
-          <w:lang/>
           <w14:ligatures w14:val="standardContextual"/>
         </w:rPr>
       </w:pPr>
@@ -3042,7 +3023,6 @@
           <w:noProof/>
           <w:kern w:val="2"/>
           <w:szCs w:val="24"/>
-          <w:lang/>
           <w14:ligatures w14:val="standardContextual"/>
         </w:rPr>
       </w:pPr>
@@ -3115,7 +3095,6 @@
           <w:noProof/>
           <w:kern w:val="2"/>
           <w:szCs w:val="24"/>
-          <w:lang/>
           <w14:ligatures w14:val="standardContextual"/>
         </w:rPr>
       </w:pPr>
@@ -3188,7 +3167,6 @@
           <w:noProof/>
           <w:kern w:val="2"/>
           <w:szCs w:val="24"/>
-          <w:lang/>
           <w14:ligatures w14:val="standardContextual"/>
         </w:rPr>
       </w:pPr>
@@ -3269,7 +3247,6 @@
           <w:noProof/>
           <w:kern w:val="2"/>
           <w:szCs w:val="24"/>
-          <w:lang/>
           <w14:ligatures w14:val="standardContextual"/>
         </w:rPr>
       </w:pPr>
@@ -3343,7 +3320,6 @@
           <w:noProof/>
           <w:kern w:val="2"/>
           <w:szCs w:val="24"/>
-          <w:lang/>
           <w14:ligatures w14:val="standardContextual"/>
         </w:rPr>
       </w:pPr>
@@ -3417,7 +3393,6 @@
           <w:noProof/>
           <w:kern w:val="2"/>
           <w:szCs w:val="24"/>
-          <w:lang/>
           <w14:ligatures w14:val="standardContextual"/>
         </w:rPr>
       </w:pPr>
@@ -3491,7 +3466,6 @@
           <w:noProof/>
           <w:kern w:val="2"/>
           <w:szCs w:val="24"/>
-          <w:lang/>
           <w14:ligatures w14:val="standardContextual"/>
         </w:rPr>
       </w:pPr>
@@ -3565,7 +3539,6 @@
           <w:noProof/>
           <w:kern w:val="2"/>
           <w:szCs w:val="24"/>
-          <w:lang/>
           <w14:ligatures w14:val="standardContextual"/>
         </w:rPr>
       </w:pPr>
@@ -3639,7 +3612,6 @@
           <w:noProof/>
           <w:kern w:val="2"/>
           <w:szCs w:val="24"/>
-          <w:lang/>
           <w14:ligatures w14:val="standardContextual"/>
         </w:rPr>
       </w:pPr>
@@ -3713,7 +3685,6 @@
           <w:noProof/>
           <w:kern w:val="2"/>
           <w:szCs w:val="24"/>
-          <w:lang/>
           <w14:ligatures w14:val="standardContextual"/>
         </w:rPr>
       </w:pPr>
@@ -3784,7 +3755,6 @@
           <w:noProof/>
           <w:kern w:val="2"/>
           <w:szCs w:val="24"/>
-          <w:lang/>
           <w14:ligatures w14:val="standardContextual"/>
         </w:rPr>
       </w:pPr>
@@ -3858,7 +3828,6 @@
           <w:noProof/>
           <w:kern w:val="2"/>
           <w:szCs w:val="24"/>
-          <w:lang/>
           <w14:ligatures w14:val="standardContextual"/>
         </w:rPr>
       </w:pPr>
@@ -3932,7 +3901,6 @@
           <w:noProof/>
           <w:kern w:val="2"/>
           <w:szCs w:val="24"/>
-          <w:lang/>
           <w14:ligatures w14:val="standardContextual"/>
         </w:rPr>
       </w:pPr>
@@ -4006,7 +3974,6 @@
           <w:noProof/>
           <w:kern w:val="2"/>
           <w:szCs w:val="24"/>
-          <w:lang/>
           <w14:ligatures w14:val="standardContextual"/>
         </w:rPr>
       </w:pPr>
@@ -4079,7 +4046,6 @@
           <w:noProof/>
           <w:kern w:val="2"/>
           <w:szCs w:val="24"/>
-          <w:lang/>
           <w14:ligatures w14:val="standardContextual"/>
         </w:rPr>
       </w:pPr>
@@ -4152,7 +4118,6 @@
           <w:noProof/>
           <w:kern w:val="2"/>
           <w:szCs w:val="24"/>
-          <w:lang/>
           <w14:ligatures w14:val="standardContextual"/>
         </w:rPr>
       </w:pPr>
@@ -4225,7 +4190,6 @@
           <w:noProof/>
           <w:kern w:val="2"/>
           <w:szCs w:val="24"/>
-          <w:lang/>
           <w14:ligatures w14:val="standardContextual"/>
         </w:rPr>
       </w:pPr>
@@ -13494,7 +13458,19 @@
         <w:rPr>
           <w:lang w:eastAsia="cs-CZ"/>
         </w:rPr>
-        <w:t xml:space="preserve"> test netrval příliš dlouho ale zase, aby měl měřitelnou hodnotu (čili alespoň nad 10ms).</w:t>
+        <w:t xml:space="preserve"> test netrval příliš dlouho ale zase, aby měl měřitelnou hodnotu (</w:t>
+      </w:r>
+      <w:r>
+        <w:rPr>
+          <w:lang w:eastAsia="cs-CZ"/>
+        </w:rPr>
+        <w:t>ideálně kolem 10 nejméně pokud to jde</w:t>
+      </w:r>
+      <w:r>
+        <w:rPr>
+          <w:lang w:eastAsia="cs-CZ"/>
+        </w:rPr>
+        <w:t>).</w:t>
       </w:r>
       <w:r>
         <w:rPr>
@@ -13545,7 +13521,374 @@
         <w:rPr>
           <w:lang w:eastAsia="cs-CZ"/>
         </w:rPr>
-        <w:t>Z následující tabulky lze vidět, že paralelní tenzor je hlavně výhodný pro velké tenzory a při použití u malých velikostí způsobí naopak ztráty na výkonu.</w:t>
+        <w:t>Také bylo užito funkce doNotOptimize</w:t>
+      </w:r>
+      <w:r>
+        <w:rPr>
+          <w:lang w:eastAsia="cs-CZ"/>
+        </w:rPr>
+        <w:t>Away</w:t>
+      </w:r>
+      <w:r>
+        <w:rPr>
+          <w:lang w:eastAsia="cs-CZ"/>
+        </w:rPr>
+        <w:t>(), která obsahuje prázdný vložený assembly blok.</w:t>
+      </w:r>
+      <w:r>
+        <w:rPr>
+          <w:lang w:eastAsia="cs-CZ"/>
+        </w:rPr>
+        <w:t xml:space="preserve"> To zabrání kompilátoru odstranit prázdnou smyčku v kódu. To se hodí u kontrolních testů, které mají být co nejpodobnější hlavnímu testu, samozřejmě až na absenci dané akce.</w:t>
+      </w:r>
+    </w:p>
+    <w:p>
+      <w:pPr>
+        <w:spacing w:line="360" w:lineRule="auto"/>
+        <w:jc w:val="both"/>
+        <w:rPr>
+          <w:lang w:eastAsia="cs-CZ"/>
+        </w:rPr>
+      </w:pPr>
+      <w:r>
+        <w:rPr>
+          <w:lang w:eastAsia="cs-CZ"/>
+        </w:rPr>
+        <w:t>Je třeba si dát také pozor na první spouštění testů.</w:t>
+      </w:r>
+      <w:r>
+        <w:rPr>
+          <w:lang w:eastAsia="cs-CZ"/>
+        </w:rPr>
+        <w:t xml:space="preserve"> Největším důvodem je takzvané zahřívání AdaptiveCpp. AdaptiveCpp totiž některé věci kompiluje až za běhu </w:t>
+      </w:r>
+      <w:r>
+        <w:rPr>
+          <w:lang w:eastAsia="cs-CZ"/>
+        </w:rPr>
+        <w:t>programu,</w:t>
+      </w:r>
+      <w:r>
+        <w:rPr>
+          <w:lang w:eastAsia="cs-CZ"/>
+        </w:rPr>
+        <w:t xml:space="preserve"> a to způsobí veliké zpoždění první běh.</w:t>
+      </w:r>
+      <w:r>
+        <w:rPr>
+          <w:lang w:eastAsia="cs-CZ"/>
+        </w:rPr>
+        <w:t xml:space="preserve"> Rozdíl mezi prvním a druhým během může být </w:t>
+      </w:r>
+      <w:r>
+        <w:rPr>
+          <w:lang w:eastAsia="cs-CZ"/>
+        </w:rPr>
+        <w:t>50krát</w:t>
+      </w:r>
+      <w:r>
+        <w:rPr>
+          <w:lang w:eastAsia="cs-CZ"/>
+        </w:rPr>
+        <w:t xml:space="preserve"> pomalejší.</w:t>
+      </w:r>
+      <w:r>
+        <w:rPr>
+          <w:lang w:eastAsia="cs-CZ"/>
+        </w:rPr>
+        <w:t xml:space="preserve"> Naštěstí AdaptiveCpp umí vydat varovnou hlášku, pokud se takového kompilování dopouští a tím pádem je jasně poznat, že je třeba další běh.</w:t>
+      </w:r>
+      <w:r>
+        <w:rPr>
+          <w:lang w:eastAsia="cs-CZ"/>
+        </w:rPr>
+        <w:t xml:space="preserve"> Další, poněkud menší, důvod je z důvodu cache.</w:t>
+      </w:r>
+      <w:r>
+        <w:rPr>
+          <w:lang w:eastAsia="cs-CZ"/>
+        </w:rPr>
+        <w:t xml:space="preserve"> Během prvního běhu se do cache dají vhodná data a kód a druhý běh je díky tomu rychlejší. </w:t>
+      </w:r>
+      <w:r>
+        <w:rPr>
+          <w:lang w:eastAsia="cs-CZ"/>
+        </w:rPr>
+        <w:t>Takové zrychlení není ovšem příliš velké a ztrácí význam s přibývající náročností úkonu.</w:t>
+      </w:r>
+      <w:r>
+        <w:rPr>
+          <w:lang w:eastAsia="cs-CZ"/>
+        </w:rPr>
+        <w:t xml:space="preserve"> Většinou to je </w:t>
+      </w:r>
+      <w:r>
+        <w:rPr>
+          <w:lang w:eastAsia="cs-CZ"/>
+        </w:rPr>
+        <w:t xml:space="preserve">v rozsahu </w:t>
+      </w:r>
+      <w:r>
+        <w:rPr>
+          <w:lang w:eastAsia="cs-CZ"/>
+        </w:rPr>
+        <w:t>několik</w:t>
+      </w:r>
+      <w:r>
+        <w:rPr>
+          <w:lang w:eastAsia="cs-CZ"/>
+        </w:rPr>
+        <w:t>a</w:t>
+      </w:r>
+      <w:r>
+        <w:rPr>
+          <w:lang w:eastAsia="cs-CZ"/>
+        </w:rPr>
+        <w:t xml:space="preserve"> milisekund až několik</w:t>
+      </w:r>
+      <w:r>
+        <w:rPr>
+          <w:lang w:eastAsia="cs-CZ"/>
+        </w:rPr>
+        <w:t>a</w:t>
+      </w:r>
+      <w:r>
+        <w:rPr>
+          <w:lang w:eastAsia="cs-CZ"/>
+        </w:rPr>
+        <w:t xml:space="preserve"> desítek milisekund.</w:t>
+      </w:r>
+    </w:p>
+    <w:p>
+      <w:pPr>
+        <w:spacing w:line="360" w:lineRule="auto"/>
+        <w:jc w:val="both"/>
+        <w:rPr>
+          <w:lang w:eastAsia="cs-CZ"/>
+        </w:rPr>
+      </w:pPr>
+      <w:r>
+        <w:rPr>
+          <w:lang w:eastAsia="cs-CZ"/>
+        </w:rPr>
+        <w:t>Z </w:t>
+      </w:r>
+      <w:r>
+        <w:rPr>
+          <w:b/>
+          <w:bCs/>
+          <w:lang w:eastAsia="cs-CZ"/>
+        </w:rPr>
+        <w:t>tabulky 1</w:t>
+      </w:r>
+      <w:r>
+        <w:rPr>
+          <w:lang w:eastAsia="cs-CZ"/>
+        </w:rPr>
+        <w:t xml:space="preserve"> lze vidět, že paralelní tenzor je hlavně výhodný pro velké tenzory a při použití u malých velikostí způsobí naopak ztráty na výkonu.</w:t>
+      </w:r>
+      <w:r>
+        <w:rPr>
+          <w:lang w:eastAsia="cs-CZ"/>
+        </w:rPr>
+        <w:t xml:space="preserve"> </w:t>
+      </w:r>
+      <w:r>
+        <w:rPr>
+          <w:lang w:eastAsia="cs-CZ"/>
+        </w:rPr>
+        <w:t>Nejvíce postižená je konstrukce tenzoru.</w:t>
+      </w:r>
+      <w:r>
+        <w:rPr>
+          <w:lang w:eastAsia="cs-CZ"/>
+        </w:rPr>
+        <w:t xml:space="preserve"> Paralelní tenzor totiž musí dané souřadnice zkopírovat do sílené paměti a poté také musí </w:t>
+      </w:r>
+      <w:r>
+        <w:rPr>
+          <w:lang w:eastAsia="cs-CZ"/>
+        </w:rPr>
+        <w:t>alokovat</w:t>
+      </w:r>
+      <w:r>
+        <w:rPr>
+          <w:lang w:eastAsia="cs-CZ"/>
+        </w:rPr>
+        <w:t xml:space="preserve"> data na zařízení.</w:t>
+      </w:r>
+      <w:r>
+        <w:rPr>
+          <w:lang w:eastAsia="cs-CZ"/>
+        </w:rPr>
+        <w:t xml:space="preserve"> To je velmi drahé.</w:t>
+      </w:r>
+      <w:r>
+        <w:rPr>
+          <w:lang w:eastAsia="cs-CZ"/>
+        </w:rPr>
+        <w:t xml:space="preserve"> Lepší případ je transpozice. Při malé velikosti paralelní provedení sice ještě zaostává, ale pro veliké tenzory je to ohromné zlepšení.</w:t>
+      </w:r>
+      <w:r>
+        <w:rPr>
+          <w:lang w:eastAsia="cs-CZ"/>
+        </w:rPr>
+        <w:t xml:space="preserve"> V tomto případě až 20x rychlejší.</w:t>
+      </w:r>
+      <w:r>
+        <w:rPr>
+          <w:lang w:eastAsia="cs-CZ"/>
+        </w:rPr>
+        <w:t xml:space="preserve"> Změna velikosti následuje podobný trend, jenom v menších číslech</w:t>
+      </w:r>
+      <w:r>
+        <w:rPr>
+          <w:lang w:eastAsia="cs-CZ"/>
+        </w:rPr>
+        <w:t xml:space="preserve"> a je tam vidět, že se výhoda paralelizace ještě plně nerozvinula, pravděpodobně kvůli menší náročnosti samotné operace</w:t>
+      </w:r>
+      <w:r>
+        <w:rPr>
+          <w:lang w:eastAsia="cs-CZ"/>
+        </w:rPr>
+        <w:t>.</w:t>
+      </w:r>
+      <w:r>
+        <w:rPr>
+          <w:lang w:eastAsia="cs-CZ"/>
+        </w:rPr>
+        <w:t xml:space="preserve"> </w:t>
+      </w:r>
+      <w:r>
+        <w:rPr>
+          <w:lang w:eastAsia="cs-CZ"/>
+        </w:rPr>
+        <w:t>Sčítání je velice podobné transpozici.</w:t>
+      </w:r>
+      <w:r>
+        <w:rPr>
+          <w:lang w:eastAsia="cs-CZ"/>
+        </w:rPr>
+        <w:t xml:space="preserve"> </w:t>
+      </w:r>
+      <w:r>
+        <w:rPr>
+          <w:lang w:eastAsia="cs-CZ"/>
+        </w:rPr>
+        <w:t>Dá se postřehnout klesající doba vykonání u operace na místě, protože pro ni není třeba alokovat novou paměť.</w:t>
+      </w:r>
+      <w:r>
+        <w:rPr>
+          <w:lang w:eastAsia="cs-CZ"/>
+        </w:rPr>
+        <w:t xml:space="preserve"> Naopak pro neparalelní verze je klasické binární + s návratovou hodnotou přívětivější.</w:t>
+      </w:r>
+    </w:p>
+    <w:p>
+      <w:pPr>
+        <w:spacing w:line="360" w:lineRule="auto"/>
+        <w:jc w:val="both"/>
+        <w:rPr>
+          <w:lang w:eastAsia="cs-CZ"/>
+        </w:rPr>
+      </w:pPr>
+      <w:r>
+        <w:rPr>
+          <w:lang w:eastAsia="cs-CZ"/>
+        </w:rPr>
+        <w:t>Hardware,</w:t>
+      </w:r>
+      <w:r>
+        <w:rPr>
+          <w:lang w:eastAsia="cs-CZ"/>
+        </w:rPr>
+        <w:t xml:space="preserve"> na kterém bylo testování prováděno: </w:t>
+      </w:r>
+      <w:r>
+        <w:rPr>
+          <w:lang w:eastAsia="cs-CZ"/>
+        </w:rPr>
+        <w:t>Intel Core i5 13600KF</w:t>
+      </w:r>
+      <w:r>
+        <w:rPr>
+          <w:lang w:eastAsia="cs-CZ"/>
+        </w:rPr>
+        <w:t xml:space="preserve">, </w:t>
+      </w:r>
+      <w:r>
+        <w:rPr>
+          <w:lang w:eastAsia="cs-CZ"/>
+        </w:rPr>
+        <w:t>32 GB</w:t>
+      </w:r>
+      <w:r>
+        <w:rPr>
+          <w:lang w:eastAsia="cs-CZ"/>
+        </w:rPr>
+        <w:t xml:space="preserve"> DDR4 Operační paměti (3200MT/s), NVIDIA GeForce RTX 4070 Ti s</w:t>
+      </w:r>
+      <w:r>
+        <w:rPr>
+          <w:lang w:eastAsia="cs-CZ"/>
+        </w:rPr>
+        <w:t> </w:t>
+      </w:r>
+      <w:r>
+        <w:rPr>
+          <w:lang w:eastAsia="cs-CZ"/>
+        </w:rPr>
+        <w:t>12</w:t>
+      </w:r>
+      <w:r>
+        <w:rPr>
+          <w:lang w:eastAsia="cs-CZ"/>
+        </w:rPr>
+        <w:t xml:space="preserve"> </w:t>
+      </w:r>
+      <w:r>
+        <w:rPr>
+          <w:lang w:eastAsia="cs-CZ"/>
+        </w:rPr>
+        <w:t>GB VRAM</w:t>
+      </w:r>
+      <w:r>
+        <w:rPr>
+          <w:lang w:eastAsia="cs-CZ"/>
+        </w:rPr>
+        <w:t xml:space="preserve"> a Kingston SNV2S000G NVME SSD 2TB.</w:t>
+      </w:r>
+      <w:r>
+        <w:rPr>
+          <w:lang w:eastAsia="cs-CZ"/>
+        </w:rPr>
+        <w:t xml:space="preserve"> Testy byly prováděny z</w:t>
+      </w:r>
+      <w:r>
+        <w:rPr>
+          <w:lang w:eastAsia="cs-CZ"/>
+        </w:rPr>
+        <w:t> linuxového prostředí</w:t>
+      </w:r>
+      <w:r>
+        <w:rPr>
+          <w:lang w:eastAsia="cs-CZ"/>
+        </w:rPr>
+        <w:t> WSL běžícím na Windows 11.</w:t>
+      </w:r>
+    </w:p>
+    <w:p>
+      <w:pPr>
+        <w:spacing w:after="0" w:line="240" w:lineRule="auto"/>
+        <w:rPr>
+          <w:lang w:eastAsia="cs-CZ"/>
+        </w:rPr>
+      </w:pPr>
+      <w:r>
+        <w:rPr>
+          <w:lang w:eastAsia="cs-CZ"/>
+        </w:rPr>
+        <w:br w:type="page"/>
       </w:r>
     </w:p>
     <w:p>
@@ -13556,11 +13899,11 @@
           <w:color w:val="000000" w:themeColor="text1"/>
         </w:rPr>
       </w:pPr>
-      <w:bookmarkStart w:id="33" w:name="_Toc230006448"/>
       <w:r>
         <w:rPr>
           <w:color w:val="000000" w:themeColor="text1"/>
         </w:rPr>
+        <w:lastRenderedPageBreak/>
         <w:t xml:space="preserve">Tabulka </w:t>
       </w:r>
       <w:r>
@@ -13600,11 +13943,10 @@
         </w:rPr>
         <w:t>: Porovnání zátěžových testů</w:t>
       </w:r>
-      <w:bookmarkEnd w:id="33"/>
     </w:p>
     <w:tbl>
       <w:tblPr>
-        <w:tblpPr w:leftFromText="180" w:rightFromText="180" w:vertAnchor="text" w:horzAnchor="margin" w:tblpY="20"/>
+        <w:tblpPr w:leftFromText="180" w:rightFromText="180" w:vertAnchor="text" w:horzAnchor="margin" w:tblpY="88"/>
         <w:tblW w:w="0" w:type="auto"/>
         <w:tblBorders>
           <w:top w:val="single" w:sz="4" w:space="0" w:color="auto"/>
@@ -13617,14 +13959,14 @@
         <w:tblLook w:val="04A0" w:firstRow="1" w:lastRow="0" w:firstColumn="1" w:lastColumn="0" w:noHBand="0" w:noVBand="1"/>
       </w:tblPr>
       <w:tblGrid>
-        <w:gridCol w:w="4531"/>
-        <w:gridCol w:w="1701"/>
-        <w:gridCol w:w="2807"/>
+        <w:gridCol w:w="5240"/>
+        <w:gridCol w:w="1276"/>
+        <w:gridCol w:w="2523"/>
       </w:tblGrid>
       <w:tr>
         <w:tc>
           <w:tcPr>
-            <w:tcW w:w="4531" w:type="dxa"/>
+            <w:tcW w:w="5240" w:type="dxa"/>
           </w:tcPr>
           <w:p>
             <w:pPr>
@@ -13651,11 +13993,19 @@
               </w:rPr>
               <w:t xml:space="preserve"> </w:t>
             </w:r>
+            <w:r>
+              <w:rPr>
+                <w:b/>
+                <w:bCs/>
+                <w:szCs w:val="24"/>
+              </w:rPr>
+              <w:t>(velikost, opakování)</w:t>
+            </w:r>
           </w:p>
         </w:tc>
         <w:tc>
           <w:tcPr>
-            <w:tcW w:w="1701" w:type="dxa"/>
+            <w:tcW w:w="1276" w:type="dxa"/>
           </w:tcPr>
           <w:p>
             <w:pPr>
@@ -13668,13 +14018,13 @@
               <w:rPr>
                 <w:szCs w:val="24"/>
               </w:rPr>
-              <w:t>Rychlost [ms]</w:t>
+              <w:t>Doba [ms]</w:t>
             </w:r>
           </w:p>
         </w:tc>
         <w:tc>
           <w:tcPr>
-            <w:tcW w:w="2807" w:type="dxa"/>
+            <w:tcW w:w="2523" w:type="dxa"/>
           </w:tcPr>
           <w:p>
             <w:pPr>
@@ -13687,7 +14037,7 @@
               <w:rPr>
                 <w:szCs w:val="24"/>
               </w:rPr>
-              <w:t>Rychlost paralelizace [ms]</w:t>
+              <w:t>Doba paralelizace [ms]</w:t>
             </w:r>
           </w:p>
         </w:tc>
@@ -13695,7 +14045,7 @@
       <w:tr>
         <w:tc>
           <w:tcPr>
-            <w:tcW w:w="4531" w:type="dxa"/>
+            <w:tcW w:w="5240" w:type="dxa"/>
           </w:tcPr>
           <w:p>
             <w:pPr>
@@ -13708,7 +14058,13 @@
               <w:rPr>
                 <w:szCs w:val="24"/>
               </w:rPr>
-              <w:t>Test konstrukce</w:t>
+              <w:t xml:space="preserve">Konstrukce (vel: 4 096, opak: </w:t>
+            </w:r>
+            <w:r>
+              <w:rPr>
+                <w:szCs w:val="24"/>
+              </w:rPr>
+              <w:t>4</w:t>
             </w:r>
             <w:r>
               <w:rPr>
@@ -13716,11 +14072,23 @@
               </w:rPr>
               <w:t xml:space="preserve"> </w:t>
             </w:r>
+            <w:r>
+              <w:rPr>
+                <w:szCs w:val="24"/>
+              </w:rPr>
+              <w:t>096</w:t>
+            </w:r>
+            <w:r>
+              <w:rPr>
+                <w:szCs w:val="24"/>
+              </w:rPr>
+              <w:t>)</w:t>
+            </w:r>
           </w:p>
         </w:tc>
         <w:tc>
           <w:tcPr>
-            <w:tcW w:w="1701" w:type="dxa"/>
+            <w:tcW w:w="1276" w:type="dxa"/>
           </w:tcPr>
           <w:p>
             <w:pPr>
@@ -13733,13 +14101,13 @@
               <w:rPr>
                 <w:szCs w:val="24"/>
               </w:rPr>
-              <w:t>375</w:t>
+              <w:t>&lt; 1</w:t>
             </w:r>
           </w:p>
         </w:tc>
         <w:tc>
           <w:tcPr>
-            <w:tcW w:w="2807" w:type="dxa"/>
+            <w:tcW w:w="2523" w:type="dxa"/>
           </w:tcPr>
           <w:p>
             <w:pPr>
@@ -13752,13 +14120,7 @@
               <w:rPr>
                 <w:szCs w:val="24"/>
               </w:rPr>
-              <w:t xml:space="preserve">&lt; </w:t>
-            </w:r>
-            <w:r>
-              <w:rPr>
-                <w:szCs w:val="24"/>
-              </w:rPr>
-              <w:t>1</w:t>
+              <w:t>671</w:t>
             </w:r>
           </w:p>
         </w:tc>
@@ -13766,7 +14128,7 @@
       <w:tr>
         <w:tc>
           <w:tcPr>
-            <w:tcW w:w="4531" w:type="dxa"/>
+            <w:tcW w:w="5240" w:type="dxa"/>
           </w:tcPr>
           <w:p>
             <w:pPr>
@@ -13779,13 +14141,61 @@
               <w:rPr>
                 <w:szCs w:val="24"/>
               </w:rPr>
-              <w:t>základní (vč. neukončeného)</w:t>
+              <w:t xml:space="preserve">Konstrukce (vel: </w:t>
+            </w:r>
+            <w:r>
+              <w:rPr>
+                <w:szCs w:val="24"/>
+              </w:rPr>
+              <w:t>4</w:t>
+            </w:r>
+            <w:r>
+              <w:rPr>
+                <w:szCs w:val="24"/>
+              </w:rPr>
+              <w:t xml:space="preserve"> </w:t>
+            </w:r>
+            <w:r>
+              <w:rPr>
+                <w:szCs w:val="24"/>
+              </w:rPr>
+              <w:t>294</w:t>
+            </w:r>
+            <w:r>
+              <w:rPr>
+                <w:szCs w:val="24"/>
+              </w:rPr>
+              <w:t xml:space="preserve"> </w:t>
+            </w:r>
+            <w:r>
+              <w:rPr>
+                <w:szCs w:val="24"/>
+              </w:rPr>
+              <w:t>967</w:t>
+            </w:r>
+            <w:r>
+              <w:rPr>
+                <w:szCs w:val="24"/>
+              </w:rPr>
+              <w:t xml:space="preserve"> </w:t>
+            </w:r>
+            <w:r>
+              <w:rPr>
+                <w:szCs w:val="24"/>
+              </w:rPr>
+              <w:t>296</w:t>
+            </w:r>
+            <w:r>
+              <w:rPr>
+                <w:szCs w:val="24"/>
+              </w:rPr>
+              <w:t>, opak: 16)</w:t>
             </w:r>
           </w:p>
         </w:tc>
         <w:tc>
           <w:tcPr>
-            <w:tcW w:w="1701" w:type="dxa"/>
+            <w:tcW w:w="1276" w:type="dxa"/>
           </w:tcPr>
           <w:p>
             <w:pPr>
@@ -13798,13 +14208,13 @@
               <w:rPr>
                 <w:szCs w:val="24"/>
               </w:rPr>
-              <w:t>18,6</w:t>
+              <w:t>&lt; 1</w:t>
             </w:r>
           </w:p>
         </w:tc>
         <w:tc>
           <w:tcPr>
-            <w:tcW w:w="2807" w:type="dxa"/>
+            <w:tcW w:w="2523" w:type="dxa"/>
           </w:tcPr>
           <w:p>
             <w:pPr>
@@ -13818,7 +14228,847 @@
               <w:rPr>
                 <w:szCs w:val="24"/>
               </w:rPr>
-              <w:t>13,3</w:t>
+              <w:t>863</w:t>
+            </w:r>
+          </w:p>
+        </w:tc>
+      </w:tr>
+      <w:tr>
+        <w:tc>
+          <w:tcPr>
+            <w:tcW w:w="5240" w:type="dxa"/>
+          </w:tcPr>
+          <w:p>
+            <w:pPr>
+              <w:spacing w:after="0" w:line="360" w:lineRule="auto"/>
+              <w:rPr>
+                <w:szCs w:val="24"/>
+              </w:rPr>
+            </w:pPr>
+            <w:r>
+              <w:rPr>
+                <w:szCs w:val="24"/>
+              </w:rPr>
+              <w:t>Transpozice (vel: 4 096, opak: 256)</w:t>
+            </w:r>
+          </w:p>
+        </w:tc>
+        <w:tc>
+          <w:tcPr>
+            <w:tcW w:w="1276" w:type="dxa"/>
+          </w:tcPr>
+          <w:p>
+            <w:pPr>
+              <w:spacing w:after="0" w:line="360" w:lineRule="auto"/>
+              <w:rPr>
+                <w:szCs w:val="24"/>
+              </w:rPr>
+            </w:pPr>
+            <w:r>
+              <w:rPr>
+                <w:szCs w:val="24"/>
+              </w:rPr>
+              <w:t>13</w:t>
+            </w:r>
+          </w:p>
+        </w:tc>
+        <w:tc>
+          <w:tcPr>
+            <w:tcW w:w="2523" w:type="dxa"/>
+          </w:tcPr>
+          <w:p>
+            <w:pPr>
+              <w:keepNext/>
+              <w:spacing w:after="0" w:line="360" w:lineRule="auto"/>
+              <w:rPr>
+                <w:szCs w:val="24"/>
+              </w:rPr>
+            </w:pPr>
+            <w:r>
+              <w:rPr>
+                <w:szCs w:val="24"/>
+              </w:rPr>
+              <w:t>24</w:t>
+            </w:r>
+          </w:p>
+        </w:tc>
+      </w:tr>
+      <w:tr>
+        <w:tc>
+          <w:tcPr>
+            <w:tcW w:w="5240" w:type="dxa"/>
+          </w:tcPr>
+          <w:p>
+            <w:pPr>
+              <w:spacing w:after="0" w:line="360" w:lineRule="auto"/>
+              <w:rPr>
+                <w:szCs w:val="24"/>
+              </w:rPr>
+            </w:pPr>
+            <w:r>
+              <w:rPr>
+                <w:szCs w:val="24"/>
+              </w:rPr>
+              <w:t xml:space="preserve">Transpozice (vel: </w:t>
+            </w:r>
+            <w:r>
+              <w:rPr>
+                <w:szCs w:val="24"/>
+              </w:rPr>
+              <w:t>268</w:t>
+            </w:r>
+            <w:r>
+              <w:rPr>
+                <w:szCs w:val="24"/>
+              </w:rPr>
+              <w:t xml:space="preserve"> </w:t>
+            </w:r>
+            <w:r>
+              <w:rPr>
+                <w:szCs w:val="24"/>
+              </w:rPr>
+              <w:t>435</w:t>
+            </w:r>
+            <w:r>
+              <w:rPr>
+                <w:szCs w:val="24"/>
+              </w:rPr>
+              <w:t xml:space="preserve"> </w:t>
+            </w:r>
+            <w:r>
+              <w:rPr>
+                <w:szCs w:val="24"/>
+              </w:rPr>
+              <w:t>456</w:t>
+            </w:r>
+            <w:r>
+              <w:rPr>
+                <w:szCs w:val="24"/>
+              </w:rPr>
+              <w:t>, opak: 1)</w:t>
+            </w:r>
+          </w:p>
+        </w:tc>
+        <w:tc>
+          <w:tcPr>
+            <w:tcW w:w="1276" w:type="dxa"/>
+          </w:tcPr>
+          <w:p>
+            <w:pPr>
+              <w:spacing w:after="0" w:line="360" w:lineRule="auto"/>
+              <w:rPr>
+                <w:szCs w:val="24"/>
+              </w:rPr>
+            </w:pPr>
+            <w:r>
+              <w:rPr>
+                <w:szCs w:val="24"/>
+              </w:rPr>
+              <w:t>3</w:t>
+            </w:r>
+            <w:r>
+              <w:rPr>
+                <w:szCs w:val="24"/>
+              </w:rPr>
+              <w:t xml:space="preserve"> </w:t>
+            </w:r>
+            <w:r>
+              <w:rPr>
+                <w:szCs w:val="24"/>
+              </w:rPr>
+              <w:t>926</w:t>
+            </w:r>
+          </w:p>
+        </w:tc>
+        <w:tc>
+          <w:tcPr>
+            <w:tcW w:w="2523" w:type="dxa"/>
+          </w:tcPr>
+          <w:p>
+            <w:pPr>
+              <w:keepNext/>
+              <w:spacing w:after="0" w:line="360" w:lineRule="auto"/>
+              <w:rPr>
+                <w:szCs w:val="24"/>
+              </w:rPr>
+            </w:pPr>
+            <w:r>
+              <w:rPr>
+                <w:szCs w:val="24"/>
+              </w:rPr>
+              <w:t>198</w:t>
+            </w:r>
+          </w:p>
+        </w:tc>
+      </w:tr>
+      <w:tr>
+        <w:tc>
+          <w:tcPr>
+            <w:tcW w:w="5240" w:type="dxa"/>
+          </w:tcPr>
+          <w:p>
+            <w:pPr>
+              <w:spacing w:after="0" w:line="360" w:lineRule="auto"/>
+              <w:rPr>
+                <w:szCs w:val="24"/>
+              </w:rPr>
+            </w:pPr>
+            <w:r>
+              <w:rPr>
+                <w:szCs w:val="24"/>
+              </w:rPr>
+              <w:t>Změna velikosti (vel: 4 096, opak: 256)</w:t>
+            </w:r>
+          </w:p>
+        </w:tc>
+        <w:tc>
+          <w:tcPr>
+            <w:tcW w:w="1276" w:type="dxa"/>
+          </w:tcPr>
+          <w:p>
+            <w:pPr>
+              <w:spacing w:after="0" w:line="360" w:lineRule="auto"/>
+              <w:rPr>
+                <w:szCs w:val="24"/>
+              </w:rPr>
+            </w:pPr>
+            <w:r>
+              <w:rPr>
+                <w:szCs w:val="24"/>
+              </w:rPr>
+              <w:t>4</w:t>
+            </w:r>
+          </w:p>
+        </w:tc>
+        <w:tc>
+          <w:tcPr>
+            <w:tcW w:w="2523" w:type="dxa"/>
+          </w:tcPr>
+          <w:p>
+            <w:pPr>
+              <w:keepNext/>
+              <w:spacing w:after="0" w:line="360" w:lineRule="auto"/>
+              <w:rPr>
+                <w:szCs w:val="24"/>
+              </w:rPr>
+            </w:pPr>
+            <w:r>
+              <w:rPr>
+                <w:szCs w:val="24"/>
+              </w:rPr>
+              <w:t>37</w:t>
+            </w:r>
+          </w:p>
+        </w:tc>
+      </w:tr>
+      <w:tr>
+        <w:tc>
+          <w:tcPr>
+            <w:tcW w:w="5240" w:type="dxa"/>
+          </w:tcPr>
+          <w:p>
+            <w:pPr>
+              <w:spacing w:after="0" w:line="360" w:lineRule="auto"/>
+              <w:rPr>
+                <w:szCs w:val="24"/>
+              </w:rPr>
+            </w:pPr>
+            <w:r>
+              <w:rPr>
+                <w:szCs w:val="24"/>
+              </w:rPr>
+              <w:t xml:space="preserve">Změna velikosti (vel: </w:t>
+            </w:r>
+            <w:r>
+              <w:rPr>
+                <w:szCs w:val="24"/>
+              </w:rPr>
+              <w:t>268</w:t>
+            </w:r>
+            <w:r>
+              <w:rPr>
+                <w:szCs w:val="24"/>
+              </w:rPr>
+              <w:t xml:space="preserve"> </w:t>
+            </w:r>
+            <w:r>
+              <w:rPr>
+                <w:szCs w:val="24"/>
+              </w:rPr>
+              <w:t>435</w:t>
+            </w:r>
+            <w:r>
+              <w:rPr>
+                <w:szCs w:val="24"/>
+              </w:rPr>
+              <w:t xml:space="preserve"> </w:t>
+            </w:r>
+            <w:r>
+              <w:rPr>
+                <w:szCs w:val="24"/>
+              </w:rPr>
+              <w:t>456</w:t>
+            </w:r>
+            <w:r>
+              <w:rPr>
+                <w:szCs w:val="24"/>
+              </w:rPr>
+              <w:t>, opak: 1)</w:t>
+            </w:r>
+          </w:p>
+        </w:tc>
+        <w:tc>
+          <w:tcPr>
+            <w:tcW w:w="1276" w:type="dxa"/>
+          </w:tcPr>
+          <w:p>
+            <w:pPr>
+              <w:spacing w:after="0" w:line="360" w:lineRule="auto"/>
+              <w:rPr>
+                <w:szCs w:val="24"/>
+              </w:rPr>
+            </w:pPr>
+            <w:r>
+              <w:rPr>
+                <w:szCs w:val="24"/>
+              </w:rPr>
+              <w:t>240</w:t>
+            </w:r>
+          </w:p>
+        </w:tc>
+        <w:tc>
+          <w:tcPr>
+            <w:tcW w:w="2523" w:type="dxa"/>
+          </w:tcPr>
+          <w:p>
+            <w:pPr>
+              <w:keepNext/>
+              <w:spacing w:after="0" w:line="360" w:lineRule="auto"/>
+              <w:rPr>
+                <w:szCs w:val="24"/>
+              </w:rPr>
+            </w:pPr>
+            <w:r>
+              <w:rPr>
+                <w:szCs w:val="24"/>
+              </w:rPr>
+              <w:t>158</w:t>
+            </w:r>
+          </w:p>
+        </w:tc>
+      </w:tr>
+      <w:tr>
+        <w:tc>
+          <w:tcPr>
+            <w:tcW w:w="5240" w:type="dxa"/>
+          </w:tcPr>
+          <w:p>
+            <w:pPr>
+              <w:spacing w:after="0" w:line="360" w:lineRule="auto"/>
+              <w:rPr>
+                <w:szCs w:val="24"/>
+              </w:rPr>
+            </w:pPr>
+            <w:r>
+              <w:rPr>
+                <w:szCs w:val="24"/>
+              </w:rPr>
+              <w:t>Sčítání + &lt;int&gt; (vel: 4 096, opak: 4 096)</w:t>
+            </w:r>
+          </w:p>
+        </w:tc>
+        <w:tc>
+          <w:tcPr>
+            <w:tcW w:w="1276" w:type="dxa"/>
+          </w:tcPr>
+          <w:p>
+            <w:pPr>
+              <w:spacing w:after="0" w:line="360" w:lineRule="auto"/>
+              <w:rPr>
+                <w:szCs w:val="24"/>
+              </w:rPr>
+            </w:pPr>
+            <w:r>
+              <w:rPr>
+                <w:szCs w:val="24"/>
+              </w:rPr>
+              <w:t>1</w:t>
+            </w:r>
+          </w:p>
+        </w:tc>
+        <w:tc>
+          <w:tcPr>
+            <w:tcW w:w="2523" w:type="dxa"/>
+          </w:tcPr>
+          <w:p>
+            <w:pPr>
+              <w:keepNext/>
+              <w:spacing w:after="0" w:line="360" w:lineRule="auto"/>
+              <w:rPr>
+                <w:szCs w:val="24"/>
+              </w:rPr>
+            </w:pPr>
+            <w:r>
+              <w:rPr>
+                <w:szCs w:val="24"/>
+              </w:rPr>
+              <w:t>423</w:t>
+            </w:r>
+          </w:p>
+        </w:tc>
+      </w:tr>
+      <w:tr>
+        <w:tc>
+          <w:tcPr>
+            <w:tcW w:w="5240" w:type="dxa"/>
+          </w:tcPr>
+          <w:p>
+            <w:pPr>
+              <w:spacing w:after="0" w:line="360" w:lineRule="auto"/>
+              <w:rPr>
+                <w:szCs w:val="24"/>
+              </w:rPr>
+            </w:pPr>
+            <w:r>
+              <w:rPr>
+                <w:szCs w:val="24"/>
+              </w:rPr>
+              <w:t xml:space="preserve">Sčítání + &lt;int&gt; (vel: </w:t>
+            </w:r>
+            <w:r>
+              <w:rPr>
+                <w:szCs w:val="24"/>
+              </w:rPr>
+              <w:t>1</w:t>
+            </w:r>
+            <w:r>
+              <w:rPr>
+                <w:szCs w:val="24"/>
+              </w:rPr>
+              <w:t xml:space="preserve"> </w:t>
+            </w:r>
+            <w:r>
+              <w:rPr>
+                <w:szCs w:val="24"/>
+              </w:rPr>
+              <w:t>073</w:t>
+            </w:r>
+            <w:r>
+              <w:rPr>
+                <w:szCs w:val="24"/>
+              </w:rPr>
+              <w:t xml:space="preserve"> </w:t>
+            </w:r>
+            <w:r>
+              <w:rPr>
+                <w:szCs w:val="24"/>
+              </w:rPr>
+              <w:t>741</w:t>
+            </w:r>
+            <w:r>
+              <w:rPr>
+                <w:szCs w:val="24"/>
+              </w:rPr>
+              <w:t> </w:t>
+            </w:r>
+            <w:r>
+              <w:rPr>
+                <w:szCs w:val="24"/>
+              </w:rPr>
+              <w:t>824</w:t>
+            </w:r>
+            <w:r>
+              <w:rPr>
+                <w:szCs w:val="24"/>
+              </w:rPr>
+              <w:t>, opak: 1)</w:t>
+            </w:r>
+          </w:p>
+        </w:tc>
+        <w:tc>
+          <w:tcPr>
+            <w:tcW w:w="1276" w:type="dxa"/>
+          </w:tcPr>
+          <w:p>
+            <w:pPr>
+              <w:spacing w:after="0" w:line="360" w:lineRule="auto"/>
+              <w:rPr>
+                <w:szCs w:val="24"/>
+              </w:rPr>
+            </w:pPr>
+            <w:r>
+              <w:rPr>
+                <w:szCs w:val="24"/>
+              </w:rPr>
+              <w:t>2 051</w:t>
+            </w:r>
+          </w:p>
+        </w:tc>
+        <w:tc>
+          <w:tcPr>
+            <w:tcW w:w="2523" w:type="dxa"/>
+          </w:tcPr>
+          <w:p>
+            <w:pPr>
+              <w:keepNext/>
+              <w:spacing w:after="0" w:line="360" w:lineRule="auto"/>
+              <w:rPr>
+                <w:szCs w:val="24"/>
+              </w:rPr>
+            </w:pPr>
+            <w:r>
+              <w:rPr>
+                <w:szCs w:val="24"/>
+              </w:rPr>
+              <w:t>511</w:t>
+            </w:r>
+          </w:p>
+        </w:tc>
+      </w:tr>
+      <w:tr>
+        <w:tc>
+          <w:tcPr>
+            <w:tcW w:w="5240" w:type="dxa"/>
+          </w:tcPr>
+          <w:p>
+            <w:pPr>
+              <w:spacing w:after="0" w:line="360" w:lineRule="auto"/>
+              <w:rPr>
+                <w:szCs w:val="24"/>
+              </w:rPr>
+            </w:pPr>
+            <w:r>
+              <w:rPr>
+                <w:szCs w:val="24"/>
+              </w:rPr>
+              <w:t>Sčítání =+ &lt;int&gt; (vel: 4 096, opak: 4 096)</w:t>
+            </w:r>
+          </w:p>
+        </w:tc>
+        <w:tc>
+          <w:tcPr>
+            <w:tcW w:w="1276" w:type="dxa"/>
+          </w:tcPr>
+          <w:p>
+            <w:pPr>
+              <w:spacing w:after="0" w:line="360" w:lineRule="auto"/>
+              <w:rPr>
+                <w:szCs w:val="24"/>
+              </w:rPr>
+            </w:pPr>
+            <w:r>
+              <w:rPr>
+                <w:szCs w:val="24"/>
+              </w:rPr>
+              <w:t>&lt; 1</w:t>
+            </w:r>
+          </w:p>
+        </w:tc>
+        <w:tc>
+          <w:tcPr>
+            <w:tcW w:w="2523" w:type="dxa"/>
+          </w:tcPr>
+          <w:p>
+            <w:pPr>
+              <w:keepNext/>
+              <w:spacing w:after="0" w:line="360" w:lineRule="auto"/>
+              <w:rPr>
+                <w:szCs w:val="24"/>
+              </w:rPr>
+            </w:pPr>
+            <w:r>
+              <w:rPr>
+                <w:szCs w:val="24"/>
+              </w:rPr>
+              <w:t>214</w:t>
+            </w:r>
+          </w:p>
+        </w:tc>
+      </w:tr>
+      <w:tr>
+        <w:tc>
+          <w:tcPr>
+            <w:tcW w:w="5240" w:type="dxa"/>
+          </w:tcPr>
+          <w:p>
+            <w:pPr>
+              <w:spacing w:after="0" w:line="360" w:lineRule="auto"/>
+              <w:rPr>
+                <w:szCs w:val="24"/>
+              </w:rPr>
+            </w:pPr>
+            <w:r>
+              <w:rPr>
+                <w:szCs w:val="24"/>
+              </w:rPr>
+              <w:t xml:space="preserve">Sčítání =+ &lt;int&gt; (vel: </w:t>
+            </w:r>
+            <w:r>
+              <w:rPr>
+                <w:szCs w:val="24"/>
+              </w:rPr>
+              <w:t>1</w:t>
+            </w:r>
+            <w:r>
+              <w:rPr>
+                <w:szCs w:val="24"/>
+              </w:rPr>
+              <w:t xml:space="preserve"> </w:t>
+            </w:r>
+            <w:r>
+              <w:rPr>
+                <w:szCs w:val="24"/>
+              </w:rPr>
+              <w:t>073</w:t>
+            </w:r>
+            <w:r>
+              <w:rPr>
+                <w:szCs w:val="24"/>
+              </w:rPr>
+              <w:t xml:space="preserve"> </w:t>
+            </w:r>
+            <w:r>
+              <w:rPr>
+                <w:szCs w:val="24"/>
+              </w:rPr>
+              <w:t>741</w:t>
+            </w:r>
+            <w:r>
+              <w:rPr>
+                <w:szCs w:val="24"/>
+              </w:rPr>
+              <w:t> </w:t>
+            </w:r>
+            <w:r>
+              <w:rPr>
+                <w:szCs w:val="24"/>
+              </w:rPr>
+              <w:t>824</w:t>
+            </w:r>
+            <w:r>
+              <w:rPr>
+                <w:szCs w:val="24"/>
+              </w:rPr>
+              <w:t>, opak: 1)</w:t>
+            </w:r>
+          </w:p>
+        </w:tc>
+        <w:tc>
+          <w:tcPr>
+            <w:tcW w:w="1276" w:type="dxa"/>
+          </w:tcPr>
+          <w:p>
+            <w:pPr>
+              <w:spacing w:after="0" w:line="360" w:lineRule="auto"/>
+              <w:rPr>
+                <w:szCs w:val="24"/>
+              </w:rPr>
+            </w:pPr>
+            <w:r>
+              <w:rPr>
+                <w:szCs w:val="24"/>
+              </w:rPr>
+              <w:t>3</w:t>
+            </w:r>
+            <w:r>
+              <w:rPr>
+                <w:szCs w:val="24"/>
+              </w:rPr>
+              <w:t xml:space="preserve"> </w:t>
+            </w:r>
+            <w:r>
+              <w:rPr>
+                <w:szCs w:val="24"/>
+              </w:rPr>
+              <w:t>765</w:t>
+            </w:r>
+          </w:p>
+        </w:tc>
+        <w:tc>
+          <w:tcPr>
+            <w:tcW w:w="2523" w:type="dxa"/>
+          </w:tcPr>
+          <w:p>
+            <w:pPr>
+              <w:keepNext/>
+              <w:spacing w:after="0" w:line="360" w:lineRule="auto"/>
+              <w:rPr>
+                <w:szCs w:val="24"/>
+              </w:rPr>
+            </w:pPr>
+            <w:r>
+              <w:rPr>
+                <w:szCs w:val="24"/>
+              </w:rPr>
+              <w:t>188</w:t>
+            </w:r>
+          </w:p>
+        </w:tc>
+      </w:tr>
+      <w:tr>
+        <w:tc>
+          <w:tcPr>
+            <w:tcW w:w="5240" w:type="dxa"/>
+          </w:tcPr>
+          <w:p>
+            <w:pPr>
+              <w:spacing w:after="0" w:line="360" w:lineRule="auto"/>
+              <w:rPr>
+                <w:szCs w:val="24"/>
+              </w:rPr>
+            </w:pPr>
+            <w:r>
+              <w:rPr>
+                <w:szCs w:val="24"/>
+              </w:rPr>
+              <w:t>Dělení / &lt;double&gt; (vel: 4 096, opak: 256)</w:t>
+            </w:r>
+          </w:p>
+        </w:tc>
+        <w:tc>
+          <w:tcPr>
+            <w:tcW w:w="1276" w:type="dxa"/>
+          </w:tcPr>
+          <w:p>
+            <w:pPr>
+              <w:spacing w:after="0" w:line="360" w:lineRule="auto"/>
+              <w:rPr>
+                <w:szCs w:val="24"/>
+              </w:rPr>
+            </w:pPr>
+            <w:r>
+              <w:rPr>
+                <w:szCs w:val="24"/>
+              </w:rPr>
+              <w:t>29</w:t>
+            </w:r>
+          </w:p>
+        </w:tc>
+        <w:tc>
+          <w:tcPr>
+            <w:tcW w:w="2523" w:type="dxa"/>
+          </w:tcPr>
+          <w:p>
+            <w:pPr>
+              <w:keepNext/>
+              <w:spacing w:after="0" w:line="360" w:lineRule="auto"/>
+              <w:rPr>
+                <w:szCs w:val="24"/>
+              </w:rPr>
+            </w:pPr>
+            <w:r>
+              <w:rPr>
+                <w:szCs w:val="24"/>
+              </w:rPr>
+              <w:t>55</w:t>
+            </w:r>
+          </w:p>
+        </w:tc>
+      </w:tr>
+      <w:tr>
+        <w:tc>
+          <w:tcPr>
+            <w:tcW w:w="5240" w:type="dxa"/>
+          </w:tcPr>
+          <w:p>
+            <w:pPr>
+              <w:spacing w:after="0" w:line="360" w:lineRule="auto"/>
+              <w:rPr>
+                <w:szCs w:val="24"/>
+              </w:rPr>
+            </w:pPr>
+            <w:r>
+              <w:rPr>
+                <w:szCs w:val="24"/>
+              </w:rPr>
+              <w:t xml:space="preserve">Dělení / &lt;double&gt; (vel: </w:t>
+            </w:r>
+            <w:r>
+              <w:rPr>
+                <w:szCs w:val="24"/>
+              </w:rPr>
+              <w:t>536</w:t>
+            </w:r>
+            <w:r>
+              <w:rPr>
+                <w:szCs w:val="24"/>
+              </w:rPr>
+              <w:t xml:space="preserve"> </w:t>
+            </w:r>
+            <w:r>
+              <w:rPr>
+                <w:szCs w:val="24"/>
+              </w:rPr>
+              <w:t>870</w:t>
+            </w:r>
+            <w:r>
+              <w:rPr>
+                <w:szCs w:val="24"/>
+              </w:rPr>
+              <w:t> </w:t>
+            </w:r>
+            <w:r>
+              <w:rPr>
+                <w:szCs w:val="24"/>
+              </w:rPr>
+              <w:t>912</w:t>
+            </w:r>
+            <w:r>
+              <w:rPr>
+                <w:szCs w:val="24"/>
+              </w:rPr>
+              <w:t>, opak: 1)</w:t>
+            </w:r>
+          </w:p>
+        </w:tc>
+        <w:tc>
+          <w:tcPr>
+            <w:tcW w:w="1276" w:type="dxa"/>
+          </w:tcPr>
+          <w:p>
+            <w:pPr>
+              <w:spacing w:after="0" w:line="360" w:lineRule="auto"/>
+              <w:rPr>
+                <w:szCs w:val="24"/>
+              </w:rPr>
+            </w:pPr>
+            <w:r>
+              <w:rPr>
+                <w:szCs w:val="24"/>
+              </w:rPr>
+              <w:t>1</w:t>
+            </w:r>
+            <w:r>
+              <w:rPr>
+                <w:szCs w:val="24"/>
+              </w:rPr>
+              <w:t xml:space="preserve"> </w:t>
+            </w:r>
+            <w:r>
+              <w:rPr>
+                <w:szCs w:val="24"/>
+              </w:rPr>
+              <w:t>936</w:t>
+            </w:r>
+          </w:p>
+        </w:tc>
+        <w:tc>
+          <w:tcPr>
+            <w:tcW w:w="2523" w:type="dxa"/>
+          </w:tcPr>
+          <w:p>
+            <w:pPr>
+              <w:keepNext/>
+              <w:spacing w:after="0" w:line="360" w:lineRule="auto"/>
+              <w:rPr>
+                <w:szCs w:val="24"/>
+              </w:rPr>
+            </w:pPr>
+            <w:r>
+              <w:rPr>
+                <w:szCs w:val="24"/>
+              </w:rPr>
+              <w:t>180</w:t>
             </w:r>
           </w:p>
         </w:tc>
@@ -13833,12 +15083,32 @@
           <w:lang w:eastAsia="cs-CZ"/>
         </w:rPr>
       </w:pPr>
-      <w:r>
+    </w:p>
+    <w:p>
+      <w:pPr>
+        <w:spacing w:after="0" w:line="240" w:lineRule="auto"/>
         <w:rPr>
           <w:noProof/>
           <w:szCs w:val="24"/>
           <w:lang w:eastAsia="cs-CZ"/>
         </w:rPr>
+      </w:pPr>
+    </w:p>
+    <w:p>
+      <w:pPr>
+        <w:spacing w:after="0" w:line="240" w:lineRule="auto"/>
+        <w:rPr>
+          <w:noProof/>
+          <w:szCs w:val="24"/>
+          <w:lang w:eastAsia="cs-CZ"/>
+        </w:rPr>
+      </w:pPr>
+      <w:r>
+        <w:rPr>
+          <w:noProof/>
+          <w:szCs w:val="24"/>
+          <w:lang w:eastAsia="cs-CZ"/>
+        </w:rPr>
         <w:br w:type="page"/>
       </w:r>
     </w:p>
@@ -13846,12 +15116,12 @@
       <w:pPr>
         <w:pStyle w:val="Nadpis1"/>
       </w:pPr>
-      <w:bookmarkStart w:id="34" w:name="_Toc230096703"/>
+      <w:bookmarkStart w:id="33" w:name="_Toc230096703"/>
       <w:r>
         <w:lastRenderedPageBreak/>
         <w:t>3 TEORETICKÉ VYUŽITÍ</w:t>
       </w:r>
-      <w:bookmarkEnd w:id="34"/>
+      <w:bookmarkEnd w:id="33"/>
     </w:p>
     <w:p>
       <w:pPr>
@@ -15408,12 +16678,12 @@
         </w:rPr>
         <w:br w:type="page"/>
       </w:r>
-      <w:bookmarkStart w:id="35" w:name="_Toc230096704"/>
+      <w:bookmarkStart w:id="34" w:name="_Toc230096704"/>
       <w:r>
         <w:lastRenderedPageBreak/>
         <w:t>ZÁVĚR</w:t>
       </w:r>
-      <w:bookmarkEnd w:id="35"/>
+      <w:bookmarkEnd w:id="34"/>
     </w:p>
     <w:p>
       <w:pPr>
@@ -15530,12 +16800,12 @@
       <w:r>
         <w:br w:type="page"/>
       </w:r>
-      <w:bookmarkStart w:id="36" w:name="_Toc230096705"/>
+      <w:bookmarkStart w:id="35" w:name="_Toc230096705"/>
       <w:r>
         <w:lastRenderedPageBreak/>
         <w:t>POUŽITÁ LITERATURA</w:t>
       </w:r>
-      <w:bookmarkEnd w:id="36"/>
+      <w:bookmarkEnd w:id="35"/>
     </w:p>
     <w:p>
       <w:pPr>
@@ -15915,12 +17185,12 @@
       <w:r>
         <w:br w:type="page"/>
       </w:r>
-      <w:bookmarkStart w:id="37" w:name="_Toc230096706"/>
+      <w:bookmarkStart w:id="36" w:name="_Toc230096706"/>
       <w:r>
         <w:lastRenderedPageBreak/>
         <w:t>SEZNAM PŘÍLOH</w:t>
       </w:r>
-      <w:bookmarkEnd w:id="37"/>
+      <w:bookmarkEnd w:id="36"/>
     </w:p>
     <w:p>
       <w:pPr>

</xml_diff>